<commit_message>
feat(reports): complete weekly charts and clarify matched data costs
</commit_message>
<xml_diff>
--- a/tuan_1/docs/Bao_cao_tuan_1_Dien_toan_dam_may_24110054_24110051.docx
+++ b/tuan_1/docs/Bao_cao_tuan_1_Dien_toan_dam_may_24110054_24110051.docx
@@ -411,7 +411,7 @@
         <w:ind w:firstLine="504"/>
       </w:pPr>
       <w:r>
-        <w:t>Trong Tuần 1, Lambda ở trạng thái Active, lịch EventBridge đang Enabled, S3 có ba đối tượng raw với tổng 87.250 byte và Glue có ba phân vùng dữ liệu. Năm truy vấn Athena đều SUCCEEDED, gồm bốn truy vấn phân tích và một truy vấn xuất 156 bản ghi gốc; mỗi truy vấn quét 87.250 byte. Báo cáo trình bày bốn biểu đồ từ CSV, 24 nhóm giờ UTC, phân bố AQI và tương quan khí tượng.</w:t>
+        <w:t>Trong Tuần 1, Lambda ở trạng thái Active, lịch EventBridge đang Enabled, S3 có ba đối tượng raw với tổng 87.250 byte và Glue có ba phân vùng dữ liệu. Năm truy vấn Athena đều SUCCEEDED, gồm bốn truy vấn phân tích và một truy vấn xuất 156 bản ghi gốc; mỗi truy vấn quét 87.250 byte. Báo cáo trình bày chín biểu đồ từ CSV, 24 nhóm giờ UTC, phân bố AQI và tương quan khí tượng.</w:t>
       </w:r>
     </w:p>
     <w:p>
@@ -534,7 +534,7 @@
         </w:rPr>
         <w:fldChar w:fldCharType="separate"/>
       </w:r>
-      <w:hyperlink w:anchor="_Toc242878392" w:history="1">
+      <w:hyperlink w:anchor="_Toc242892018" w:history="1">
         <w:r>
           <w:rPr>
             <w:rStyle w:val="Hyperlink"/>
@@ -561,7 +561,7 @@
             <w:noProof/>
             <w:webHidden/>
           </w:rPr>
-          <w:instrText xml:space="preserve"> PAGEREF _Toc242878392 \h </w:instrText>
+          <w:instrText xml:space="preserve"> PAGEREF _Toc242892018 \h </w:instrText>
         </w:r>
         <w:r>
           <w:rPr>
@@ -608,7 +608,7 @@
           <w14:ligatures w14:val="standardContextual"/>
         </w:rPr>
       </w:pPr>
-      <w:hyperlink w:anchor="_Toc242878393" w:history="1">
+      <w:hyperlink w:anchor="_Toc242892019" w:history="1">
         <w:r>
           <w:rPr>
             <w:rStyle w:val="Hyperlink"/>
@@ -635,7 +635,7 @@
             <w:noProof/>
             <w:webHidden/>
           </w:rPr>
-          <w:instrText xml:space="preserve"> PAGEREF _Toc242878393 \h </w:instrText>
+          <w:instrText xml:space="preserve"> PAGEREF _Toc242892019 \h </w:instrText>
         </w:r>
         <w:r>
           <w:rPr>
@@ -682,7 +682,7 @@
           <w14:ligatures w14:val="standardContextual"/>
         </w:rPr>
       </w:pPr>
-      <w:hyperlink w:anchor="_Toc242878394" w:history="1">
+      <w:hyperlink w:anchor="_Toc242892020" w:history="1">
         <w:r>
           <w:rPr>
             <w:rStyle w:val="Hyperlink"/>
@@ -709,7 +709,7 @@
             <w:noProof/>
             <w:webHidden/>
           </w:rPr>
-          <w:instrText xml:space="preserve"> PAGEREF _Toc242878394 \h </w:instrText>
+          <w:instrText xml:space="preserve"> PAGEREF _Toc242892020 \h </w:instrText>
         </w:r>
         <w:r>
           <w:rPr>
@@ -756,7 +756,7 @@
           <w14:ligatures w14:val="standardContextual"/>
         </w:rPr>
       </w:pPr>
-      <w:hyperlink w:anchor="_Toc242878395" w:history="1">
+      <w:hyperlink w:anchor="_Toc242892021" w:history="1">
         <w:r>
           <w:rPr>
             <w:rStyle w:val="Hyperlink"/>
@@ -783,7 +783,7 @@
             <w:noProof/>
             <w:webHidden/>
           </w:rPr>
-          <w:instrText xml:space="preserve"> PAGEREF _Toc242878395 \h </w:instrText>
+          <w:instrText xml:space="preserve"> PAGEREF _Toc242892021 \h </w:instrText>
         </w:r>
         <w:r>
           <w:rPr>
@@ -830,7 +830,7 @@
           <w14:ligatures w14:val="standardContextual"/>
         </w:rPr>
       </w:pPr>
-      <w:hyperlink w:anchor="_Toc242878396" w:history="1">
+      <w:hyperlink w:anchor="_Toc242892022" w:history="1">
         <w:r>
           <w:rPr>
             <w:rStyle w:val="Hyperlink"/>
@@ -857,7 +857,7 @@
             <w:noProof/>
             <w:webHidden/>
           </w:rPr>
-          <w:instrText xml:space="preserve"> PAGEREF _Toc242878396 \h </w:instrText>
+          <w:instrText xml:space="preserve"> PAGEREF _Toc242892022 \h </w:instrText>
         </w:r>
         <w:r>
           <w:rPr>
@@ -905,7 +905,7 @@
           <w14:ligatures w14:val="standardContextual"/>
         </w:rPr>
       </w:pPr>
-      <w:hyperlink w:anchor="_Toc242878397" w:history="1">
+      <w:hyperlink w:anchor="_Toc242892023" w:history="1">
         <w:r>
           <w:rPr>
             <w:rStyle w:val="Hyperlink"/>
@@ -932,7 +932,7 @@
             <w:noProof/>
             <w:webHidden/>
           </w:rPr>
-          <w:instrText xml:space="preserve"> PAGEREF _Toc242878397 \h </w:instrText>
+          <w:instrText xml:space="preserve"> PAGEREF _Toc242892023 \h </w:instrText>
         </w:r>
         <w:r>
           <w:rPr>
@@ -979,7 +979,7 @@
           <w14:ligatures w14:val="standardContextual"/>
         </w:rPr>
       </w:pPr>
-      <w:hyperlink w:anchor="_Toc242878398" w:history="1">
+      <w:hyperlink w:anchor="_Toc242892024" w:history="1">
         <w:r>
           <w:rPr>
             <w:rStyle w:val="Hyperlink"/>
@@ -1006,7 +1006,7 @@
             <w:noProof/>
             <w:webHidden/>
           </w:rPr>
-          <w:instrText xml:space="preserve"> PAGEREF _Toc242878398 \h </w:instrText>
+          <w:instrText xml:space="preserve"> PAGEREF _Toc242892024 \h </w:instrText>
         </w:r>
         <w:r>
           <w:rPr>
@@ -1053,7 +1053,7 @@
           <w14:ligatures w14:val="standardContextual"/>
         </w:rPr>
       </w:pPr>
-      <w:hyperlink w:anchor="_Toc242878399" w:history="1">
+      <w:hyperlink w:anchor="_Toc242892025" w:history="1">
         <w:r>
           <w:rPr>
             <w:rStyle w:val="Hyperlink"/>
@@ -1080,7 +1080,7 @@
             <w:noProof/>
             <w:webHidden/>
           </w:rPr>
-          <w:instrText xml:space="preserve"> PAGEREF _Toc242878399 \h </w:instrText>
+          <w:instrText xml:space="preserve"> PAGEREF _Toc242892025 \h </w:instrText>
         </w:r>
         <w:r>
           <w:rPr>
@@ -1127,7 +1127,7 @@
           <w14:ligatures w14:val="standardContextual"/>
         </w:rPr>
       </w:pPr>
-      <w:hyperlink w:anchor="_Toc242878400" w:history="1">
+      <w:hyperlink w:anchor="_Toc242892026" w:history="1">
         <w:r>
           <w:rPr>
             <w:rStyle w:val="Hyperlink"/>
@@ -1154,7 +1154,7 @@
             <w:noProof/>
             <w:webHidden/>
           </w:rPr>
-          <w:instrText xml:space="preserve"> PAGEREF _Toc242878400 \h </w:instrText>
+          <w:instrText xml:space="preserve"> PAGEREF _Toc242892026 \h </w:instrText>
         </w:r>
         <w:r>
           <w:rPr>
@@ -1202,7 +1202,7 @@
           <w14:ligatures w14:val="standardContextual"/>
         </w:rPr>
       </w:pPr>
-      <w:hyperlink w:anchor="_Toc242878401" w:history="1">
+      <w:hyperlink w:anchor="_Toc242892027" w:history="1">
         <w:r>
           <w:rPr>
             <w:rStyle w:val="Hyperlink"/>
@@ -1229,7 +1229,7 @@
             <w:noProof/>
             <w:webHidden/>
           </w:rPr>
-          <w:instrText xml:space="preserve"> PAGEREF _Toc242878401 \h </w:instrText>
+          <w:instrText xml:space="preserve"> PAGEREF _Toc242892027 \h </w:instrText>
         </w:r>
         <w:r>
           <w:rPr>
@@ -1276,7 +1276,7 @@
           <w14:ligatures w14:val="standardContextual"/>
         </w:rPr>
       </w:pPr>
-      <w:hyperlink w:anchor="_Toc242878402" w:history="1">
+      <w:hyperlink w:anchor="_Toc242892028" w:history="1">
         <w:r>
           <w:rPr>
             <w:rStyle w:val="Hyperlink"/>
@@ -1303,7 +1303,7 @@
             <w:noProof/>
             <w:webHidden/>
           </w:rPr>
-          <w:instrText xml:space="preserve"> PAGEREF _Toc242878402 \h </w:instrText>
+          <w:instrText xml:space="preserve"> PAGEREF _Toc242892028 \h </w:instrText>
         </w:r>
         <w:r>
           <w:rPr>
@@ -1350,7 +1350,7 @@
           <w14:ligatures w14:val="standardContextual"/>
         </w:rPr>
       </w:pPr>
-      <w:hyperlink w:anchor="_Toc242878403" w:history="1">
+      <w:hyperlink w:anchor="_Toc242892029" w:history="1">
         <w:r>
           <w:rPr>
             <w:rStyle w:val="Hyperlink"/>
@@ -1377,7 +1377,7 @@
             <w:noProof/>
             <w:webHidden/>
           </w:rPr>
-          <w:instrText xml:space="preserve"> PAGEREF _Toc242878403 \h </w:instrText>
+          <w:instrText xml:space="preserve"> PAGEREF _Toc242892029 \h </w:instrText>
         </w:r>
         <w:r>
           <w:rPr>
@@ -1424,7 +1424,7 @@
           <w14:ligatures w14:val="standardContextual"/>
         </w:rPr>
       </w:pPr>
-      <w:hyperlink w:anchor="_Toc242878404" w:history="1">
+      <w:hyperlink w:anchor="_Toc242892030" w:history="1">
         <w:r>
           <w:rPr>
             <w:rStyle w:val="Hyperlink"/>
@@ -1451,7 +1451,7 @@
             <w:noProof/>
             <w:webHidden/>
           </w:rPr>
-          <w:instrText xml:space="preserve"> PAGEREF _Toc242878404 \h </w:instrText>
+          <w:instrText xml:space="preserve"> PAGEREF _Toc242892030 \h </w:instrText>
         </w:r>
         <w:r>
           <w:rPr>
@@ -1498,7 +1498,7 @@
           <w14:ligatures w14:val="standardContextual"/>
         </w:rPr>
       </w:pPr>
-      <w:hyperlink w:anchor="_Toc242878405" w:history="1">
+      <w:hyperlink w:anchor="_Toc242892031" w:history="1">
         <w:r>
           <w:rPr>
             <w:rStyle w:val="Hyperlink"/>
@@ -1525,7 +1525,7 @@
             <w:noProof/>
             <w:webHidden/>
           </w:rPr>
-          <w:instrText xml:space="preserve"> PAGEREF _Toc242878405 \h </w:instrText>
+          <w:instrText xml:space="preserve"> PAGEREF _Toc242892031 \h </w:instrText>
         </w:r>
         <w:r>
           <w:rPr>
@@ -1572,7 +1572,7 @@
           <w14:ligatures w14:val="standardContextual"/>
         </w:rPr>
       </w:pPr>
-      <w:hyperlink w:anchor="_Toc242878406" w:history="1">
+      <w:hyperlink w:anchor="_Toc242892032" w:history="1">
         <w:r>
           <w:rPr>
             <w:rStyle w:val="Hyperlink"/>
@@ -1599,7 +1599,7 @@
             <w:noProof/>
             <w:webHidden/>
           </w:rPr>
-          <w:instrText xml:space="preserve"> PAGEREF _Toc242878406 \h </w:instrText>
+          <w:instrText xml:space="preserve"> PAGEREF _Toc242892032 \h </w:instrText>
         </w:r>
         <w:r>
           <w:rPr>
@@ -1646,7 +1646,7 @@
           <w14:ligatures w14:val="standardContextual"/>
         </w:rPr>
       </w:pPr>
-      <w:hyperlink w:anchor="_Toc242878407" w:history="1">
+      <w:hyperlink w:anchor="_Toc242892033" w:history="1">
         <w:r>
           <w:rPr>
             <w:rStyle w:val="Hyperlink"/>
@@ -1673,7 +1673,7 @@
             <w:noProof/>
             <w:webHidden/>
           </w:rPr>
-          <w:instrText xml:space="preserve"> PAGEREF _Toc242878407 \h </w:instrText>
+          <w:instrText xml:space="preserve"> PAGEREF _Toc242892033 \h </w:instrText>
         </w:r>
         <w:r>
           <w:rPr>
@@ -1720,7 +1720,7 @@
           <w14:ligatures w14:val="standardContextual"/>
         </w:rPr>
       </w:pPr>
-      <w:hyperlink w:anchor="_Toc242878408" w:history="1">
+      <w:hyperlink w:anchor="_Toc242892034" w:history="1">
         <w:r>
           <w:rPr>
             <w:rStyle w:val="Hyperlink"/>
@@ -1747,7 +1747,7 @@
             <w:noProof/>
             <w:webHidden/>
           </w:rPr>
-          <w:instrText xml:space="preserve"> PAGEREF _Toc242878408 \h </w:instrText>
+          <w:instrText xml:space="preserve"> PAGEREF _Toc242892034 \h </w:instrText>
         </w:r>
         <w:r>
           <w:rPr>
@@ -1795,7 +1795,7 @@
           <w14:ligatures w14:val="standardContextual"/>
         </w:rPr>
       </w:pPr>
-      <w:hyperlink w:anchor="_Toc242878409" w:history="1">
+      <w:hyperlink w:anchor="_Toc242892035" w:history="1">
         <w:r>
           <w:rPr>
             <w:rStyle w:val="Hyperlink"/>
@@ -1822,7 +1822,7 @@
             <w:noProof/>
             <w:webHidden/>
           </w:rPr>
-          <w:instrText xml:space="preserve"> PAGEREF _Toc242878409 \h </w:instrText>
+          <w:instrText xml:space="preserve"> PAGEREF _Toc242892035 \h </w:instrText>
         </w:r>
         <w:r>
           <w:rPr>
@@ -1869,7 +1869,7 @@
           <w14:ligatures w14:val="standardContextual"/>
         </w:rPr>
       </w:pPr>
-      <w:hyperlink w:anchor="_Toc242878410" w:history="1">
+      <w:hyperlink w:anchor="_Toc242892036" w:history="1">
         <w:r>
           <w:rPr>
             <w:rStyle w:val="Hyperlink"/>
@@ -1896,7 +1896,7 @@
             <w:noProof/>
             <w:webHidden/>
           </w:rPr>
-          <w:instrText xml:space="preserve"> PAGEREF _Toc242878410 \h </w:instrText>
+          <w:instrText xml:space="preserve"> PAGEREF _Toc242892036 \h </w:instrText>
         </w:r>
         <w:r>
           <w:rPr>
@@ -1943,7 +1943,7 @@
           <w14:ligatures w14:val="standardContextual"/>
         </w:rPr>
       </w:pPr>
-      <w:hyperlink w:anchor="_Toc242878411" w:history="1">
+      <w:hyperlink w:anchor="_Toc242892037" w:history="1">
         <w:r>
           <w:rPr>
             <w:rStyle w:val="Hyperlink"/>
@@ -1970,7 +1970,7 @@
             <w:noProof/>
             <w:webHidden/>
           </w:rPr>
-          <w:instrText xml:space="preserve"> PAGEREF _Toc242878411 \h </w:instrText>
+          <w:instrText xml:space="preserve"> PAGEREF _Toc242892037 \h </w:instrText>
         </w:r>
         <w:r>
           <w:rPr>
@@ -2017,7 +2017,7 @@
           <w14:ligatures w14:val="standardContextual"/>
         </w:rPr>
       </w:pPr>
-      <w:hyperlink w:anchor="_Toc242878412" w:history="1">
+      <w:hyperlink w:anchor="_Toc242892038" w:history="1">
         <w:r>
           <w:rPr>
             <w:rStyle w:val="Hyperlink"/>
@@ -2044,81 +2044,7 @@
             <w:noProof/>
             <w:webHidden/>
           </w:rPr>
-          <w:instrText xml:space="preserve"> PAGEREF _Toc242878412 \h </w:instrText>
-        </w:r>
-        <w:r>
-          <w:rPr>
-            <w:noProof/>
-            <w:webHidden/>
-          </w:rPr>
-        </w:r>
-        <w:r>
-          <w:rPr>
-            <w:noProof/>
-            <w:webHidden/>
-          </w:rPr>
-          <w:fldChar w:fldCharType="separate"/>
-        </w:r>
-        <w:r>
-          <w:rPr>
-            <w:noProof/>
-            <w:webHidden/>
-          </w:rPr>
-          <w:t>12</w:t>
-        </w:r>
-        <w:r>
-          <w:rPr>
-            <w:noProof/>
-            <w:webHidden/>
-          </w:rPr>
-          <w:fldChar w:fldCharType="end"/>
-        </w:r>
-      </w:hyperlink>
-    </w:p>
-    <w:p>
-      <w:pPr>
-        <w:pStyle w:val="TOC2"/>
-        <w:tabs>
-          <w:tab w:val="right" w:leader="dot" w:pos="9926"/>
-        </w:tabs>
-        <w:rPr>
-          <w:rFonts w:asciiTheme="minorHAnsi" w:eastAsiaTheme="minorEastAsia" w:hAnsiTheme="minorHAnsi" w:cstheme="minorBidi"/>
-          <w:noProof/>
-          <w:color w:val="auto"/>
-          <w:kern w:val="2"/>
-          <w:szCs w:val="24"/>
-          <w:lang w:val="en-US" w:eastAsia="ja-JP"/>
-          <w14:ligatures w14:val="standardContextual"/>
-        </w:rPr>
-      </w:pPr>
-      <w:hyperlink w:anchor="_Toc242878413" w:history="1">
-        <w:r>
-          <w:rPr>
-            <w:rStyle w:val="Hyperlink"/>
-            <w:noProof/>
-          </w:rPr>
-          <w:t>4.4 Phân bố cấp chất lượng không khí</w:t>
-        </w:r>
-        <w:r>
-          <w:rPr>
-            <w:noProof/>
-            <w:webHidden/>
-          </w:rPr>
-          <w:tab/>
-        </w:r>
-        <w:r>
-          <w:rPr>
-            <w:noProof/>
-            <w:webHidden/>
-          </w:rPr>
-          <w:fldChar w:fldCharType="begin"/>
-        </w:r>
-        <w:r>
-          <w:rPr>
-            <w:noProof/>
-            <w:webHidden/>
-          </w:rPr>
-          <w:instrText xml:space="preserve"> PAGEREF _Toc242878413 \h </w:instrText>
+          <w:instrText xml:space="preserve"> PAGEREF _Toc242892038 \h </w:instrText>
         </w:r>
         <w:r>
           <w:rPr>
@@ -2165,13 +2091,13 @@
           <w14:ligatures w14:val="standardContextual"/>
         </w:rPr>
       </w:pPr>
-      <w:hyperlink w:anchor="_Toc242878414" w:history="1">
+      <w:hyperlink w:anchor="_Toc242892039" w:history="1">
         <w:r>
           <w:rPr>
             <w:rStyle w:val="Hyperlink"/>
             <w:noProof/>
           </w:rPr>
-          <w:t>4.5 Tương quan PM2.5 với yếu tố khí tượng</w:t>
+          <w:t>4.4 Phân bố cấp chất lượng không khí</w:t>
         </w:r>
         <w:r>
           <w:rPr>
@@ -2192,81 +2118,7 @@
             <w:noProof/>
             <w:webHidden/>
           </w:rPr>
-          <w:instrText xml:space="preserve"> PAGEREF _Toc242878414 \h </w:instrText>
-        </w:r>
-        <w:r>
-          <w:rPr>
-            <w:noProof/>
-            <w:webHidden/>
-          </w:rPr>
-        </w:r>
-        <w:r>
-          <w:rPr>
-            <w:noProof/>
-            <w:webHidden/>
-          </w:rPr>
-          <w:fldChar w:fldCharType="separate"/>
-        </w:r>
-        <w:r>
-          <w:rPr>
-            <w:noProof/>
-            <w:webHidden/>
-          </w:rPr>
-          <w:t>14</w:t>
-        </w:r>
-        <w:r>
-          <w:rPr>
-            <w:noProof/>
-            <w:webHidden/>
-          </w:rPr>
-          <w:fldChar w:fldCharType="end"/>
-        </w:r>
-      </w:hyperlink>
-    </w:p>
-    <w:p>
-      <w:pPr>
-        <w:pStyle w:val="TOC2"/>
-        <w:tabs>
-          <w:tab w:val="right" w:leader="dot" w:pos="9926"/>
-        </w:tabs>
-        <w:rPr>
-          <w:rFonts w:asciiTheme="minorHAnsi" w:eastAsiaTheme="minorEastAsia" w:hAnsiTheme="minorHAnsi" w:cstheme="minorBidi"/>
-          <w:noProof/>
-          <w:color w:val="auto"/>
-          <w:kern w:val="2"/>
-          <w:szCs w:val="24"/>
-          <w:lang w:val="en-US" w:eastAsia="ja-JP"/>
-          <w14:ligatures w14:val="standardContextual"/>
-        </w:rPr>
-      </w:pPr>
-      <w:hyperlink w:anchor="_Toc242878415" w:history="1">
-        <w:r>
-          <w:rPr>
-            <w:rStyle w:val="Hyperlink"/>
-            <w:noProof/>
-          </w:rPr>
-          <w:t>4.6 Thời gian và dung lượng quét của năm truy vấn</w:t>
-        </w:r>
-        <w:r>
-          <w:rPr>
-            <w:noProof/>
-            <w:webHidden/>
-          </w:rPr>
-          <w:tab/>
-        </w:r>
-        <w:r>
-          <w:rPr>
-            <w:noProof/>
-            <w:webHidden/>
-          </w:rPr>
-          <w:fldChar w:fldCharType="begin"/>
-        </w:r>
-        <w:r>
-          <w:rPr>
-            <w:noProof/>
-            <w:webHidden/>
-          </w:rPr>
-          <w:instrText xml:space="preserve"> PAGEREF _Toc242878415 \h </w:instrText>
+          <w:instrText xml:space="preserve"> PAGEREF _Toc242892039 \h </w:instrText>
         </w:r>
         <w:r>
           <w:rPr>
@@ -2299,13 +2151,12 @@
     </w:p>
     <w:p>
       <w:pPr>
-        <w:pStyle w:val="TOC1"/>
+        <w:pStyle w:val="TOC2"/>
         <w:tabs>
           <w:tab w:val="right" w:leader="dot" w:pos="9926"/>
         </w:tabs>
         <w:rPr>
           <w:rFonts w:asciiTheme="minorHAnsi" w:eastAsiaTheme="minorEastAsia" w:hAnsiTheme="minorHAnsi" w:cstheme="minorBidi"/>
-          <w:b w:val="0"/>
           <w:noProof/>
           <w:color w:val="auto"/>
           <w:kern w:val="2"/>
@@ -2314,13 +2165,13 @@
           <w14:ligatures w14:val="standardContextual"/>
         </w:rPr>
       </w:pPr>
-      <w:hyperlink w:anchor="_Toc242878416" w:history="1">
+      <w:hyperlink w:anchor="_Toc242892040" w:history="1">
         <w:r>
           <w:rPr>
             <w:rStyle w:val="Hyperlink"/>
             <w:noProof/>
           </w:rPr>
-          <w:t>Chương 5 Tổng hợp kết quả và chi phí Tuần 1</w:t>
+          <w:t>4.5 Tương quan PM2.5 với yếu tố khí tượng</w:t>
         </w:r>
         <w:r>
           <w:rPr>
@@ -2341,7 +2192,7 @@
             <w:noProof/>
             <w:webHidden/>
           </w:rPr>
-          <w:instrText xml:space="preserve"> PAGEREF _Toc242878416 \h </w:instrText>
+          <w:instrText xml:space="preserve"> PAGEREF _Toc242892040 \h </w:instrText>
         </w:r>
         <w:r>
           <w:rPr>
@@ -2388,7 +2239,230 @@
           <w14:ligatures w14:val="standardContextual"/>
         </w:rPr>
       </w:pPr>
-      <w:hyperlink w:anchor="_Toc242878417" w:history="1">
+      <w:hyperlink w:anchor="_Toc242892041" w:history="1">
+        <w:r>
+          <w:rPr>
+            <w:rStyle w:val="Hyperlink"/>
+            <w:noProof/>
+          </w:rPr>
+          <w:t>4.6 Thời gian và dung lượng quét của năm truy vấn</w:t>
+        </w:r>
+        <w:r>
+          <w:rPr>
+            <w:noProof/>
+            <w:webHidden/>
+          </w:rPr>
+          <w:tab/>
+        </w:r>
+        <w:r>
+          <w:rPr>
+            <w:noProof/>
+            <w:webHidden/>
+          </w:rPr>
+          <w:fldChar w:fldCharType="begin"/>
+        </w:r>
+        <w:r>
+          <w:rPr>
+            <w:noProof/>
+            <w:webHidden/>
+          </w:rPr>
+          <w:instrText xml:space="preserve"> PAGEREF _Toc242892041 \h </w:instrText>
+        </w:r>
+        <w:r>
+          <w:rPr>
+            <w:noProof/>
+            <w:webHidden/>
+          </w:rPr>
+        </w:r>
+        <w:r>
+          <w:rPr>
+            <w:noProof/>
+            <w:webHidden/>
+          </w:rPr>
+          <w:fldChar w:fldCharType="separate"/>
+        </w:r>
+        <w:r>
+          <w:rPr>
+            <w:noProof/>
+            <w:webHidden/>
+          </w:rPr>
+          <w:t>18</w:t>
+        </w:r>
+        <w:r>
+          <w:rPr>
+            <w:noProof/>
+            <w:webHidden/>
+          </w:rPr>
+          <w:fldChar w:fldCharType="end"/>
+        </w:r>
+      </w:hyperlink>
+    </w:p>
+    <w:p>
+      <w:pPr>
+        <w:pStyle w:val="TOC2"/>
+        <w:tabs>
+          <w:tab w:val="right" w:leader="dot" w:pos="9926"/>
+        </w:tabs>
+        <w:rPr>
+          <w:rFonts w:asciiTheme="minorHAnsi" w:eastAsiaTheme="minorEastAsia" w:hAnsiTheme="minorHAnsi" w:cstheme="minorBidi"/>
+          <w:noProof/>
+          <w:color w:val="auto"/>
+          <w:kern w:val="2"/>
+          <w:szCs w:val="24"/>
+          <w:lang w:val="en-US" w:eastAsia="ja-JP"/>
+          <w14:ligatures w14:val="standardContextual"/>
+        </w:rPr>
+      </w:pPr>
+      <w:hyperlink w:anchor="_Toc242892042" w:history="1">
+        <w:r>
+          <w:rPr>
+            <w:rStyle w:val="Hyperlink"/>
+            <w:noProof/>
+          </w:rPr>
+          <w:t>4.7 Phân bố và độ phân tán của AQI và PM2.5</w:t>
+        </w:r>
+        <w:r>
+          <w:rPr>
+            <w:noProof/>
+            <w:webHidden/>
+          </w:rPr>
+          <w:tab/>
+        </w:r>
+        <w:r>
+          <w:rPr>
+            <w:noProof/>
+            <w:webHidden/>
+          </w:rPr>
+          <w:fldChar w:fldCharType="begin"/>
+        </w:r>
+        <w:r>
+          <w:rPr>
+            <w:noProof/>
+            <w:webHidden/>
+          </w:rPr>
+          <w:instrText xml:space="preserve"> PAGEREF _Toc242892042 \h </w:instrText>
+        </w:r>
+        <w:r>
+          <w:rPr>
+            <w:noProof/>
+            <w:webHidden/>
+          </w:rPr>
+        </w:r>
+        <w:r>
+          <w:rPr>
+            <w:noProof/>
+            <w:webHidden/>
+          </w:rPr>
+          <w:fldChar w:fldCharType="separate"/>
+        </w:r>
+        <w:r>
+          <w:rPr>
+            <w:noProof/>
+            <w:webHidden/>
+          </w:rPr>
+          <w:t>20</w:t>
+        </w:r>
+        <w:r>
+          <w:rPr>
+            <w:noProof/>
+            <w:webHidden/>
+          </w:rPr>
+          <w:fldChar w:fldCharType="end"/>
+        </w:r>
+      </w:hyperlink>
+    </w:p>
+    <w:p>
+      <w:pPr>
+        <w:pStyle w:val="TOC1"/>
+        <w:tabs>
+          <w:tab w:val="right" w:leader="dot" w:pos="9926"/>
+        </w:tabs>
+        <w:rPr>
+          <w:rFonts w:asciiTheme="minorHAnsi" w:eastAsiaTheme="minorEastAsia" w:hAnsiTheme="minorHAnsi" w:cstheme="minorBidi"/>
+          <w:b w:val="0"/>
+          <w:noProof/>
+          <w:color w:val="auto"/>
+          <w:kern w:val="2"/>
+          <w:szCs w:val="24"/>
+          <w:lang w:val="en-US" w:eastAsia="ja-JP"/>
+          <w14:ligatures w14:val="standardContextual"/>
+        </w:rPr>
+      </w:pPr>
+      <w:hyperlink w:anchor="_Toc242892043" w:history="1">
+        <w:r>
+          <w:rPr>
+            <w:rStyle w:val="Hyperlink"/>
+            <w:noProof/>
+          </w:rPr>
+          <w:t>Chương 5 Tổng hợp kết quả và chi phí Tuần 1</w:t>
+        </w:r>
+        <w:r>
+          <w:rPr>
+            <w:noProof/>
+            <w:webHidden/>
+          </w:rPr>
+          <w:tab/>
+        </w:r>
+        <w:r>
+          <w:rPr>
+            <w:noProof/>
+            <w:webHidden/>
+          </w:rPr>
+          <w:fldChar w:fldCharType="begin"/>
+        </w:r>
+        <w:r>
+          <w:rPr>
+            <w:noProof/>
+            <w:webHidden/>
+          </w:rPr>
+          <w:instrText xml:space="preserve"> PAGEREF _Toc242892043 \h </w:instrText>
+        </w:r>
+        <w:r>
+          <w:rPr>
+            <w:noProof/>
+            <w:webHidden/>
+          </w:rPr>
+        </w:r>
+        <w:r>
+          <w:rPr>
+            <w:noProof/>
+            <w:webHidden/>
+          </w:rPr>
+          <w:fldChar w:fldCharType="separate"/>
+        </w:r>
+        <w:r>
+          <w:rPr>
+            <w:noProof/>
+            <w:webHidden/>
+          </w:rPr>
+          <w:t>21</w:t>
+        </w:r>
+        <w:r>
+          <w:rPr>
+            <w:noProof/>
+            <w:webHidden/>
+          </w:rPr>
+          <w:fldChar w:fldCharType="end"/>
+        </w:r>
+      </w:hyperlink>
+    </w:p>
+    <w:p>
+      <w:pPr>
+        <w:pStyle w:val="TOC2"/>
+        <w:tabs>
+          <w:tab w:val="right" w:leader="dot" w:pos="9926"/>
+        </w:tabs>
+        <w:rPr>
+          <w:rFonts w:asciiTheme="minorHAnsi" w:eastAsiaTheme="minorEastAsia" w:hAnsiTheme="minorHAnsi" w:cstheme="minorBidi"/>
+          <w:noProof/>
+          <w:color w:val="auto"/>
+          <w:kern w:val="2"/>
+          <w:szCs w:val="24"/>
+          <w:lang w:val="en-US" w:eastAsia="ja-JP"/>
+          <w14:ligatures w14:val="standardContextual"/>
+        </w:rPr>
+      </w:pPr>
+      <w:hyperlink w:anchor="_Toc242892044" w:history="1">
         <w:r>
           <w:rPr>
             <w:rStyle w:val="Hyperlink"/>
@@ -2415,7 +2489,7 @@
             <w:noProof/>
             <w:webHidden/>
           </w:rPr>
-          <w:instrText xml:space="preserve"> PAGEREF _Toc242878417 \h </w:instrText>
+          <w:instrText xml:space="preserve"> PAGEREF _Toc242892044 \h </w:instrText>
         </w:r>
         <w:r>
           <w:rPr>
@@ -2435,7 +2509,7 @@
             <w:noProof/>
             <w:webHidden/>
           </w:rPr>
-          <w:t>16</w:t>
+          <w:t>21</w:t>
         </w:r>
         <w:r>
           <w:rPr>
@@ -2462,7 +2536,7 @@
           <w14:ligatures w14:val="standardContextual"/>
         </w:rPr>
       </w:pPr>
-      <w:hyperlink w:anchor="_Toc242878418" w:history="1">
+      <w:hyperlink w:anchor="_Toc242892045" w:history="1">
         <w:r>
           <w:rPr>
             <w:rStyle w:val="Hyperlink"/>
@@ -2489,7 +2563,7 @@
             <w:noProof/>
             <w:webHidden/>
           </w:rPr>
-          <w:instrText xml:space="preserve"> PAGEREF _Toc242878418 \h </w:instrText>
+          <w:instrText xml:space="preserve"> PAGEREF _Toc242892045 \h </w:instrText>
         </w:r>
         <w:r>
           <w:rPr>
@@ -2509,7 +2583,7 @@
             <w:noProof/>
             <w:webHidden/>
           </w:rPr>
-          <w:t>16</w:t>
+          <w:t>21</w:t>
         </w:r>
         <w:r>
           <w:rPr>
@@ -2536,7 +2610,7 @@
           <w14:ligatures w14:val="standardContextual"/>
         </w:rPr>
       </w:pPr>
-      <w:hyperlink w:anchor="_Toc242878419" w:history="1">
+      <w:hyperlink w:anchor="_Toc242892046" w:history="1">
         <w:r>
           <w:rPr>
             <w:rStyle w:val="Hyperlink"/>
@@ -2563,7 +2637,7 @@
             <w:noProof/>
             <w:webHidden/>
           </w:rPr>
-          <w:instrText xml:space="preserve"> PAGEREF _Toc242878419 \h </w:instrText>
+          <w:instrText xml:space="preserve"> PAGEREF _Toc242892046 \h </w:instrText>
         </w:r>
         <w:r>
           <w:rPr>
@@ -2583,7 +2657,7 @@
             <w:noProof/>
             <w:webHidden/>
           </w:rPr>
-          <w:t>16</w:t>
+          <w:t>21</w:t>
         </w:r>
         <w:r>
           <w:rPr>
@@ -2625,7 +2699,7 @@
       <w:bookmarkStart w:id="3" w:name="_Toc242872832"/>
       <w:bookmarkStart w:id="4" w:name="_Toc242877784"/>
       <w:bookmarkStart w:id="5" w:name="_Toc242877964"/>
-      <w:bookmarkStart w:id="6" w:name="_Toc242878392"/>
+      <w:bookmarkStart w:id="6" w:name="_Toc242892018"/>
       <w:r>
         <w:lastRenderedPageBreak/>
         <w:t>Chương 1 Tổng quan đề tài và yêu cầu học phần</w:t>
@@ -2648,7 +2722,7 @@
       <w:bookmarkStart w:id="10" w:name="_Toc242872833"/>
       <w:bookmarkStart w:id="11" w:name="_Toc242877785"/>
       <w:bookmarkStart w:id="12" w:name="_Toc242877965"/>
-      <w:bookmarkStart w:id="13" w:name="_Toc242878393"/>
+      <w:bookmarkStart w:id="13" w:name="_Toc242892019"/>
       <w:r>
         <w:t>1.1 Bối cảnh, mục tiêu và phạm vi</w:t>
       </w:r>
@@ -2731,7 +2805,7 @@
       <w:bookmarkStart w:id="17" w:name="_Toc242872834"/>
       <w:bookmarkStart w:id="18" w:name="_Toc242877786"/>
       <w:bookmarkStart w:id="19" w:name="_Toc242877966"/>
-      <w:bookmarkStart w:id="20" w:name="_Toc242878394"/>
+      <w:bookmarkStart w:id="20" w:name="_Toc242892020"/>
       <w:r>
         <w:t>1.2 Yêu cầu chức năng và kết quả triển khai</w:t>
       </w:r>
@@ -3339,7 +3413,7 @@
       <w:bookmarkStart w:id="24" w:name="_Toc242872835"/>
       <w:bookmarkStart w:id="25" w:name="_Toc242877787"/>
       <w:bookmarkStart w:id="26" w:name="_Toc242877967"/>
-      <w:bookmarkStart w:id="27" w:name="_Toc242878395"/>
+      <w:bookmarkStart w:id="27" w:name="_Toc242892021"/>
       <w:r>
         <w:lastRenderedPageBreak/>
         <w:t>1.3 Kiến trúc tổng thể</w:t>
@@ -3429,7 +3503,7 @@
       <w:bookmarkStart w:id="31" w:name="_Toc242872836"/>
       <w:bookmarkStart w:id="32" w:name="_Toc242877788"/>
       <w:bookmarkStart w:id="33" w:name="_Toc242877968"/>
-      <w:bookmarkStart w:id="34" w:name="_Toc242878396"/>
+      <w:bookmarkStart w:id="34" w:name="_Toc242892022"/>
       <w:r>
         <w:lastRenderedPageBreak/>
         <w:t>1.4 Nguồn số liệu và mốc đo</w:t>
@@ -3846,7 +3920,7 @@
               <w:rPr>
                 <w:sz w:val="22"/>
               </w:rPr>
-              <w:t>Bốn hình từ tập CSV Athena</w:t>
+              <w:t>Chín hình từ tập CSV Athena</w:t>
             </w:r>
           </w:p>
         </w:tc>
@@ -4318,7 +4392,7 @@
       <w:bookmarkStart w:id="38" w:name="_Toc242872837"/>
       <w:bookmarkStart w:id="39" w:name="_Toc242877789"/>
       <w:bookmarkStart w:id="40" w:name="_Toc242877969"/>
-      <w:bookmarkStart w:id="41" w:name="_Toc242878397"/>
+      <w:bookmarkStart w:id="41" w:name="_Toc242892023"/>
       <w:r>
         <w:lastRenderedPageBreak/>
         <w:t>Chương 2 Báo cáo tiến độ Tuần 1</w:t>
@@ -4350,7 +4424,7 @@
       <w:bookmarkStart w:id="45" w:name="_Toc242872838"/>
       <w:bookmarkStart w:id="46" w:name="_Toc242877790"/>
       <w:bookmarkStart w:id="47" w:name="_Toc242877970"/>
-      <w:bookmarkStart w:id="48" w:name="_Toc242878398"/>
+      <w:bookmarkStart w:id="48" w:name="_Toc242892024"/>
       <w:r>
         <w:t>2.1 Mục tiêu và phân công thực hiện</w:t>
       </w:r>
@@ -4686,7 +4760,7 @@
       <w:bookmarkStart w:id="52" w:name="_Toc242872839"/>
       <w:bookmarkStart w:id="53" w:name="_Toc242877791"/>
       <w:bookmarkStart w:id="54" w:name="_Toc242877971"/>
-      <w:bookmarkStart w:id="55" w:name="_Toc242878399"/>
+      <w:bookmarkStart w:id="55" w:name="_Toc242892025"/>
       <w:r>
         <w:t>2.2 Phạm vi và luồng dữ liệu đo</w:t>
       </w:r>
@@ -5156,7 +5230,7 @@
       <w:bookmarkStart w:id="59" w:name="_Toc242872840"/>
       <w:bookmarkStart w:id="60" w:name="_Toc242877792"/>
       <w:bookmarkStart w:id="61" w:name="_Toc242877972"/>
-      <w:bookmarkStart w:id="62" w:name="_Toc242878400"/>
+      <w:bookmarkStart w:id="62" w:name="_Toc242892026"/>
       <w:r>
         <w:t>2.3 Kết quả định lượng</w:t>
       </w:r>
@@ -5641,7 +5715,7 @@
               <w:rPr>
                 <w:sz w:val="22"/>
               </w:rPr>
-              <w:t>156 dòng ở lượt xuất, 52 dòng/đô thị; 4 biểu đồ</w:t>
+              <w:t>156 dòng ở lượt xuất, 52 dòng/đô thị; 9 biểu đồ</w:t>
             </w:r>
           </w:p>
         </w:tc>
@@ -5682,7 +5756,7 @@
         <w:ind w:firstLine="504"/>
       </w:pPr>
       <w:r>
-        <w:t>Lượt xuất Athena trong Tuần 1 có 156 dòng gốc và bốn bảng phân tích. Năm truy vấn gồm so sánh đô thị, nhóm giờ UTC, phân bố cấp AQI, tương quan khí tượng và xuất bản ghi gốc đều hoàn thành. Số dòng theo ba góc nhìn tổng hợp đều khớp dữ liệu gốc; Chương 4 trình bày chi tiết từng bảng và bốn biểu đồ từ CSV của lượt xuất này.</w:t>
+        <w:t>Lượt xuất Athena trong Tuần 1 có 156 dòng gốc và bốn bảng phân tích. Năm truy vấn gồm so sánh đô thị, nhóm giờ UTC, phân bố cấp AQI, tương quan khí tượng và xuất bản ghi gốc đều hoàn thành. Số dòng theo ba góc nhìn tổng hợp đều khớp dữ liệu gốc; Chương 4 trình bày chi tiết từng bảng và chín biểu đồ từ CSV của lượt xuất này.</w:t>
       </w:r>
     </w:p>
     <w:p>
@@ -5697,7 +5771,7 @@
       <w:bookmarkStart w:id="66" w:name="_Toc242872841"/>
       <w:bookmarkStart w:id="67" w:name="_Toc242877793"/>
       <w:bookmarkStart w:id="68" w:name="_Toc242877973"/>
-      <w:bookmarkStart w:id="69" w:name="_Toc242878401"/>
+      <w:bookmarkStart w:id="69" w:name="_Toc242892027"/>
       <w:r>
         <w:lastRenderedPageBreak/>
         <w:t>Chương 3 Thiết kế và triển khai trên AWS Learner Lab</w:t>
@@ -5720,7 +5794,7 @@
       <w:bookmarkStart w:id="73" w:name="_Toc242872842"/>
       <w:bookmarkStart w:id="74" w:name="_Toc242877794"/>
       <w:bookmarkStart w:id="75" w:name="_Toc242877974"/>
-      <w:bookmarkStart w:id="76" w:name="_Toc242878402"/>
+      <w:bookmarkStart w:id="76" w:name="_Toc242892028"/>
       <w:r>
         <w:t>3.1 Danh mục dịch vụ và cấu hình thực tế</w:t>
       </w:r>
@@ -6484,7 +6558,7 @@
       <w:bookmarkStart w:id="80" w:name="_Toc242872843"/>
       <w:bookmarkStart w:id="81" w:name="_Toc242877795"/>
       <w:bookmarkStart w:id="82" w:name="_Toc242877975"/>
-      <w:bookmarkStart w:id="83" w:name="_Toc242878403"/>
+      <w:bookmarkStart w:id="83" w:name="_Toc242892029"/>
       <w:r>
         <w:t>3.2 Dữ liệu và phân vùng S3</w:t>
       </w:r>
@@ -6573,7 +6647,7 @@
       <w:bookmarkStart w:id="87" w:name="_Toc242872844"/>
       <w:bookmarkStart w:id="88" w:name="_Toc242877796"/>
       <w:bookmarkStart w:id="89" w:name="_Toc242877976"/>
-      <w:bookmarkStart w:id="90" w:name="_Toc242878404"/>
+      <w:bookmarkStart w:id="90" w:name="_Toc242892030"/>
       <w:r>
         <w:t>3.3 An toàn cấu hình và vận hành</w:t>
       </w:r>
@@ -6604,7 +6678,7 @@
       <w:bookmarkStart w:id="94" w:name="_Toc242872845"/>
       <w:bookmarkStart w:id="95" w:name="_Toc242877797"/>
       <w:bookmarkStart w:id="96" w:name="_Toc242877977"/>
-      <w:bookmarkStart w:id="97" w:name="_Toc242878405"/>
+      <w:bookmarkStart w:id="97" w:name="_Toc242892031"/>
       <w:r>
         <w:lastRenderedPageBreak/>
         <w:t>3.4 Trình tự xử lý của Lambda</w:t>
@@ -6654,7 +6728,7 @@
       <w:bookmarkStart w:id="101" w:name="_Toc242872846"/>
       <w:bookmarkStart w:id="102" w:name="_Toc242877798"/>
       <w:bookmarkStart w:id="103" w:name="_Toc242877978"/>
-      <w:bookmarkStart w:id="104" w:name="_Toc242878406"/>
+      <w:bookmarkStart w:id="104" w:name="_Toc242892032"/>
       <w:r>
         <w:t>3.5 Truy vấn Athena và khả năng tái lập</w:t>
       </w:r>
@@ -6926,7 +7000,7 @@
       <w:bookmarkStart w:id="108" w:name="_Toc242872847"/>
       <w:bookmarkStart w:id="109" w:name="_Toc242877799"/>
       <w:bookmarkStart w:id="110" w:name="_Toc242877979"/>
-      <w:bookmarkStart w:id="111" w:name="_Toc242878407"/>
+      <w:bookmarkStart w:id="111" w:name="_Toc242892033"/>
       <w:r>
         <w:t>3.6 Lược đồ bản ghi và chất lượng dữ liệu</w:t>
       </w:r>
@@ -7631,7 +7705,7 @@
       <w:bookmarkStart w:id="115" w:name="_Toc242872848"/>
       <w:bookmarkStart w:id="116" w:name="_Toc242877800"/>
       <w:bookmarkStart w:id="117" w:name="_Toc242877980"/>
-      <w:bookmarkStart w:id="118" w:name="_Toc242878408"/>
+      <w:bookmarkStart w:id="118" w:name="_Toc242892034"/>
       <w:r>
         <w:lastRenderedPageBreak/>
         <w:t>3.7 Tần suất gọi Open-Meteo và yêu cầu khóa API</w:t>
@@ -7674,7 +7748,7 @@
       <w:bookmarkStart w:id="122" w:name="_Toc242872849"/>
       <w:bookmarkStart w:id="123" w:name="_Toc242877801"/>
       <w:bookmarkStart w:id="124" w:name="_Toc242877981"/>
-      <w:bookmarkStart w:id="125" w:name="_Toc242878409"/>
+      <w:bookmarkStart w:id="125" w:name="_Toc242892035"/>
       <w:r>
         <w:lastRenderedPageBreak/>
         <w:t>Chương 4 Kết quả kiểm tra và phân tích dữ liệu</w:t>
@@ -7697,7 +7771,7 @@
       <w:bookmarkStart w:id="129" w:name="_Toc242872850"/>
       <w:bookmarkStart w:id="130" w:name="_Toc242877802"/>
       <w:bookmarkStart w:id="131" w:name="_Toc242877982"/>
-      <w:bookmarkStart w:id="132" w:name="_Toc242878410"/>
+      <w:bookmarkStart w:id="132" w:name="_Toc242892036"/>
       <w:r>
         <w:t>4.1 Mốc dữ liệu và số đo vận hành AWS</w:t>
       </w:r>
@@ -8399,7 +8473,7 @@
       <w:bookmarkStart w:id="136" w:name="_Toc242872851"/>
       <w:bookmarkStart w:id="137" w:name="_Toc242877803"/>
       <w:bookmarkStart w:id="138" w:name="_Toc242877983"/>
-      <w:bookmarkStart w:id="139" w:name="_Toc242878411"/>
+      <w:bookmarkStart w:id="139" w:name="_Toc242892037"/>
       <w:r>
         <w:lastRenderedPageBreak/>
         <w:t>4.2 So sánh ba đô thị từ Athena</w:t>
@@ -9614,6 +9688,138 @@
     </w:p>
     <w:p>
       <w:pPr>
+        <w:keepNext/>
+        <w:spacing w:after="80"/>
+        <w:jc w:val="center"/>
+      </w:pPr>
+      <w:r>
+        <w:rPr>
+          <w:noProof/>
+        </w:rPr>
+        <w:drawing>
+          <wp:inline distT="0" distB="0" distL="0" distR="0" wp14:anchorId="3BFFCFD9" wp14:editId="5FD57D10">
+            <wp:extent cx="5715000" cy="3254539"/>
+            <wp:effectExtent l="0" t="0" r="0" b="0"/>
+            <wp:docPr id="8" name="Picture 8"/>
+            <wp:cNvGraphicFramePr>
+              <a:graphicFrameLocks xmlns:a="http://schemas.openxmlformats.org/drawingml/2006/main" noChangeAspect="1"/>
+            </wp:cNvGraphicFramePr>
+            <a:graphic xmlns:a="http://schemas.openxmlformats.org/drawingml/2006/main">
+              <a:graphicData uri="http://schemas.openxmlformats.org/drawingml/2006/picture">
+                <pic:pic xmlns:pic="http://schemas.openxmlformats.org/drawingml/2006/picture">
+                  <pic:nvPicPr>
+                    <pic:cNvPr id="0" name="05_particulates_by_city.png"/>
+                    <pic:cNvPicPr/>
+                  </pic:nvPicPr>
+                  <pic:blipFill>
+                    <a:blip r:embed="rId16"/>
+                    <a:stretch>
+                      <a:fillRect/>
+                    </a:stretch>
+                  </pic:blipFill>
+                  <pic:spPr>
+                    <a:xfrm>
+                      <a:off x="0" y="0"/>
+                      <a:ext cx="5715000" cy="3254539"/>
+                    </a:xfrm>
+                    <a:prstGeom prst="rect">
+                      <a:avLst/>
+                    </a:prstGeom>
+                  </pic:spPr>
+                </pic:pic>
+              </a:graphicData>
+            </a:graphic>
+          </wp:inline>
+        </w:drawing>
+      </w:r>
+    </w:p>
+    <w:p>
+      <w:pPr>
+        <w:pStyle w:val="Caption"/>
+        <w:keepNext/>
+        <w:jc w:val="center"/>
+      </w:pPr>
+      <w:r>
+        <w:t>Hình 4.2. PM2.5 và PM10 trung bình theo đô thị</w:t>
+      </w:r>
+    </w:p>
+    <w:p>
+      <w:pPr>
+        <w:pStyle w:val="BodyText"/>
+      </w:pPr>
+      <w:r>
+        <w:t>Trên cùng 52 mẫu mỗi đô thị, PM2.5 và PM10 trung bình của TP. Hồ Chí Minh là 37,03 và 37,35 µg/m³; Hà Nội là 15,36 và 16,11 µg/m³; Đà Nẵng là 14,23 và 17,28 µg/m³. Hai dãy nồng độ được trình bày chung đơn vị để đối chiếu mức bụi trong bộ dữ liệu Tuần 1.</w:t>
+      </w:r>
+    </w:p>
+    <w:p>
+      <w:pPr>
+        <w:keepNext/>
+        <w:pageBreakBefore/>
+        <w:spacing w:after="80"/>
+        <w:jc w:val="center"/>
+      </w:pPr>
+      <w:r>
+        <w:rPr>
+          <w:noProof/>
+        </w:rPr>
+        <w:lastRenderedPageBreak/>
+        <w:drawing>
+          <wp:inline distT="0" distB="0" distL="0" distR="0" wp14:anchorId="1C2BC8B9" wp14:editId="56C028FD">
+            <wp:extent cx="5715000" cy="2751295"/>
+            <wp:effectExtent l="0" t="0" r="0" b="0"/>
+            <wp:docPr id="9" name="Picture 9"/>
+            <wp:cNvGraphicFramePr>
+              <a:graphicFrameLocks xmlns:a="http://schemas.openxmlformats.org/drawingml/2006/main" noChangeAspect="1"/>
+            </wp:cNvGraphicFramePr>
+            <a:graphic xmlns:a="http://schemas.openxmlformats.org/drawingml/2006/main">
+              <a:graphicData uri="http://schemas.openxmlformats.org/drawingml/2006/picture">
+                <pic:pic xmlns:pic="http://schemas.openxmlformats.org/drawingml/2006/picture">
+                  <pic:nvPicPr>
+                    <pic:cNvPr id="0" name="06_weather_by_city.png"/>
+                    <pic:cNvPicPr/>
+                  </pic:nvPicPr>
+                  <pic:blipFill>
+                    <a:blip r:embed="rId17"/>
+                    <a:stretch>
+                      <a:fillRect/>
+                    </a:stretch>
+                  </pic:blipFill>
+                  <pic:spPr>
+                    <a:xfrm>
+                      <a:off x="0" y="0"/>
+                      <a:ext cx="5715000" cy="2751295"/>
+                    </a:xfrm>
+                    <a:prstGeom prst="rect">
+                      <a:avLst/>
+                    </a:prstGeom>
+                  </pic:spPr>
+                </pic:pic>
+              </a:graphicData>
+            </a:graphic>
+          </wp:inline>
+        </w:drawing>
+      </w:r>
+    </w:p>
+    <w:p>
+      <w:pPr>
+        <w:pStyle w:val="Caption"/>
+        <w:keepNext/>
+        <w:jc w:val="center"/>
+      </w:pPr>
+      <w:r>
+        <w:t>Hình 4.3. Các yếu tố khí tượng trung bình theo đô thị</w:t>
+      </w:r>
+    </w:p>
+    <w:p>
+      <w:pPr>
+        <w:pStyle w:val="BodyText"/>
+      </w:pPr>
+      <w:r>
+        <w:t>Nhiệt độ trung bình của TP. Hồ Chí Minh, Hà Nội và Đà Nẵng lần lượt là 27,79; 24,54; 28,85 °C. Độ ẩm tương ứng là 84,71; 76,65; 74,87%, tốc độ gió là 4,12; 12,08; 8,41 km/h. Mỗi yếu tố được vẽ trên trục riêng để giữ đúng đơn vị và tránh so sánh trực tiếp các đại lượng khác nhau.</w:t>
+      </w:r>
+    </w:p>
+    <w:p>
+      <w:pPr>
         <w:pStyle w:val="Heading2"/>
       </w:pPr>
       <w:bookmarkStart w:id="140" w:name="_Toc242299355"/>
@@ -9622,7 +9828,7 @@
       <w:bookmarkStart w:id="143" w:name="_Toc242872852"/>
       <w:bookmarkStart w:id="144" w:name="_Toc242877804"/>
       <w:bookmarkStart w:id="145" w:name="_Toc242877984"/>
-      <w:bookmarkStart w:id="146" w:name="_Toc242878412"/>
+      <w:bookmarkStart w:id="146" w:name="_Toc242892038"/>
       <w:r>
         <w:t>4.3 Biến thiên theo 24 giờ UTC</w:t>
       </w:r>
@@ -9660,7 +9866,7 @@
                     <pic:cNvPicPr/>
                   </pic:nvPicPr>
                   <pic:blipFill>
-                    <a:blip r:embed="rId16"/>
+                    <a:blip r:embed="rId18"/>
                     <a:stretch>
                       <a:fillRect/>
                     </a:stretch>
@@ -9688,7 +9894,7 @@
         <w:jc w:val="center"/>
       </w:pPr>
       <w:r>
-        <w:t>Hình 4.2. AQI, PM2.5 và PM10 trung bình theo giờ UTC từ Athena</w:t>
+        <w:t>Hình 4.4. AQI, PM2.5 và PM10 trung bình theo giờ UTC từ Athena</w:t>
       </w:r>
     </w:p>
     <w:p>
@@ -9697,7 +9903,11 @@
         <w:ind w:firstLine="504"/>
       </w:pPr>
       <w:r>
-        <w:t>Truy vấn theo hour có đủ 24 nhóm từ 00 đến 23 UTC. AQI trung bình cao nhất tại giờ 11 (103,83) và thấp nhất tại giờ 23 (75,83). PM2.5 cao nhất tại giờ 19 (25,53 µg/m³) và thấp nhất tại giờ 03 (18,03 µg/m³). Có 20 nhóm sáu mẫu và bốn nhóm chín mẫu; do cỡ mẫu không đều, đồ thị chỉ mô tả tập dữ liệu Tuần 1 và không đủ để suy ra chu kỳ ô nhiễm điển hình.</w:t>
+        <w:t xml:space="preserve">Truy vấn theo hour có đủ 24 nhóm từ 00 đến 23 UTC. AQI trung bình cao nhất tại giờ 11 (103,83) và thấp nhất tại giờ 23 (75,83). PM2.5 cao nhất tại giờ 19 (25,53 µg/m³) và thấp nhất </w:t>
+      </w:r>
+      <w:r>
+        <w:lastRenderedPageBreak/>
+        <w:t>tại giờ 03 (18,03 µg/m³). Có 20 nhóm sáu mẫu và bốn nhóm chín mẫu; do cỡ mẫu không đều, đồ thị chỉ mô tả tập dữ liệu Tuần 1 và không đủ để suy ra chu kỳ ô nhiễm điển hình.</w:t>
       </w:r>
     </w:p>
     <w:p>
@@ -10901,7 +11111,6 @@
               <w:rPr>
                 <w:sz w:val="22"/>
               </w:rPr>
-              <w:lastRenderedPageBreak/>
               <w:t>08</w:t>
             </w:r>
           </w:p>
@@ -12909,8 +13118,9 @@
       <w:bookmarkStart w:id="150" w:name="_Toc242872853"/>
       <w:bookmarkStart w:id="151" w:name="_Toc242877805"/>
       <w:bookmarkStart w:id="152" w:name="_Toc242877985"/>
-      <w:bookmarkStart w:id="153" w:name="_Toc242878413"/>
+      <w:bookmarkStart w:id="153" w:name="_Toc242892039"/>
       <w:r>
+        <w:lastRenderedPageBreak/>
         <w:t>4.4 Phân bố cấp chất lượng không khí</w:t>
       </w:r>
       <w:bookmarkEnd w:id="147"/>
@@ -12947,7 +13157,7 @@
                     <pic:cNvPicPr/>
                   </pic:nvPicPr>
                   <pic:blipFill>
-                    <a:blip r:embed="rId17"/>
+                    <a:blip r:embed="rId19"/>
                     <a:stretch>
                       <a:fillRect/>
                     </a:stretch>
@@ -12975,7 +13185,7 @@
         <w:jc w:val="center"/>
       </w:pPr>
       <w:r>
-        <w:t>Hình 4.3. Tỷ lệ cấp AQI theo thành phố từ Athena CSV</w:t>
+        <w:t>Hình 4.5. Tỷ lệ cấp AQI theo thành phố từ Athena CSV</w:t>
       </w:r>
     </w:p>
     <w:p>
@@ -12986,7 +13196,6 @@
         <w:jc w:val="center"/>
       </w:pPr>
       <w:r>
-        <w:lastRenderedPageBreak/>
         <w:t>Bảng 4.5. Số mẫu và tỷ lệ từng cấp AQI</w:t>
       </w:r>
     </w:p>
@@ -13560,8 +13769,9 @@
       <w:bookmarkStart w:id="157" w:name="_Toc242872854"/>
       <w:bookmarkStart w:id="158" w:name="_Toc242877806"/>
       <w:bookmarkStart w:id="159" w:name="_Toc242877986"/>
-      <w:bookmarkStart w:id="160" w:name="_Toc242878414"/>
+      <w:bookmarkStart w:id="160" w:name="_Toc242892040"/>
       <w:r>
+        <w:lastRenderedPageBreak/>
         <w:t>4.5 Tương quan PM2.5 với yếu tố khí tượng</w:t>
       </w:r>
       <w:bookmarkEnd w:id="154"/>
@@ -13598,7 +13808,7 @@
                     <pic:cNvPicPr/>
                   </pic:nvPicPr>
                   <pic:blipFill>
-                    <a:blip r:embed="rId18"/>
+                    <a:blip r:embed="rId20"/>
                     <a:stretch>
                       <a:fillRect/>
                     </a:stretch>
@@ -13626,7 +13836,7 @@
         <w:jc w:val="center"/>
       </w:pPr>
       <w:r>
-        <w:t>Hình 4.4. Hệ số tương quan Pearson theo thành phố từ Athena CSV</w:t>
+        <w:t>Hình 4.6. Hệ số tương quan Pearson theo thành phố từ Athena CSV</w:t>
       </w:r>
     </w:p>
     <w:p>
@@ -14100,6 +14310,73 @@
     </w:p>
     <w:p>
       <w:pPr>
+        <w:keepNext/>
+        <w:pageBreakBefore/>
+        <w:spacing w:after="80"/>
+        <w:jc w:val="center"/>
+      </w:pPr>
+      <w:r>
+        <w:rPr>
+          <w:noProof/>
+        </w:rPr>
+        <w:lastRenderedPageBreak/>
+        <w:drawing>
+          <wp:inline distT="0" distB="0" distL="0" distR="0" wp14:anchorId="24F14C33" wp14:editId="580515A5">
+            <wp:extent cx="5715000" cy="2805400"/>
+            <wp:effectExtent l="0" t="0" r="0" b="0"/>
+            <wp:docPr id="10" name="Picture 10"/>
+            <wp:cNvGraphicFramePr>
+              <a:graphicFrameLocks xmlns:a="http://schemas.openxmlformats.org/drawingml/2006/main" noChangeAspect="1"/>
+            </wp:cNvGraphicFramePr>
+            <a:graphic xmlns:a="http://schemas.openxmlformats.org/drawingml/2006/main">
+              <a:graphicData uri="http://schemas.openxmlformats.org/drawingml/2006/picture">
+                <pic:pic xmlns:pic="http://schemas.openxmlformats.org/drawingml/2006/picture">
+                  <pic:nvPicPr>
+                    <pic:cNvPr id="0" name="08_temperature_pm25_scatter.png"/>
+                    <pic:cNvPicPr/>
+                  </pic:nvPicPr>
+                  <pic:blipFill>
+                    <a:blip r:embed="rId21"/>
+                    <a:stretch>
+                      <a:fillRect/>
+                    </a:stretch>
+                  </pic:blipFill>
+                  <pic:spPr>
+                    <a:xfrm>
+                      <a:off x="0" y="0"/>
+                      <a:ext cx="5715000" cy="2805400"/>
+                    </a:xfrm>
+                    <a:prstGeom prst="rect">
+                      <a:avLst/>
+                    </a:prstGeom>
+                  </pic:spPr>
+                </pic:pic>
+              </a:graphicData>
+            </a:graphic>
+          </wp:inline>
+        </w:drawing>
+      </w:r>
+    </w:p>
+    <w:p>
+      <w:pPr>
+        <w:pStyle w:val="Caption"/>
+        <w:keepNext/>
+        <w:jc w:val="center"/>
+      </w:pPr>
+      <w:r>
+        <w:t>Hình 4.7. Nhiệt độ và PM2.5 trên các bản ghi Tuần 1</w:t>
+      </w:r>
+    </w:p>
+    <w:p>
+      <w:pPr>
+        <w:pStyle w:val="BodyText"/>
+      </w:pPr>
+      <w:r>
+        <w:t>Hình sử dụng đủ 52 cặp nhiệt độ và PM2.5 của từng đô thị. Tại TP. Hồ Chí Minh, Pearson r = −0,6977; Hà Nội r = 0,6462; Đà Nẵng r = 0,4798. Các điểm thể hiện độ phân tán của quan trắc và giúp đọc hệ số tương quan cùng dữ liệu gốc; đây là liên hệ trong tập mẫu, không xác lập quan hệ nhân quả.</w:t>
+      </w:r>
+    </w:p>
+    <w:p>
+      <w:pPr>
         <w:pStyle w:val="Heading2"/>
         <w:pageBreakBefore/>
       </w:pPr>
@@ -14109,7 +14386,7 @@
       <w:bookmarkStart w:id="164" w:name="_Toc242872855"/>
       <w:bookmarkStart w:id="165" w:name="_Toc242877807"/>
       <w:bookmarkStart w:id="166" w:name="_Toc242877987"/>
-      <w:bookmarkStart w:id="167" w:name="_Toc242878415"/>
+      <w:bookmarkStart w:id="167" w:name="_Toc242892041"/>
       <w:r>
         <w:lastRenderedPageBreak/>
         <w:t>4.6 Thời gian và dung lượng quét của năm truy vấn</w:t>
@@ -14955,50 +15232,194 @@
     </w:p>
     <w:p>
       <w:pPr>
+        <w:keepNext/>
+        <w:pageBreakBefore/>
+        <w:spacing w:after="80"/>
+        <w:jc w:val="center"/>
+      </w:pPr>
+      <w:r>
+        <w:rPr>
+          <w:noProof/>
+        </w:rPr>
+        <w:lastRenderedPageBreak/>
+        <w:drawing>
+          <wp:inline distT="0" distB="0" distL="0" distR="0" wp14:anchorId="561C41F7" wp14:editId="151B9792">
+            <wp:extent cx="5715000" cy="2805400"/>
+            <wp:effectExtent l="0" t="0" r="0" b="0"/>
+            <wp:docPr id="11" name="Picture 11"/>
+            <wp:cNvGraphicFramePr>
+              <a:graphicFrameLocks xmlns:a="http://schemas.openxmlformats.org/drawingml/2006/main" noChangeAspect="1"/>
+            </wp:cNvGraphicFramePr>
+            <a:graphic xmlns:a="http://schemas.openxmlformats.org/drawingml/2006/main">
+              <a:graphicData uri="http://schemas.openxmlformats.org/drawingml/2006/picture">
+                <pic:pic xmlns:pic="http://schemas.openxmlformats.org/drawingml/2006/picture">
+                  <pic:nvPicPr>
+                    <pic:cNvPr id="0" name="09_query_performance.png"/>
+                    <pic:cNvPicPr/>
+                  </pic:nvPicPr>
+                  <pic:blipFill>
+                    <a:blip r:embed="rId22"/>
+                    <a:stretch>
+                      <a:fillRect/>
+                    </a:stretch>
+                  </pic:blipFill>
+                  <pic:spPr>
+                    <a:xfrm>
+                      <a:off x="0" y="0"/>
+                      <a:ext cx="5715000" cy="2805400"/>
+                    </a:xfrm>
+                    <a:prstGeom prst="rect">
+                      <a:avLst/>
+                    </a:prstGeom>
+                  </pic:spPr>
+                </pic:pic>
+              </a:graphicData>
+            </a:graphic>
+          </wp:inline>
+        </w:drawing>
+      </w:r>
+    </w:p>
+    <w:p>
+      <w:pPr>
+        <w:pStyle w:val="Caption"/>
+        <w:keepNext/>
+        <w:jc w:val="center"/>
+      </w:pPr>
+      <w:r>
+        <w:t>Hình 4.8. Thời gian và dung lượng quét của năm truy vấn Athena</w:t>
+      </w:r>
+    </w:p>
+    <w:p>
+      <w:pPr>
+        <w:pStyle w:val="BodyText"/>
+      </w:pPr>
+      <w:r>
+        <w:t>Năm lượt truy vấn có thời gian thực thi từ 744 đến 1.192 ms, chênh 448 ms. Mỗi lượt quét đúng 87.250 byte dù số dòng kết quả khác nhau. Hình tách thời gian và dung lượng quét thành hai khung; cùng dung lượng quét cho thấy các truy vấn đọc cùng phạm vi dữ liệu trong lượt xuất này.</w:t>
+      </w:r>
+    </w:p>
+    <w:p>
+      <w:pPr>
+        <w:pStyle w:val="Heading2"/>
+        <w:pageBreakBefore/>
+      </w:pPr>
+      <w:bookmarkStart w:id="168" w:name="_Toc242892042"/>
+      <w:r>
+        <w:lastRenderedPageBreak/>
+        <w:t>4.7 Phân bố và độ phân tán của AQI và PM2.5</w:t>
+      </w:r>
+      <w:bookmarkEnd w:id="168"/>
+    </w:p>
+    <w:p>
+      <w:pPr>
+        <w:keepNext/>
+        <w:spacing w:after="80"/>
+        <w:jc w:val="center"/>
+      </w:pPr>
+      <w:r>
+        <w:rPr>
+          <w:noProof/>
+        </w:rPr>
+        <w:drawing>
+          <wp:inline distT="0" distB="0" distL="0" distR="0" wp14:anchorId="5E9272A9" wp14:editId="3345A732">
+            <wp:extent cx="5715000" cy="3095802"/>
+            <wp:effectExtent l="0" t="0" r="0" b="0"/>
+            <wp:docPr id="12" name="Picture 12"/>
+            <wp:cNvGraphicFramePr>
+              <a:graphicFrameLocks xmlns:a="http://schemas.openxmlformats.org/drawingml/2006/main" noChangeAspect="1"/>
+            </wp:cNvGraphicFramePr>
+            <a:graphic xmlns:a="http://schemas.openxmlformats.org/drawingml/2006/main">
+              <a:graphicData uri="http://schemas.openxmlformats.org/drawingml/2006/picture">
+                <pic:pic xmlns:pic="http://schemas.openxmlformats.org/drawingml/2006/picture">
+                  <pic:nvPicPr>
+                    <pic:cNvPr id="0" name="07_aqi_pm25_distribution.png"/>
+                    <pic:cNvPicPr/>
+                  </pic:nvPicPr>
+                  <pic:blipFill>
+                    <a:blip r:embed="rId23"/>
+                    <a:stretch>
+                      <a:fillRect/>
+                    </a:stretch>
+                  </pic:blipFill>
+                  <pic:spPr>
+                    <a:xfrm>
+                      <a:off x="0" y="0"/>
+                      <a:ext cx="5715000" cy="3095802"/>
+                    </a:xfrm>
+                    <a:prstGeom prst="rect">
+                      <a:avLst/>
+                    </a:prstGeom>
+                  </pic:spPr>
+                </pic:pic>
+              </a:graphicData>
+            </a:graphic>
+          </wp:inline>
+        </w:drawing>
+      </w:r>
+    </w:p>
+    <w:p>
+      <w:pPr>
+        <w:pStyle w:val="Caption"/>
+        <w:keepNext/>
+        <w:jc w:val="center"/>
+      </w:pPr>
+      <w:r>
+        <w:t>Hình 4.9. Trung vị và khoảng tứ phân vị của AQI và PM2.5</w:t>
+      </w:r>
+    </w:p>
+    <w:p>
+      <w:pPr>
+        <w:pStyle w:val="BodyText"/>
+      </w:pPr>
+      <w:r>
+        <w:t>Các hộp được dựng từ 52 giá trị của mỗi đô thị. AQI trung vị của TP. Hồ Chí Minh, Hà Nội và Đà Nẵng lần lượt là 102,00; 65,50; 69,00; độ lệch chuẩn mẫu là 17,85; 9,95; 28,85. PM2.5 trung vị tương ứng là 36,50; 12,85; 8,80 µg/m³. Hộp biểu diễn khoảng Q1–Q3 và đường trung vị; râu theo quy tắc 1,5 lần IQR. Các điểm ngoài râu vẫn được giữ trong tính toán, không bị loại khỏi bộ dữ liệu.</w:t>
+      </w:r>
+    </w:p>
+    <w:p>
+      <w:pPr>
         <w:pStyle w:val="Heading1"/>
         <w:pageBreakBefore/>
         <w:jc w:val="left"/>
       </w:pPr>
-      <w:bookmarkStart w:id="168" w:name="_Toc242299359"/>
-      <w:bookmarkStart w:id="169" w:name="_Toc242827627"/>
-      <w:bookmarkStart w:id="170" w:name="_Toc242871480"/>
-      <w:bookmarkStart w:id="171" w:name="_Toc242872856"/>
-      <w:bookmarkStart w:id="172" w:name="_Toc242877808"/>
-      <w:bookmarkStart w:id="173" w:name="_Toc242877988"/>
-      <w:bookmarkStart w:id="174" w:name="_Toc242878416"/>
+      <w:bookmarkStart w:id="169" w:name="_Toc242299359"/>
+      <w:bookmarkStart w:id="170" w:name="_Toc242827627"/>
+      <w:bookmarkStart w:id="171" w:name="_Toc242871480"/>
+      <w:bookmarkStart w:id="172" w:name="_Toc242872856"/>
+      <w:bookmarkStart w:id="173" w:name="_Toc242877808"/>
+      <w:bookmarkStart w:id="174" w:name="_Toc242877988"/>
+      <w:bookmarkStart w:id="175" w:name="_Toc242892043"/>
       <w:r>
         <w:lastRenderedPageBreak/>
         <w:t>Chương 5 Tổng hợp kết quả và chi phí Tuần 1</w:t>
       </w:r>
-      <w:bookmarkEnd w:id="168"/>
       <w:bookmarkEnd w:id="169"/>
       <w:bookmarkEnd w:id="170"/>
       <w:bookmarkEnd w:id="171"/>
       <w:bookmarkEnd w:id="172"/>
       <w:bookmarkEnd w:id="173"/>
       <w:bookmarkEnd w:id="174"/>
+      <w:bookmarkEnd w:id="175"/>
     </w:p>
     <w:p>
       <w:pPr>
         <w:pStyle w:val="Heading2"/>
       </w:pPr>
-      <w:bookmarkStart w:id="175" w:name="_Toc242299360"/>
-      <w:bookmarkStart w:id="176" w:name="_Toc242827628"/>
-      <w:bookmarkStart w:id="177" w:name="_Toc242871481"/>
-      <w:bookmarkStart w:id="178" w:name="_Toc242872857"/>
-      <w:bookmarkStart w:id="179" w:name="_Toc242877809"/>
-      <w:bookmarkStart w:id="180" w:name="_Toc242877989"/>
-      <w:bookmarkStart w:id="181" w:name="_Toc242878417"/>
+      <w:bookmarkStart w:id="176" w:name="_Toc242299360"/>
+      <w:bookmarkStart w:id="177" w:name="_Toc242827628"/>
+      <w:bookmarkStart w:id="178" w:name="_Toc242871481"/>
+      <w:bookmarkStart w:id="179" w:name="_Toc242872857"/>
+      <w:bookmarkStart w:id="180" w:name="_Toc242877809"/>
+      <w:bookmarkStart w:id="181" w:name="_Toc242877989"/>
+      <w:bookmarkStart w:id="182" w:name="_Toc242892044"/>
       <w:r>
         <w:t>5.1 Mức độ hoàn thành theo sản phẩm</w:t>
       </w:r>
-      <w:bookmarkEnd w:id="175"/>
       <w:bookmarkEnd w:id="176"/>
       <w:bookmarkEnd w:id="177"/>
       <w:bookmarkEnd w:id="178"/>
       <w:bookmarkEnd w:id="179"/>
       <w:bookmarkEnd w:id="180"/>
       <w:bookmarkEnd w:id="181"/>
+      <w:bookmarkEnd w:id="182"/>
     </w:p>
     <w:p>
       <w:pPr>
@@ -15013,23 +15434,23 @@
       <w:pPr>
         <w:pStyle w:val="Heading2"/>
       </w:pPr>
-      <w:bookmarkStart w:id="182" w:name="_Toc242299361"/>
-      <w:bookmarkStart w:id="183" w:name="_Toc242827629"/>
-      <w:bookmarkStart w:id="184" w:name="_Toc242871482"/>
-      <w:bookmarkStart w:id="185" w:name="_Toc242872858"/>
-      <w:bookmarkStart w:id="186" w:name="_Toc242877810"/>
-      <w:bookmarkStart w:id="187" w:name="_Toc242877990"/>
-      <w:bookmarkStart w:id="188" w:name="_Toc242878418"/>
+      <w:bookmarkStart w:id="183" w:name="_Toc242299361"/>
+      <w:bookmarkStart w:id="184" w:name="_Toc242827629"/>
+      <w:bookmarkStart w:id="185" w:name="_Toc242871482"/>
+      <w:bookmarkStart w:id="186" w:name="_Toc242872858"/>
+      <w:bookmarkStart w:id="187" w:name="_Toc242877810"/>
+      <w:bookmarkStart w:id="188" w:name="_Toc242877990"/>
+      <w:bookmarkStart w:id="189" w:name="_Toc242892045"/>
       <w:r>
         <w:t>5.2 Quản lý chi phí</w:t>
       </w:r>
-      <w:bookmarkEnd w:id="182"/>
       <w:bookmarkEnd w:id="183"/>
       <w:bookmarkEnd w:id="184"/>
       <w:bookmarkEnd w:id="185"/>
       <w:bookmarkEnd w:id="186"/>
       <w:bookmarkEnd w:id="187"/>
       <w:bookmarkEnd w:id="188"/>
+      <w:bookmarkEnd w:id="189"/>
     </w:p>
     <w:p>
       <w:pPr>
@@ -15561,23 +15982,23 @@
       <w:pPr>
         <w:pStyle w:val="Heading2"/>
       </w:pPr>
-      <w:bookmarkStart w:id="189" w:name="_Toc242299362"/>
-      <w:bookmarkStart w:id="190" w:name="_Toc242827630"/>
-      <w:bookmarkStart w:id="191" w:name="_Toc242871483"/>
-      <w:bookmarkStart w:id="192" w:name="_Toc242872859"/>
-      <w:bookmarkStart w:id="193" w:name="_Toc242877811"/>
-      <w:bookmarkStart w:id="194" w:name="_Toc242877991"/>
-      <w:bookmarkStart w:id="195" w:name="_Toc242878419"/>
+      <w:bookmarkStart w:id="190" w:name="_Toc242299362"/>
+      <w:bookmarkStart w:id="191" w:name="_Toc242827630"/>
+      <w:bookmarkStart w:id="192" w:name="_Toc242871483"/>
+      <w:bookmarkStart w:id="193" w:name="_Toc242872859"/>
+      <w:bookmarkStart w:id="194" w:name="_Toc242877811"/>
+      <w:bookmarkStart w:id="195" w:name="_Toc242877991"/>
+      <w:bookmarkStart w:id="196" w:name="_Toc242892046"/>
       <w:r>
         <w:t>5.3 Kết luận</w:t>
       </w:r>
-      <w:bookmarkEnd w:id="189"/>
       <w:bookmarkEnd w:id="190"/>
       <w:bookmarkEnd w:id="191"/>
       <w:bookmarkEnd w:id="192"/>
       <w:bookmarkEnd w:id="193"/>
       <w:bookmarkEnd w:id="194"/>
       <w:bookmarkEnd w:id="195"/>
+      <w:bookmarkEnd w:id="196"/>
     </w:p>
     <w:p>
       <w:pPr>
@@ -15585,7 +16006,7 @@
         <w:ind w:firstLine="504"/>
       </w:pPr>
       <w:r>
-        <w:t>Trong Tuần 1, bộ kết quả Athena dùng trong báo cáo gồm 156 bản ghi gốc, năm truy vấn thành công và bốn biểu đồ từ CSV. Chúng em đã xây dựng kiến trúc, cấu hình các dịch vụ nền tảng và phân tích số liệu của ba đô thị. Phân công của chúng em được trình bày tại Bảng 2.1; các kết quả được đánh giá trong phạm vi bộ dữ liệu đã lưu.</w:t>
+        <w:t>Trong Tuần 1, bộ kết quả Athena dùng trong báo cáo gồm 156 bản ghi gốc, năm truy vấn thành công và chín biểu đồ từ CSV. Chúng em đã xây dựng kiến trúc, cấu hình các dịch vụ nền tảng và phân tích số liệu của ba đô thị. Phân công của chúng em được trình bày tại Bảng 2.1; các kết quả được đánh giá trong phạm vi bộ dữ liệu đã lưu.</w:t>
       </w:r>
     </w:p>
     <w:sectPr>

</xml_diff>

<commit_message>
docs(reports): audit weekly report wording and worklog
</commit_message>
<xml_diff>
--- a/tuan_1/docs/Bao_cao_tuan_1_Dien_toan_dam_may_24110054_24110051.docx
+++ b/tuan_1/docs/Bao_cao_tuan_1_Dien_toan_dam_may_24110054_24110051.docx
@@ -448,7 +448,7 @@
         <w:ind w:firstLine="504"/>
       </w:pPr>
       <w:r>
-        <w:t xml:space="preserve">Toàn bộ mã nguồn triển khai, cấu hình dịch vụ AWS và tài liệu kỹ thuật của đề tài được công khai và quản lý tại kho mã nguồn GitHub: </w:t>
+        <w:t xml:space="preserve">Mã nguồn và tài liệu kỹ thuật của đề tài được quản lý tại kho GitHub: </w:t>
       </w:r>
       <w:hyperlink r:id="rId12">
         <w:r>
@@ -534,7 +534,7 @@
         </w:rPr>
         <w:fldChar w:fldCharType="separate"/>
       </w:r>
-      <w:hyperlink w:anchor="_Toc242892018" w:history="1">
+      <w:hyperlink w:anchor="_Toc242962877" w:history="1">
         <w:r>
           <w:rPr>
             <w:rStyle w:val="Hyperlink"/>
@@ -561,7 +561,7 @@
             <w:noProof/>
             <w:webHidden/>
           </w:rPr>
-          <w:instrText xml:space="preserve"> PAGEREF _Toc242892018 \h </w:instrText>
+          <w:instrText xml:space="preserve"> PAGEREF _Toc242962877 \h </w:instrText>
         </w:r>
         <w:r>
           <w:rPr>
@@ -608,7 +608,7 @@
           <w14:ligatures w14:val="standardContextual"/>
         </w:rPr>
       </w:pPr>
-      <w:hyperlink w:anchor="_Toc242892019" w:history="1">
+      <w:hyperlink w:anchor="_Toc242962878" w:history="1">
         <w:r>
           <w:rPr>
             <w:rStyle w:val="Hyperlink"/>
@@ -635,7 +635,7 @@
             <w:noProof/>
             <w:webHidden/>
           </w:rPr>
-          <w:instrText xml:space="preserve"> PAGEREF _Toc242892019 \h </w:instrText>
+          <w:instrText xml:space="preserve"> PAGEREF _Toc242962878 \h </w:instrText>
         </w:r>
         <w:r>
           <w:rPr>
@@ -682,7 +682,7 @@
           <w14:ligatures w14:val="standardContextual"/>
         </w:rPr>
       </w:pPr>
-      <w:hyperlink w:anchor="_Toc242892020" w:history="1">
+      <w:hyperlink w:anchor="_Toc242962879" w:history="1">
         <w:r>
           <w:rPr>
             <w:rStyle w:val="Hyperlink"/>
@@ -709,7 +709,7 @@
             <w:noProof/>
             <w:webHidden/>
           </w:rPr>
-          <w:instrText xml:space="preserve"> PAGEREF _Toc242892020 \h </w:instrText>
+          <w:instrText xml:space="preserve"> PAGEREF _Toc242962879 \h </w:instrText>
         </w:r>
         <w:r>
           <w:rPr>
@@ -756,7 +756,7 @@
           <w14:ligatures w14:val="standardContextual"/>
         </w:rPr>
       </w:pPr>
-      <w:hyperlink w:anchor="_Toc242892021" w:history="1">
+      <w:hyperlink w:anchor="_Toc242962880" w:history="1">
         <w:r>
           <w:rPr>
             <w:rStyle w:val="Hyperlink"/>
@@ -783,7 +783,7 @@
             <w:noProof/>
             <w:webHidden/>
           </w:rPr>
-          <w:instrText xml:space="preserve"> PAGEREF _Toc242892021 \h </w:instrText>
+          <w:instrText xml:space="preserve"> PAGEREF _Toc242962880 \h </w:instrText>
         </w:r>
         <w:r>
           <w:rPr>
@@ -830,7 +830,7 @@
           <w14:ligatures w14:val="standardContextual"/>
         </w:rPr>
       </w:pPr>
-      <w:hyperlink w:anchor="_Toc242892022" w:history="1">
+      <w:hyperlink w:anchor="_Toc242962881" w:history="1">
         <w:r>
           <w:rPr>
             <w:rStyle w:val="Hyperlink"/>
@@ -857,7 +857,7 @@
             <w:noProof/>
             <w:webHidden/>
           </w:rPr>
-          <w:instrText xml:space="preserve"> PAGEREF _Toc242892022 \h </w:instrText>
+          <w:instrText xml:space="preserve"> PAGEREF _Toc242962881 \h </w:instrText>
         </w:r>
         <w:r>
           <w:rPr>
@@ -905,7 +905,7 @@
           <w14:ligatures w14:val="standardContextual"/>
         </w:rPr>
       </w:pPr>
-      <w:hyperlink w:anchor="_Toc242892023" w:history="1">
+      <w:hyperlink w:anchor="_Toc242962882" w:history="1">
         <w:r>
           <w:rPr>
             <w:rStyle w:val="Hyperlink"/>
@@ -932,7 +932,7 @@
             <w:noProof/>
             <w:webHidden/>
           </w:rPr>
-          <w:instrText xml:space="preserve"> PAGEREF _Toc242892023 \h </w:instrText>
+          <w:instrText xml:space="preserve"> PAGEREF _Toc242962882 \h </w:instrText>
         </w:r>
         <w:r>
           <w:rPr>
@@ -979,7 +979,7 @@
           <w14:ligatures w14:val="standardContextual"/>
         </w:rPr>
       </w:pPr>
-      <w:hyperlink w:anchor="_Toc242892024" w:history="1">
+      <w:hyperlink w:anchor="_Toc242962883" w:history="1">
         <w:r>
           <w:rPr>
             <w:rStyle w:val="Hyperlink"/>
@@ -1006,7 +1006,7 @@
             <w:noProof/>
             <w:webHidden/>
           </w:rPr>
-          <w:instrText xml:space="preserve"> PAGEREF _Toc242892024 \h </w:instrText>
+          <w:instrText xml:space="preserve"> PAGEREF _Toc242962883 \h </w:instrText>
         </w:r>
         <w:r>
           <w:rPr>
@@ -1053,7 +1053,7 @@
           <w14:ligatures w14:val="standardContextual"/>
         </w:rPr>
       </w:pPr>
-      <w:hyperlink w:anchor="_Toc242892025" w:history="1">
+      <w:hyperlink w:anchor="_Toc242962884" w:history="1">
         <w:r>
           <w:rPr>
             <w:rStyle w:val="Hyperlink"/>
@@ -1080,7 +1080,7 @@
             <w:noProof/>
             <w:webHidden/>
           </w:rPr>
-          <w:instrText xml:space="preserve"> PAGEREF _Toc242892025 \h </w:instrText>
+          <w:instrText xml:space="preserve"> PAGEREF _Toc242962884 \h </w:instrText>
         </w:r>
         <w:r>
           <w:rPr>
@@ -1127,7 +1127,7 @@
           <w14:ligatures w14:val="standardContextual"/>
         </w:rPr>
       </w:pPr>
-      <w:hyperlink w:anchor="_Toc242892026" w:history="1">
+      <w:hyperlink w:anchor="_Toc242962885" w:history="1">
         <w:r>
           <w:rPr>
             <w:rStyle w:val="Hyperlink"/>
@@ -1154,7 +1154,7 @@
             <w:noProof/>
             <w:webHidden/>
           </w:rPr>
-          <w:instrText xml:space="preserve"> PAGEREF _Toc242892026 \h </w:instrText>
+          <w:instrText xml:space="preserve"> PAGEREF _Toc242962885 \h </w:instrText>
         </w:r>
         <w:r>
           <w:rPr>
@@ -1202,7 +1202,7 @@
           <w14:ligatures w14:val="standardContextual"/>
         </w:rPr>
       </w:pPr>
-      <w:hyperlink w:anchor="_Toc242892027" w:history="1">
+      <w:hyperlink w:anchor="_Toc242962886" w:history="1">
         <w:r>
           <w:rPr>
             <w:rStyle w:val="Hyperlink"/>
@@ -1229,7 +1229,7 @@
             <w:noProof/>
             <w:webHidden/>
           </w:rPr>
-          <w:instrText xml:space="preserve"> PAGEREF _Toc242892027 \h </w:instrText>
+          <w:instrText xml:space="preserve"> PAGEREF _Toc242962886 \h </w:instrText>
         </w:r>
         <w:r>
           <w:rPr>
@@ -1276,7 +1276,7 @@
           <w14:ligatures w14:val="standardContextual"/>
         </w:rPr>
       </w:pPr>
-      <w:hyperlink w:anchor="_Toc242892028" w:history="1">
+      <w:hyperlink w:anchor="_Toc242962887" w:history="1">
         <w:r>
           <w:rPr>
             <w:rStyle w:val="Hyperlink"/>
@@ -1303,7 +1303,7 @@
             <w:noProof/>
             <w:webHidden/>
           </w:rPr>
-          <w:instrText xml:space="preserve"> PAGEREF _Toc242892028 \h </w:instrText>
+          <w:instrText xml:space="preserve"> PAGEREF _Toc242962887 \h </w:instrText>
         </w:r>
         <w:r>
           <w:rPr>
@@ -1350,7 +1350,7 @@
           <w14:ligatures w14:val="standardContextual"/>
         </w:rPr>
       </w:pPr>
-      <w:hyperlink w:anchor="_Toc242892029" w:history="1">
+      <w:hyperlink w:anchor="_Toc242962888" w:history="1">
         <w:r>
           <w:rPr>
             <w:rStyle w:val="Hyperlink"/>
@@ -1377,7 +1377,7 @@
             <w:noProof/>
             <w:webHidden/>
           </w:rPr>
-          <w:instrText xml:space="preserve"> PAGEREF _Toc242892029 \h </w:instrText>
+          <w:instrText xml:space="preserve"> PAGEREF _Toc242962888 \h </w:instrText>
         </w:r>
         <w:r>
           <w:rPr>
@@ -1424,7 +1424,7 @@
           <w14:ligatures w14:val="standardContextual"/>
         </w:rPr>
       </w:pPr>
-      <w:hyperlink w:anchor="_Toc242892030" w:history="1">
+      <w:hyperlink w:anchor="_Toc242962889" w:history="1">
         <w:r>
           <w:rPr>
             <w:rStyle w:val="Hyperlink"/>
@@ -1451,7 +1451,7 @@
             <w:noProof/>
             <w:webHidden/>
           </w:rPr>
-          <w:instrText xml:space="preserve"> PAGEREF _Toc242892030 \h </w:instrText>
+          <w:instrText xml:space="preserve"> PAGEREF _Toc242962889 \h </w:instrText>
         </w:r>
         <w:r>
           <w:rPr>
@@ -1498,7 +1498,7 @@
           <w14:ligatures w14:val="standardContextual"/>
         </w:rPr>
       </w:pPr>
-      <w:hyperlink w:anchor="_Toc242892031" w:history="1">
+      <w:hyperlink w:anchor="_Toc242962890" w:history="1">
         <w:r>
           <w:rPr>
             <w:rStyle w:val="Hyperlink"/>
@@ -1525,7 +1525,7 @@
             <w:noProof/>
             <w:webHidden/>
           </w:rPr>
-          <w:instrText xml:space="preserve"> PAGEREF _Toc242892031 \h </w:instrText>
+          <w:instrText xml:space="preserve"> PAGEREF _Toc242962890 \h </w:instrText>
         </w:r>
         <w:r>
           <w:rPr>
@@ -1572,7 +1572,7 @@
           <w14:ligatures w14:val="standardContextual"/>
         </w:rPr>
       </w:pPr>
-      <w:hyperlink w:anchor="_Toc242892032" w:history="1">
+      <w:hyperlink w:anchor="_Toc242962891" w:history="1">
         <w:r>
           <w:rPr>
             <w:rStyle w:val="Hyperlink"/>
@@ -1599,7 +1599,7 @@
             <w:noProof/>
             <w:webHidden/>
           </w:rPr>
-          <w:instrText xml:space="preserve"> PAGEREF _Toc242892032 \h </w:instrText>
+          <w:instrText xml:space="preserve"> PAGEREF _Toc242962891 \h </w:instrText>
         </w:r>
         <w:r>
           <w:rPr>
@@ -1646,7 +1646,7 @@
           <w14:ligatures w14:val="standardContextual"/>
         </w:rPr>
       </w:pPr>
-      <w:hyperlink w:anchor="_Toc242892033" w:history="1">
+      <w:hyperlink w:anchor="_Toc242962892" w:history="1">
         <w:r>
           <w:rPr>
             <w:rStyle w:val="Hyperlink"/>
@@ -1673,7 +1673,7 @@
             <w:noProof/>
             <w:webHidden/>
           </w:rPr>
-          <w:instrText xml:space="preserve"> PAGEREF _Toc242892033 \h </w:instrText>
+          <w:instrText xml:space="preserve"> PAGEREF _Toc242962892 \h </w:instrText>
         </w:r>
         <w:r>
           <w:rPr>
@@ -1720,7 +1720,7 @@
           <w14:ligatures w14:val="standardContextual"/>
         </w:rPr>
       </w:pPr>
-      <w:hyperlink w:anchor="_Toc242892034" w:history="1">
+      <w:hyperlink w:anchor="_Toc242962893" w:history="1">
         <w:r>
           <w:rPr>
             <w:rStyle w:val="Hyperlink"/>
@@ -1747,7 +1747,7 @@
             <w:noProof/>
             <w:webHidden/>
           </w:rPr>
-          <w:instrText xml:space="preserve"> PAGEREF _Toc242892034 \h </w:instrText>
+          <w:instrText xml:space="preserve"> PAGEREF _Toc242962893 \h </w:instrText>
         </w:r>
         <w:r>
           <w:rPr>
@@ -1795,7 +1795,7 @@
           <w14:ligatures w14:val="standardContextual"/>
         </w:rPr>
       </w:pPr>
-      <w:hyperlink w:anchor="_Toc242892035" w:history="1">
+      <w:hyperlink w:anchor="_Toc242962894" w:history="1">
         <w:r>
           <w:rPr>
             <w:rStyle w:val="Hyperlink"/>
@@ -1822,7 +1822,7 @@
             <w:noProof/>
             <w:webHidden/>
           </w:rPr>
-          <w:instrText xml:space="preserve"> PAGEREF _Toc242892035 \h </w:instrText>
+          <w:instrText xml:space="preserve"> PAGEREF _Toc242962894 \h </w:instrText>
         </w:r>
         <w:r>
           <w:rPr>
@@ -1869,7 +1869,7 @@
           <w14:ligatures w14:val="standardContextual"/>
         </w:rPr>
       </w:pPr>
-      <w:hyperlink w:anchor="_Toc242892036" w:history="1">
+      <w:hyperlink w:anchor="_Toc242962895" w:history="1">
         <w:r>
           <w:rPr>
             <w:rStyle w:val="Hyperlink"/>
@@ -1896,7 +1896,7 @@
             <w:noProof/>
             <w:webHidden/>
           </w:rPr>
-          <w:instrText xml:space="preserve"> PAGEREF _Toc242892036 \h </w:instrText>
+          <w:instrText xml:space="preserve"> PAGEREF _Toc242962895 \h </w:instrText>
         </w:r>
         <w:r>
           <w:rPr>
@@ -1943,7 +1943,7 @@
           <w14:ligatures w14:val="standardContextual"/>
         </w:rPr>
       </w:pPr>
-      <w:hyperlink w:anchor="_Toc242892037" w:history="1">
+      <w:hyperlink w:anchor="_Toc242962896" w:history="1">
         <w:r>
           <w:rPr>
             <w:rStyle w:val="Hyperlink"/>
@@ -1970,7 +1970,7 @@
             <w:noProof/>
             <w:webHidden/>
           </w:rPr>
-          <w:instrText xml:space="preserve"> PAGEREF _Toc242892037 \h </w:instrText>
+          <w:instrText xml:space="preserve"> PAGEREF _Toc242962896 \h </w:instrText>
         </w:r>
         <w:r>
           <w:rPr>
@@ -2017,7 +2017,7 @@
           <w14:ligatures w14:val="standardContextual"/>
         </w:rPr>
       </w:pPr>
-      <w:hyperlink w:anchor="_Toc242892038" w:history="1">
+      <w:hyperlink w:anchor="_Toc242962897" w:history="1">
         <w:r>
           <w:rPr>
             <w:rStyle w:val="Hyperlink"/>
@@ -2044,7 +2044,7 @@
             <w:noProof/>
             <w:webHidden/>
           </w:rPr>
-          <w:instrText xml:space="preserve"> PAGEREF _Toc242892038 \h </w:instrText>
+          <w:instrText xml:space="preserve"> PAGEREF _Toc242962897 \h </w:instrText>
         </w:r>
         <w:r>
           <w:rPr>
@@ -2091,7 +2091,7 @@
           <w14:ligatures w14:val="standardContextual"/>
         </w:rPr>
       </w:pPr>
-      <w:hyperlink w:anchor="_Toc242892039" w:history="1">
+      <w:hyperlink w:anchor="_Toc242962898" w:history="1">
         <w:r>
           <w:rPr>
             <w:rStyle w:val="Hyperlink"/>
@@ -2118,7 +2118,7 @@
             <w:noProof/>
             <w:webHidden/>
           </w:rPr>
-          <w:instrText xml:space="preserve"> PAGEREF _Toc242892039 \h </w:instrText>
+          <w:instrText xml:space="preserve"> PAGEREF _Toc242962898 \h </w:instrText>
         </w:r>
         <w:r>
           <w:rPr>
@@ -2165,7 +2165,7 @@
           <w14:ligatures w14:val="standardContextual"/>
         </w:rPr>
       </w:pPr>
-      <w:hyperlink w:anchor="_Toc242892040" w:history="1">
+      <w:hyperlink w:anchor="_Toc242962899" w:history="1">
         <w:r>
           <w:rPr>
             <w:rStyle w:val="Hyperlink"/>
@@ -2192,7 +2192,7 @@
             <w:noProof/>
             <w:webHidden/>
           </w:rPr>
-          <w:instrText xml:space="preserve"> PAGEREF _Toc242892040 \h </w:instrText>
+          <w:instrText xml:space="preserve"> PAGEREF _Toc242962899 \h </w:instrText>
         </w:r>
         <w:r>
           <w:rPr>
@@ -2239,7 +2239,7 @@
           <w14:ligatures w14:val="standardContextual"/>
         </w:rPr>
       </w:pPr>
-      <w:hyperlink w:anchor="_Toc242892041" w:history="1">
+      <w:hyperlink w:anchor="_Toc242962900" w:history="1">
         <w:r>
           <w:rPr>
             <w:rStyle w:val="Hyperlink"/>
@@ -2266,7 +2266,7 @@
             <w:noProof/>
             <w:webHidden/>
           </w:rPr>
-          <w:instrText xml:space="preserve"> PAGEREF _Toc242892041 \h </w:instrText>
+          <w:instrText xml:space="preserve"> PAGEREF _Toc242962900 \h </w:instrText>
         </w:r>
         <w:r>
           <w:rPr>
@@ -2313,7 +2313,7 @@
           <w14:ligatures w14:val="standardContextual"/>
         </w:rPr>
       </w:pPr>
-      <w:hyperlink w:anchor="_Toc242892042" w:history="1">
+      <w:hyperlink w:anchor="_Toc242962901" w:history="1">
         <w:r>
           <w:rPr>
             <w:rStyle w:val="Hyperlink"/>
@@ -2340,7 +2340,7 @@
             <w:noProof/>
             <w:webHidden/>
           </w:rPr>
-          <w:instrText xml:space="preserve"> PAGEREF _Toc242892042 \h </w:instrText>
+          <w:instrText xml:space="preserve"> PAGEREF _Toc242962901 \h </w:instrText>
         </w:r>
         <w:r>
           <w:rPr>
@@ -2388,7 +2388,7 @@
           <w14:ligatures w14:val="standardContextual"/>
         </w:rPr>
       </w:pPr>
-      <w:hyperlink w:anchor="_Toc242892043" w:history="1">
+      <w:hyperlink w:anchor="_Toc242962902" w:history="1">
         <w:r>
           <w:rPr>
             <w:rStyle w:val="Hyperlink"/>
@@ -2415,7 +2415,7 @@
             <w:noProof/>
             <w:webHidden/>
           </w:rPr>
-          <w:instrText xml:space="preserve"> PAGEREF _Toc242892043 \h </w:instrText>
+          <w:instrText xml:space="preserve"> PAGEREF _Toc242962902 \h </w:instrText>
         </w:r>
         <w:r>
           <w:rPr>
@@ -2462,7 +2462,7 @@
           <w14:ligatures w14:val="standardContextual"/>
         </w:rPr>
       </w:pPr>
-      <w:hyperlink w:anchor="_Toc242892044" w:history="1">
+      <w:hyperlink w:anchor="_Toc242962903" w:history="1">
         <w:r>
           <w:rPr>
             <w:rStyle w:val="Hyperlink"/>
@@ -2489,7 +2489,7 @@
             <w:noProof/>
             <w:webHidden/>
           </w:rPr>
-          <w:instrText xml:space="preserve"> PAGEREF _Toc242892044 \h </w:instrText>
+          <w:instrText xml:space="preserve"> PAGEREF _Toc242962903 \h </w:instrText>
         </w:r>
         <w:r>
           <w:rPr>
@@ -2536,7 +2536,7 @@
           <w14:ligatures w14:val="standardContextual"/>
         </w:rPr>
       </w:pPr>
-      <w:hyperlink w:anchor="_Toc242892045" w:history="1">
+      <w:hyperlink w:anchor="_Toc242962904" w:history="1">
         <w:r>
           <w:rPr>
             <w:rStyle w:val="Hyperlink"/>
@@ -2563,7 +2563,7 @@
             <w:noProof/>
             <w:webHidden/>
           </w:rPr>
-          <w:instrText xml:space="preserve"> PAGEREF _Toc242892045 \h </w:instrText>
+          <w:instrText xml:space="preserve"> PAGEREF _Toc242962904 \h </w:instrText>
         </w:r>
         <w:r>
           <w:rPr>
@@ -2610,7 +2610,7 @@
           <w14:ligatures w14:val="standardContextual"/>
         </w:rPr>
       </w:pPr>
-      <w:hyperlink w:anchor="_Toc242892046" w:history="1">
+      <w:hyperlink w:anchor="_Toc242962905" w:history="1">
         <w:r>
           <w:rPr>
             <w:rStyle w:val="Hyperlink"/>
@@ -2637,7 +2637,7 @@
             <w:noProof/>
             <w:webHidden/>
           </w:rPr>
-          <w:instrText xml:space="preserve"> PAGEREF _Toc242892046 \h </w:instrText>
+          <w:instrText xml:space="preserve"> PAGEREF _Toc242962905 \h </w:instrText>
         </w:r>
         <w:r>
           <w:rPr>
@@ -2699,7 +2699,7 @@
       <w:bookmarkStart w:id="3" w:name="_Toc242872832"/>
       <w:bookmarkStart w:id="4" w:name="_Toc242877784"/>
       <w:bookmarkStart w:id="5" w:name="_Toc242877964"/>
-      <w:bookmarkStart w:id="6" w:name="_Toc242892018"/>
+      <w:bookmarkStart w:id="6" w:name="_Toc242962877"/>
       <w:r>
         <w:lastRenderedPageBreak/>
         <w:t>Chương 1 Tổng quan đề tài và yêu cầu học phần</w:t>
@@ -2722,7 +2722,7 @@
       <w:bookmarkStart w:id="10" w:name="_Toc242872833"/>
       <w:bookmarkStart w:id="11" w:name="_Toc242877785"/>
       <w:bookmarkStart w:id="12" w:name="_Toc242877965"/>
-      <w:bookmarkStart w:id="13" w:name="_Toc242892019"/>
+      <w:bookmarkStart w:id="13" w:name="_Toc242962878"/>
       <w:r>
         <w:t>1.1 Bối cảnh, mục tiêu và phạm vi</w:t>
       </w:r>
@@ -2805,7 +2805,7 @@
       <w:bookmarkStart w:id="17" w:name="_Toc242872834"/>
       <w:bookmarkStart w:id="18" w:name="_Toc242877786"/>
       <w:bookmarkStart w:id="19" w:name="_Toc242877966"/>
-      <w:bookmarkStart w:id="20" w:name="_Toc242892020"/>
+      <w:bookmarkStart w:id="20" w:name="_Toc242962879"/>
       <w:r>
         <w:t>1.2 Yêu cầu chức năng và kết quả triển khai</w:t>
       </w:r>
@@ -3413,7 +3413,7 @@
       <w:bookmarkStart w:id="24" w:name="_Toc242872835"/>
       <w:bookmarkStart w:id="25" w:name="_Toc242877787"/>
       <w:bookmarkStart w:id="26" w:name="_Toc242877967"/>
-      <w:bookmarkStart w:id="27" w:name="_Toc242892021"/>
+      <w:bookmarkStart w:id="27" w:name="_Toc242962880"/>
       <w:r>
         <w:lastRenderedPageBreak/>
         <w:t>1.3 Kiến trúc tổng thể</w:t>
@@ -3503,7 +3503,7 @@
       <w:bookmarkStart w:id="31" w:name="_Toc242872836"/>
       <w:bookmarkStart w:id="32" w:name="_Toc242877788"/>
       <w:bookmarkStart w:id="33" w:name="_Toc242877968"/>
-      <w:bookmarkStart w:id="34" w:name="_Toc242892022"/>
+      <w:bookmarkStart w:id="34" w:name="_Toc242962881"/>
       <w:r>
         <w:lastRenderedPageBreak/>
         <w:t>1.4 Nguồn số liệu và mốc đo</w:t>
@@ -4392,7 +4392,7 @@
       <w:bookmarkStart w:id="38" w:name="_Toc242872837"/>
       <w:bookmarkStart w:id="39" w:name="_Toc242877789"/>
       <w:bookmarkStart w:id="40" w:name="_Toc242877969"/>
-      <w:bookmarkStart w:id="41" w:name="_Toc242892023"/>
+      <w:bookmarkStart w:id="41" w:name="_Toc242962882"/>
       <w:r>
         <w:lastRenderedPageBreak/>
         <w:t>Chương 2 Báo cáo tiến độ Tuần 1</w:t>
@@ -4424,7 +4424,7 @@
       <w:bookmarkStart w:id="45" w:name="_Toc242872838"/>
       <w:bookmarkStart w:id="46" w:name="_Toc242877790"/>
       <w:bookmarkStart w:id="47" w:name="_Toc242877970"/>
-      <w:bookmarkStart w:id="48" w:name="_Toc242892024"/>
+      <w:bookmarkStart w:id="48" w:name="_Toc242962883"/>
       <w:r>
         <w:t>2.1 Mục tiêu và phân công thực hiện</w:t>
       </w:r>
@@ -4760,7 +4760,7 @@
       <w:bookmarkStart w:id="52" w:name="_Toc242872839"/>
       <w:bookmarkStart w:id="53" w:name="_Toc242877791"/>
       <w:bookmarkStart w:id="54" w:name="_Toc242877971"/>
-      <w:bookmarkStart w:id="55" w:name="_Toc242892025"/>
+      <w:bookmarkStart w:id="55" w:name="_Toc242962884"/>
       <w:r>
         <w:t>2.2 Phạm vi và luồng dữ liệu đo</w:t>
       </w:r>
@@ -5230,7 +5230,7 @@
       <w:bookmarkStart w:id="59" w:name="_Toc242872840"/>
       <w:bookmarkStart w:id="60" w:name="_Toc242877792"/>
       <w:bookmarkStart w:id="61" w:name="_Toc242877972"/>
-      <w:bookmarkStart w:id="62" w:name="_Toc242892026"/>
+      <w:bookmarkStart w:id="62" w:name="_Toc242962885"/>
       <w:r>
         <w:t>2.3 Kết quả định lượng</w:t>
       </w:r>
@@ -5771,7 +5771,7 @@
       <w:bookmarkStart w:id="66" w:name="_Toc242872841"/>
       <w:bookmarkStart w:id="67" w:name="_Toc242877793"/>
       <w:bookmarkStart w:id="68" w:name="_Toc242877973"/>
-      <w:bookmarkStart w:id="69" w:name="_Toc242892027"/>
+      <w:bookmarkStart w:id="69" w:name="_Toc242962886"/>
       <w:r>
         <w:lastRenderedPageBreak/>
         <w:t>Chương 3 Thiết kế và triển khai trên AWS Learner Lab</w:t>
@@ -5794,7 +5794,7 @@
       <w:bookmarkStart w:id="73" w:name="_Toc242872842"/>
       <w:bookmarkStart w:id="74" w:name="_Toc242877794"/>
       <w:bookmarkStart w:id="75" w:name="_Toc242877974"/>
-      <w:bookmarkStart w:id="76" w:name="_Toc242892028"/>
+      <w:bookmarkStart w:id="76" w:name="_Toc242962887"/>
       <w:r>
         <w:t>3.1 Danh mục dịch vụ và cấu hình thực tế</w:t>
       </w:r>
@@ -6558,7 +6558,7 @@
       <w:bookmarkStart w:id="80" w:name="_Toc242872843"/>
       <w:bookmarkStart w:id="81" w:name="_Toc242877795"/>
       <w:bookmarkStart w:id="82" w:name="_Toc242877975"/>
-      <w:bookmarkStart w:id="83" w:name="_Toc242892029"/>
+      <w:bookmarkStart w:id="83" w:name="_Toc242962888"/>
       <w:r>
         <w:t>3.2 Dữ liệu và phân vùng S3</w:t>
       </w:r>
@@ -6647,7 +6647,7 @@
       <w:bookmarkStart w:id="87" w:name="_Toc242872844"/>
       <w:bookmarkStart w:id="88" w:name="_Toc242877796"/>
       <w:bookmarkStart w:id="89" w:name="_Toc242877976"/>
-      <w:bookmarkStart w:id="90" w:name="_Toc242892030"/>
+      <w:bookmarkStart w:id="90" w:name="_Toc242962889"/>
       <w:r>
         <w:t>3.3 An toàn cấu hình và vận hành</w:t>
       </w:r>
@@ -6678,7 +6678,7 @@
       <w:bookmarkStart w:id="94" w:name="_Toc242872845"/>
       <w:bookmarkStart w:id="95" w:name="_Toc242877797"/>
       <w:bookmarkStart w:id="96" w:name="_Toc242877977"/>
-      <w:bookmarkStart w:id="97" w:name="_Toc242892031"/>
+      <w:bookmarkStart w:id="97" w:name="_Toc242962890"/>
       <w:r>
         <w:lastRenderedPageBreak/>
         <w:t>3.4 Trình tự xử lý của Lambda</w:t>
@@ -6728,7 +6728,7 @@
       <w:bookmarkStart w:id="101" w:name="_Toc242872846"/>
       <w:bookmarkStart w:id="102" w:name="_Toc242877798"/>
       <w:bookmarkStart w:id="103" w:name="_Toc242877978"/>
-      <w:bookmarkStart w:id="104" w:name="_Toc242892032"/>
+      <w:bookmarkStart w:id="104" w:name="_Toc242962891"/>
       <w:r>
         <w:t>3.5 Truy vấn Athena và khả năng tái lập</w:t>
       </w:r>
@@ -7000,7 +7000,7 @@
       <w:bookmarkStart w:id="108" w:name="_Toc242872847"/>
       <w:bookmarkStart w:id="109" w:name="_Toc242877799"/>
       <w:bookmarkStart w:id="110" w:name="_Toc242877979"/>
-      <w:bookmarkStart w:id="111" w:name="_Toc242892033"/>
+      <w:bookmarkStart w:id="111" w:name="_Toc242962892"/>
       <w:r>
         <w:t>3.6 Lược đồ bản ghi và chất lượng dữ liệu</w:t>
       </w:r>
@@ -7705,7 +7705,7 @@
       <w:bookmarkStart w:id="115" w:name="_Toc242872848"/>
       <w:bookmarkStart w:id="116" w:name="_Toc242877800"/>
       <w:bookmarkStart w:id="117" w:name="_Toc242877980"/>
-      <w:bookmarkStart w:id="118" w:name="_Toc242892034"/>
+      <w:bookmarkStart w:id="118" w:name="_Toc242962893"/>
       <w:r>
         <w:lastRenderedPageBreak/>
         <w:t>3.7 Tần suất gọi Open-Meteo và yêu cầu khóa API</w:t>
@@ -7748,7 +7748,7 @@
       <w:bookmarkStart w:id="122" w:name="_Toc242872849"/>
       <w:bookmarkStart w:id="123" w:name="_Toc242877801"/>
       <w:bookmarkStart w:id="124" w:name="_Toc242877981"/>
-      <w:bookmarkStart w:id="125" w:name="_Toc242892035"/>
+      <w:bookmarkStart w:id="125" w:name="_Toc242962894"/>
       <w:r>
         <w:lastRenderedPageBreak/>
         <w:t>Chương 4 Kết quả kiểm tra và phân tích dữ liệu</w:t>
@@ -7771,7 +7771,7 @@
       <w:bookmarkStart w:id="129" w:name="_Toc242872850"/>
       <w:bookmarkStart w:id="130" w:name="_Toc242877802"/>
       <w:bookmarkStart w:id="131" w:name="_Toc242877982"/>
-      <w:bookmarkStart w:id="132" w:name="_Toc242892036"/>
+      <w:bookmarkStart w:id="132" w:name="_Toc242962895"/>
       <w:r>
         <w:t>4.1 Mốc dữ liệu và số đo vận hành AWS</w:t>
       </w:r>
@@ -8473,7 +8473,7 @@
       <w:bookmarkStart w:id="136" w:name="_Toc242872851"/>
       <w:bookmarkStart w:id="137" w:name="_Toc242877803"/>
       <w:bookmarkStart w:id="138" w:name="_Toc242877983"/>
-      <w:bookmarkStart w:id="139" w:name="_Toc242892037"/>
+      <w:bookmarkStart w:id="139" w:name="_Toc242962896"/>
       <w:r>
         <w:lastRenderedPageBreak/>
         <w:t>4.2 So sánh ba đô thị từ Athena</w:t>
@@ -9828,7 +9828,7 @@
       <w:bookmarkStart w:id="143" w:name="_Toc242872852"/>
       <w:bookmarkStart w:id="144" w:name="_Toc242877804"/>
       <w:bookmarkStart w:id="145" w:name="_Toc242877984"/>
-      <w:bookmarkStart w:id="146" w:name="_Toc242892038"/>
+      <w:bookmarkStart w:id="146" w:name="_Toc242962897"/>
       <w:r>
         <w:t>4.3 Biến thiên theo 24 giờ UTC</w:t>
       </w:r>
@@ -13118,7 +13118,7 @@
       <w:bookmarkStart w:id="150" w:name="_Toc242872853"/>
       <w:bookmarkStart w:id="151" w:name="_Toc242877805"/>
       <w:bookmarkStart w:id="152" w:name="_Toc242877985"/>
-      <w:bookmarkStart w:id="153" w:name="_Toc242892039"/>
+      <w:bookmarkStart w:id="153" w:name="_Toc242962898"/>
       <w:r>
         <w:lastRenderedPageBreak/>
         <w:t>4.4 Phân bố cấp chất lượng không khí</w:t>
@@ -13769,7 +13769,7 @@
       <w:bookmarkStart w:id="157" w:name="_Toc242872854"/>
       <w:bookmarkStart w:id="158" w:name="_Toc242877806"/>
       <w:bookmarkStart w:id="159" w:name="_Toc242877986"/>
-      <w:bookmarkStart w:id="160" w:name="_Toc242892040"/>
+      <w:bookmarkStart w:id="160" w:name="_Toc242962899"/>
       <w:r>
         <w:lastRenderedPageBreak/>
         <w:t>4.5 Tương quan PM2.5 với yếu tố khí tượng</w:t>
@@ -14386,7 +14386,7 @@
       <w:bookmarkStart w:id="164" w:name="_Toc242872855"/>
       <w:bookmarkStart w:id="165" w:name="_Toc242877807"/>
       <w:bookmarkStart w:id="166" w:name="_Toc242877987"/>
-      <w:bookmarkStart w:id="167" w:name="_Toc242892041"/>
+      <w:bookmarkStart w:id="167" w:name="_Toc242962900"/>
       <w:r>
         <w:lastRenderedPageBreak/>
         <w:t>4.6 Thời gian và dung lượng quét của năm truy vấn</w:t>
@@ -15302,7 +15302,7 @@
         <w:pStyle w:val="Heading2"/>
         <w:pageBreakBefore/>
       </w:pPr>
-      <w:bookmarkStart w:id="168" w:name="_Toc242892042"/>
+      <w:bookmarkStart w:id="168" w:name="_Toc242962901"/>
       <w:r>
         <w:lastRenderedPageBreak/>
         <w:t>4.7 Phân bố và độ phân tán của AQI và PM2.5</w:t>
@@ -15386,7 +15386,7 @@
       <w:bookmarkStart w:id="172" w:name="_Toc242872856"/>
       <w:bookmarkStart w:id="173" w:name="_Toc242877808"/>
       <w:bookmarkStart w:id="174" w:name="_Toc242877988"/>
-      <w:bookmarkStart w:id="175" w:name="_Toc242892043"/>
+      <w:bookmarkStart w:id="175" w:name="_Toc242962902"/>
       <w:r>
         <w:lastRenderedPageBreak/>
         <w:t>Chương 5 Tổng hợp kết quả và chi phí Tuần 1</w:t>
@@ -15409,7 +15409,7 @@
       <w:bookmarkStart w:id="179" w:name="_Toc242872857"/>
       <w:bookmarkStart w:id="180" w:name="_Toc242877809"/>
       <w:bookmarkStart w:id="181" w:name="_Toc242877989"/>
-      <w:bookmarkStart w:id="182" w:name="_Toc242892044"/>
+      <w:bookmarkStart w:id="182" w:name="_Toc242962903"/>
       <w:r>
         <w:t>5.1 Mức độ hoàn thành theo sản phẩm</w:t>
       </w:r>
@@ -15440,7 +15440,7 @@
       <w:bookmarkStart w:id="186" w:name="_Toc242872858"/>
       <w:bookmarkStart w:id="187" w:name="_Toc242877810"/>
       <w:bookmarkStart w:id="188" w:name="_Toc242877990"/>
-      <w:bookmarkStart w:id="189" w:name="_Toc242892045"/>
+      <w:bookmarkStart w:id="189" w:name="_Toc242962904"/>
       <w:r>
         <w:t>5.2 Quản lý chi phí</w:t>
       </w:r>
@@ -15988,7 +15988,7 @@
       <w:bookmarkStart w:id="193" w:name="_Toc242872859"/>
       <w:bookmarkStart w:id="194" w:name="_Toc242877811"/>
       <w:bookmarkStart w:id="195" w:name="_Toc242877991"/>
-      <w:bookmarkStart w:id="196" w:name="_Toc242892046"/>
+      <w:bookmarkStart w:id="196" w:name="_Toc242962905"/>
       <w:r>
         <w:t>5.3 Kết luận</w:t>
       </w:r>

</xml_diff>

<commit_message>
docs(reports): proofread Vietnamese wording in weekly reports
</commit_message>
<xml_diff>
--- a/tuan_1/docs/Bao_cao_tuan_1_Dien_toan_dam_may_24110054_24110051.docx
+++ b/tuan_1/docs/Bao_cao_tuan_1_Dien_toan_dam_may_24110054_24110051.docx
@@ -534,7 +534,7 @@
         </w:rPr>
         <w:fldChar w:fldCharType="separate"/>
       </w:r>
-      <w:hyperlink w:anchor="_Toc242962877" w:history="1">
+      <w:hyperlink w:anchor="_Toc242966575" w:history="1">
         <w:r>
           <w:rPr>
             <w:rStyle w:val="Hyperlink"/>
@@ -561,7 +561,7 @@
             <w:noProof/>
             <w:webHidden/>
           </w:rPr>
-          <w:instrText xml:space="preserve"> PAGEREF _Toc242962877 \h </w:instrText>
+          <w:instrText xml:space="preserve"> PAGEREF _Toc242966575 \h </w:instrText>
         </w:r>
         <w:r>
           <w:rPr>
@@ -608,7 +608,7 @@
           <w14:ligatures w14:val="standardContextual"/>
         </w:rPr>
       </w:pPr>
-      <w:hyperlink w:anchor="_Toc242962878" w:history="1">
+      <w:hyperlink w:anchor="_Toc242966576" w:history="1">
         <w:r>
           <w:rPr>
             <w:rStyle w:val="Hyperlink"/>
@@ -635,7 +635,7 @@
             <w:noProof/>
             <w:webHidden/>
           </w:rPr>
-          <w:instrText xml:space="preserve"> PAGEREF _Toc242962878 \h </w:instrText>
+          <w:instrText xml:space="preserve"> PAGEREF _Toc242966576 \h </w:instrText>
         </w:r>
         <w:r>
           <w:rPr>
@@ -682,7 +682,7 @@
           <w14:ligatures w14:val="standardContextual"/>
         </w:rPr>
       </w:pPr>
-      <w:hyperlink w:anchor="_Toc242962879" w:history="1">
+      <w:hyperlink w:anchor="_Toc242966577" w:history="1">
         <w:r>
           <w:rPr>
             <w:rStyle w:val="Hyperlink"/>
@@ -709,7 +709,7 @@
             <w:noProof/>
             <w:webHidden/>
           </w:rPr>
-          <w:instrText xml:space="preserve"> PAGEREF _Toc242962879 \h </w:instrText>
+          <w:instrText xml:space="preserve"> PAGEREF _Toc242966577 \h </w:instrText>
         </w:r>
         <w:r>
           <w:rPr>
@@ -756,7 +756,7 @@
           <w14:ligatures w14:val="standardContextual"/>
         </w:rPr>
       </w:pPr>
-      <w:hyperlink w:anchor="_Toc242962880" w:history="1">
+      <w:hyperlink w:anchor="_Toc242966578" w:history="1">
         <w:r>
           <w:rPr>
             <w:rStyle w:val="Hyperlink"/>
@@ -783,7 +783,7 @@
             <w:noProof/>
             <w:webHidden/>
           </w:rPr>
-          <w:instrText xml:space="preserve"> PAGEREF _Toc242962880 \h </w:instrText>
+          <w:instrText xml:space="preserve"> PAGEREF _Toc242966578 \h </w:instrText>
         </w:r>
         <w:r>
           <w:rPr>
@@ -830,7 +830,7 @@
           <w14:ligatures w14:val="standardContextual"/>
         </w:rPr>
       </w:pPr>
-      <w:hyperlink w:anchor="_Toc242962881" w:history="1">
+      <w:hyperlink w:anchor="_Toc242966579" w:history="1">
         <w:r>
           <w:rPr>
             <w:rStyle w:val="Hyperlink"/>
@@ -857,7 +857,7 @@
             <w:noProof/>
             <w:webHidden/>
           </w:rPr>
-          <w:instrText xml:space="preserve"> PAGEREF _Toc242962881 \h </w:instrText>
+          <w:instrText xml:space="preserve"> PAGEREF _Toc242966579 \h </w:instrText>
         </w:r>
         <w:r>
           <w:rPr>
@@ -905,7 +905,7 @@
           <w14:ligatures w14:val="standardContextual"/>
         </w:rPr>
       </w:pPr>
-      <w:hyperlink w:anchor="_Toc242962882" w:history="1">
+      <w:hyperlink w:anchor="_Toc242966580" w:history="1">
         <w:r>
           <w:rPr>
             <w:rStyle w:val="Hyperlink"/>
@@ -932,7 +932,7 @@
             <w:noProof/>
             <w:webHidden/>
           </w:rPr>
-          <w:instrText xml:space="preserve"> PAGEREF _Toc242962882 \h </w:instrText>
+          <w:instrText xml:space="preserve"> PAGEREF _Toc242966580 \h </w:instrText>
         </w:r>
         <w:r>
           <w:rPr>
@@ -979,7 +979,7 @@
           <w14:ligatures w14:val="standardContextual"/>
         </w:rPr>
       </w:pPr>
-      <w:hyperlink w:anchor="_Toc242962883" w:history="1">
+      <w:hyperlink w:anchor="_Toc242966581" w:history="1">
         <w:r>
           <w:rPr>
             <w:rStyle w:val="Hyperlink"/>
@@ -1006,7 +1006,7 @@
             <w:noProof/>
             <w:webHidden/>
           </w:rPr>
-          <w:instrText xml:space="preserve"> PAGEREF _Toc242962883 \h </w:instrText>
+          <w:instrText xml:space="preserve"> PAGEREF _Toc242966581 \h </w:instrText>
         </w:r>
         <w:r>
           <w:rPr>
@@ -1053,7 +1053,7 @@
           <w14:ligatures w14:val="standardContextual"/>
         </w:rPr>
       </w:pPr>
-      <w:hyperlink w:anchor="_Toc242962884" w:history="1">
+      <w:hyperlink w:anchor="_Toc242966582" w:history="1">
         <w:r>
           <w:rPr>
             <w:rStyle w:val="Hyperlink"/>
@@ -1080,7 +1080,7 @@
             <w:noProof/>
             <w:webHidden/>
           </w:rPr>
-          <w:instrText xml:space="preserve"> PAGEREF _Toc242962884 \h </w:instrText>
+          <w:instrText xml:space="preserve"> PAGEREF _Toc242966582 \h </w:instrText>
         </w:r>
         <w:r>
           <w:rPr>
@@ -1127,7 +1127,7 @@
           <w14:ligatures w14:val="standardContextual"/>
         </w:rPr>
       </w:pPr>
-      <w:hyperlink w:anchor="_Toc242962885" w:history="1">
+      <w:hyperlink w:anchor="_Toc242966583" w:history="1">
         <w:r>
           <w:rPr>
             <w:rStyle w:val="Hyperlink"/>
@@ -1154,7 +1154,7 @@
             <w:noProof/>
             <w:webHidden/>
           </w:rPr>
-          <w:instrText xml:space="preserve"> PAGEREF _Toc242962885 \h </w:instrText>
+          <w:instrText xml:space="preserve"> PAGEREF _Toc242966583 \h </w:instrText>
         </w:r>
         <w:r>
           <w:rPr>
@@ -1202,7 +1202,7 @@
           <w14:ligatures w14:val="standardContextual"/>
         </w:rPr>
       </w:pPr>
-      <w:hyperlink w:anchor="_Toc242962886" w:history="1">
+      <w:hyperlink w:anchor="_Toc242966584" w:history="1">
         <w:r>
           <w:rPr>
             <w:rStyle w:val="Hyperlink"/>
@@ -1229,7 +1229,7 @@
             <w:noProof/>
             <w:webHidden/>
           </w:rPr>
-          <w:instrText xml:space="preserve"> PAGEREF _Toc242962886 \h </w:instrText>
+          <w:instrText xml:space="preserve"> PAGEREF _Toc242966584 \h </w:instrText>
         </w:r>
         <w:r>
           <w:rPr>
@@ -1276,7 +1276,7 @@
           <w14:ligatures w14:val="standardContextual"/>
         </w:rPr>
       </w:pPr>
-      <w:hyperlink w:anchor="_Toc242962887" w:history="1">
+      <w:hyperlink w:anchor="_Toc242966585" w:history="1">
         <w:r>
           <w:rPr>
             <w:rStyle w:val="Hyperlink"/>
@@ -1303,7 +1303,7 @@
             <w:noProof/>
             <w:webHidden/>
           </w:rPr>
-          <w:instrText xml:space="preserve"> PAGEREF _Toc242962887 \h </w:instrText>
+          <w:instrText xml:space="preserve"> PAGEREF _Toc242966585 \h </w:instrText>
         </w:r>
         <w:r>
           <w:rPr>
@@ -1350,7 +1350,7 @@
           <w14:ligatures w14:val="standardContextual"/>
         </w:rPr>
       </w:pPr>
-      <w:hyperlink w:anchor="_Toc242962888" w:history="1">
+      <w:hyperlink w:anchor="_Toc242966586" w:history="1">
         <w:r>
           <w:rPr>
             <w:rStyle w:val="Hyperlink"/>
@@ -1377,7 +1377,7 @@
             <w:noProof/>
             <w:webHidden/>
           </w:rPr>
-          <w:instrText xml:space="preserve"> PAGEREF _Toc242962888 \h </w:instrText>
+          <w:instrText xml:space="preserve"> PAGEREF _Toc242966586 \h </w:instrText>
         </w:r>
         <w:r>
           <w:rPr>
@@ -1424,7 +1424,7 @@
           <w14:ligatures w14:val="standardContextual"/>
         </w:rPr>
       </w:pPr>
-      <w:hyperlink w:anchor="_Toc242962889" w:history="1">
+      <w:hyperlink w:anchor="_Toc242966587" w:history="1">
         <w:r>
           <w:rPr>
             <w:rStyle w:val="Hyperlink"/>
@@ -1451,7 +1451,7 @@
             <w:noProof/>
             <w:webHidden/>
           </w:rPr>
-          <w:instrText xml:space="preserve"> PAGEREF _Toc242962889 \h </w:instrText>
+          <w:instrText xml:space="preserve"> PAGEREF _Toc242966587 \h </w:instrText>
         </w:r>
         <w:r>
           <w:rPr>
@@ -1498,7 +1498,7 @@
           <w14:ligatures w14:val="standardContextual"/>
         </w:rPr>
       </w:pPr>
-      <w:hyperlink w:anchor="_Toc242962890" w:history="1">
+      <w:hyperlink w:anchor="_Toc242966588" w:history="1">
         <w:r>
           <w:rPr>
             <w:rStyle w:val="Hyperlink"/>
@@ -1525,7 +1525,7 @@
             <w:noProof/>
             <w:webHidden/>
           </w:rPr>
-          <w:instrText xml:space="preserve"> PAGEREF _Toc242962890 \h </w:instrText>
+          <w:instrText xml:space="preserve"> PAGEREF _Toc242966588 \h </w:instrText>
         </w:r>
         <w:r>
           <w:rPr>
@@ -1572,7 +1572,7 @@
           <w14:ligatures w14:val="standardContextual"/>
         </w:rPr>
       </w:pPr>
-      <w:hyperlink w:anchor="_Toc242962891" w:history="1">
+      <w:hyperlink w:anchor="_Toc242966589" w:history="1">
         <w:r>
           <w:rPr>
             <w:rStyle w:val="Hyperlink"/>
@@ -1599,7 +1599,7 @@
             <w:noProof/>
             <w:webHidden/>
           </w:rPr>
-          <w:instrText xml:space="preserve"> PAGEREF _Toc242962891 \h </w:instrText>
+          <w:instrText xml:space="preserve"> PAGEREF _Toc242966589 \h </w:instrText>
         </w:r>
         <w:r>
           <w:rPr>
@@ -1646,7 +1646,7 @@
           <w14:ligatures w14:val="standardContextual"/>
         </w:rPr>
       </w:pPr>
-      <w:hyperlink w:anchor="_Toc242962892" w:history="1">
+      <w:hyperlink w:anchor="_Toc242966590" w:history="1">
         <w:r>
           <w:rPr>
             <w:rStyle w:val="Hyperlink"/>
@@ -1673,7 +1673,7 @@
             <w:noProof/>
             <w:webHidden/>
           </w:rPr>
-          <w:instrText xml:space="preserve"> PAGEREF _Toc242962892 \h </w:instrText>
+          <w:instrText xml:space="preserve"> PAGEREF _Toc242966590 \h </w:instrText>
         </w:r>
         <w:r>
           <w:rPr>
@@ -1720,7 +1720,7 @@
           <w14:ligatures w14:val="standardContextual"/>
         </w:rPr>
       </w:pPr>
-      <w:hyperlink w:anchor="_Toc242962893" w:history="1">
+      <w:hyperlink w:anchor="_Toc242966591" w:history="1">
         <w:r>
           <w:rPr>
             <w:rStyle w:val="Hyperlink"/>
@@ -1747,7 +1747,7 @@
             <w:noProof/>
             <w:webHidden/>
           </w:rPr>
-          <w:instrText xml:space="preserve"> PAGEREF _Toc242962893 \h </w:instrText>
+          <w:instrText xml:space="preserve"> PAGEREF _Toc242966591 \h </w:instrText>
         </w:r>
         <w:r>
           <w:rPr>
@@ -1795,7 +1795,7 @@
           <w14:ligatures w14:val="standardContextual"/>
         </w:rPr>
       </w:pPr>
-      <w:hyperlink w:anchor="_Toc242962894" w:history="1">
+      <w:hyperlink w:anchor="_Toc242966592" w:history="1">
         <w:r>
           <w:rPr>
             <w:rStyle w:val="Hyperlink"/>
@@ -1822,7 +1822,7 @@
             <w:noProof/>
             <w:webHidden/>
           </w:rPr>
-          <w:instrText xml:space="preserve"> PAGEREF _Toc242962894 \h </w:instrText>
+          <w:instrText xml:space="preserve"> PAGEREF _Toc242966592 \h </w:instrText>
         </w:r>
         <w:r>
           <w:rPr>
@@ -1869,7 +1869,7 @@
           <w14:ligatures w14:val="standardContextual"/>
         </w:rPr>
       </w:pPr>
-      <w:hyperlink w:anchor="_Toc242962895" w:history="1">
+      <w:hyperlink w:anchor="_Toc242966593" w:history="1">
         <w:r>
           <w:rPr>
             <w:rStyle w:val="Hyperlink"/>
@@ -1896,7 +1896,7 @@
             <w:noProof/>
             <w:webHidden/>
           </w:rPr>
-          <w:instrText xml:space="preserve"> PAGEREF _Toc242962895 \h </w:instrText>
+          <w:instrText xml:space="preserve"> PAGEREF _Toc242966593 \h </w:instrText>
         </w:r>
         <w:r>
           <w:rPr>
@@ -1943,7 +1943,7 @@
           <w14:ligatures w14:val="standardContextual"/>
         </w:rPr>
       </w:pPr>
-      <w:hyperlink w:anchor="_Toc242962896" w:history="1">
+      <w:hyperlink w:anchor="_Toc242966594" w:history="1">
         <w:r>
           <w:rPr>
             <w:rStyle w:val="Hyperlink"/>
@@ -1970,7 +1970,7 @@
             <w:noProof/>
             <w:webHidden/>
           </w:rPr>
-          <w:instrText xml:space="preserve"> PAGEREF _Toc242962896 \h </w:instrText>
+          <w:instrText xml:space="preserve"> PAGEREF _Toc242966594 \h </w:instrText>
         </w:r>
         <w:r>
           <w:rPr>
@@ -2017,7 +2017,7 @@
           <w14:ligatures w14:val="standardContextual"/>
         </w:rPr>
       </w:pPr>
-      <w:hyperlink w:anchor="_Toc242962897" w:history="1">
+      <w:hyperlink w:anchor="_Toc242966595" w:history="1">
         <w:r>
           <w:rPr>
             <w:rStyle w:val="Hyperlink"/>
@@ -2044,7 +2044,7 @@
             <w:noProof/>
             <w:webHidden/>
           </w:rPr>
-          <w:instrText xml:space="preserve"> PAGEREF _Toc242962897 \h </w:instrText>
+          <w:instrText xml:space="preserve"> PAGEREF _Toc242966595 \h </w:instrText>
         </w:r>
         <w:r>
           <w:rPr>
@@ -2091,7 +2091,7 @@
           <w14:ligatures w14:val="standardContextual"/>
         </w:rPr>
       </w:pPr>
-      <w:hyperlink w:anchor="_Toc242962898" w:history="1">
+      <w:hyperlink w:anchor="_Toc242966596" w:history="1">
         <w:r>
           <w:rPr>
             <w:rStyle w:val="Hyperlink"/>
@@ -2118,7 +2118,7 @@
             <w:noProof/>
             <w:webHidden/>
           </w:rPr>
-          <w:instrText xml:space="preserve"> PAGEREF _Toc242962898 \h </w:instrText>
+          <w:instrText xml:space="preserve"> PAGEREF _Toc242966596 \h </w:instrText>
         </w:r>
         <w:r>
           <w:rPr>
@@ -2165,7 +2165,7 @@
           <w14:ligatures w14:val="standardContextual"/>
         </w:rPr>
       </w:pPr>
-      <w:hyperlink w:anchor="_Toc242962899" w:history="1">
+      <w:hyperlink w:anchor="_Toc242966597" w:history="1">
         <w:r>
           <w:rPr>
             <w:rStyle w:val="Hyperlink"/>
@@ -2192,7 +2192,7 @@
             <w:noProof/>
             <w:webHidden/>
           </w:rPr>
-          <w:instrText xml:space="preserve"> PAGEREF _Toc242962899 \h </w:instrText>
+          <w:instrText xml:space="preserve"> PAGEREF _Toc242966597 \h </w:instrText>
         </w:r>
         <w:r>
           <w:rPr>
@@ -2239,7 +2239,7 @@
           <w14:ligatures w14:val="standardContextual"/>
         </w:rPr>
       </w:pPr>
-      <w:hyperlink w:anchor="_Toc242962900" w:history="1">
+      <w:hyperlink w:anchor="_Toc242966598" w:history="1">
         <w:r>
           <w:rPr>
             <w:rStyle w:val="Hyperlink"/>
@@ -2266,7 +2266,7 @@
             <w:noProof/>
             <w:webHidden/>
           </w:rPr>
-          <w:instrText xml:space="preserve"> PAGEREF _Toc242962900 \h </w:instrText>
+          <w:instrText xml:space="preserve"> PAGEREF _Toc242966598 \h </w:instrText>
         </w:r>
         <w:r>
           <w:rPr>
@@ -2313,7 +2313,7 @@
           <w14:ligatures w14:val="standardContextual"/>
         </w:rPr>
       </w:pPr>
-      <w:hyperlink w:anchor="_Toc242962901" w:history="1">
+      <w:hyperlink w:anchor="_Toc242966599" w:history="1">
         <w:r>
           <w:rPr>
             <w:rStyle w:val="Hyperlink"/>
@@ -2340,7 +2340,7 @@
             <w:noProof/>
             <w:webHidden/>
           </w:rPr>
-          <w:instrText xml:space="preserve"> PAGEREF _Toc242962901 \h </w:instrText>
+          <w:instrText xml:space="preserve"> PAGEREF _Toc242966599 \h </w:instrText>
         </w:r>
         <w:r>
           <w:rPr>
@@ -2388,7 +2388,7 @@
           <w14:ligatures w14:val="standardContextual"/>
         </w:rPr>
       </w:pPr>
-      <w:hyperlink w:anchor="_Toc242962902" w:history="1">
+      <w:hyperlink w:anchor="_Toc242966600" w:history="1">
         <w:r>
           <w:rPr>
             <w:rStyle w:val="Hyperlink"/>
@@ -2415,7 +2415,7 @@
             <w:noProof/>
             <w:webHidden/>
           </w:rPr>
-          <w:instrText xml:space="preserve"> PAGEREF _Toc242962902 \h </w:instrText>
+          <w:instrText xml:space="preserve"> PAGEREF _Toc242966600 \h </w:instrText>
         </w:r>
         <w:r>
           <w:rPr>
@@ -2462,7 +2462,7 @@
           <w14:ligatures w14:val="standardContextual"/>
         </w:rPr>
       </w:pPr>
-      <w:hyperlink w:anchor="_Toc242962903" w:history="1">
+      <w:hyperlink w:anchor="_Toc242966601" w:history="1">
         <w:r>
           <w:rPr>
             <w:rStyle w:val="Hyperlink"/>
@@ -2489,7 +2489,7 @@
             <w:noProof/>
             <w:webHidden/>
           </w:rPr>
-          <w:instrText xml:space="preserve"> PAGEREF _Toc242962903 \h </w:instrText>
+          <w:instrText xml:space="preserve"> PAGEREF _Toc242966601 \h </w:instrText>
         </w:r>
         <w:r>
           <w:rPr>
@@ -2536,7 +2536,7 @@
           <w14:ligatures w14:val="standardContextual"/>
         </w:rPr>
       </w:pPr>
-      <w:hyperlink w:anchor="_Toc242962904" w:history="1">
+      <w:hyperlink w:anchor="_Toc242966602" w:history="1">
         <w:r>
           <w:rPr>
             <w:rStyle w:val="Hyperlink"/>
@@ -2563,7 +2563,7 @@
             <w:noProof/>
             <w:webHidden/>
           </w:rPr>
-          <w:instrText xml:space="preserve"> PAGEREF _Toc242962904 \h </w:instrText>
+          <w:instrText xml:space="preserve"> PAGEREF _Toc242966602 \h </w:instrText>
         </w:r>
         <w:r>
           <w:rPr>
@@ -2610,7 +2610,7 @@
           <w14:ligatures w14:val="standardContextual"/>
         </w:rPr>
       </w:pPr>
-      <w:hyperlink w:anchor="_Toc242962905" w:history="1">
+      <w:hyperlink w:anchor="_Toc242966603" w:history="1">
         <w:r>
           <w:rPr>
             <w:rStyle w:val="Hyperlink"/>
@@ -2637,7 +2637,7 @@
             <w:noProof/>
             <w:webHidden/>
           </w:rPr>
-          <w:instrText xml:space="preserve"> PAGEREF _Toc242962905 \h </w:instrText>
+          <w:instrText xml:space="preserve"> PAGEREF _Toc242966603 \h </w:instrText>
         </w:r>
         <w:r>
           <w:rPr>
@@ -2699,7 +2699,7 @@
       <w:bookmarkStart w:id="3" w:name="_Toc242872832"/>
       <w:bookmarkStart w:id="4" w:name="_Toc242877784"/>
       <w:bookmarkStart w:id="5" w:name="_Toc242877964"/>
-      <w:bookmarkStart w:id="6" w:name="_Toc242962877"/>
+      <w:bookmarkStart w:id="6" w:name="_Toc242966575"/>
       <w:r>
         <w:lastRenderedPageBreak/>
         <w:t>Chương 1 Tổng quan đề tài và yêu cầu học phần</w:t>
@@ -2722,7 +2722,7 @@
       <w:bookmarkStart w:id="10" w:name="_Toc242872833"/>
       <w:bookmarkStart w:id="11" w:name="_Toc242877785"/>
       <w:bookmarkStart w:id="12" w:name="_Toc242877965"/>
-      <w:bookmarkStart w:id="13" w:name="_Toc242962878"/>
+      <w:bookmarkStart w:id="13" w:name="_Toc242966576"/>
       <w:r>
         <w:t>1.1 Bối cảnh, mục tiêu và phạm vi</w:t>
       </w:r>
@@ -2805,7 +2805,7 @@
       <w:bookmarkStart w:id="17" w:name="_Toc242872834"/>
       <w:bookmarkStart w:id="18" w:name="_Toc242877786"/>
       <w:bookmarkStart w:id="19" w:name="_Toc242877966"/>
-      <w:bookmarkStart w:id="20" w:name="_Toc242962879"/>
+      <w:bookmarkStart w:id="20" w:name="_Toc242966577"/>
       <w:r>
         <w:t>1.2 Yêu cầu chức năng và kết quả triển khai</w:t>
       </w:r>
@@ -3413,7 +3413,7 @@
       <w:bookmarkStart w:id="24" w:name="_Toc242872835"/>
       <w:bookmarkStart w:id="25" w:name="_Toc242877787"/>
       <w:bookmarkStart w:id="26" w:name="_Toc242877967"/>
-      <w:bookmarkStart w:id="27" w:name="_Toc242962880"/>
+      <w:bookmarkStart w:id="27" w:name="_Toc242966578"/>
       <w:r>
         <w:lastRenderedPageBreak/>
         <w:t>1.3 Kiến trúc tổng thể</w:t>
@@ -3503,7 +3503,7 @@
       <w:bookmarkStart w:id="31" w:name="_Toc242872836"/>
       <w:bookmarkStart w:id="32" w:name="_Toc242877788"/>
       <w:bookmarkStart w:id="33" w:name="_Toc242877968"/>
-      <w:bookmarkStart w:id="34" w:name="_Toc242962881"/>
+      <w:bookmarkStart w:id="34" w:name="_Toc242966579"/>
       <w:r>
         <w:lastRenderedPageBreak/>
         <w:t>1.4 Nguồn số liệu và mốc đo</w:t>
@@ -4392,7 +4392,7 @@
       <w:bookmarkStart w:id="38" w:name="_Toc242872837"/>
       <w:bookmarkStart w:id="39" w:name="_Toc242877789"/>
       <w:bookmarkStart w:id="40" w:name="_Toc242877969"/>
-      <w:bookmarkStart w:id="41" w:name="_Toc242962882"/>
+      <w:bookmarkStart w:id="41" w:name="_Toc242966580"/>
       <w:r>
         <w:lastRenderedPageBreak/>
         <w:t>Chương 2 Báo cáo tiến độ Tuần 1</w:t>
@@ -4424,7 +4424,7 @@
       <w:bookmarkStart w:id="45" w:name="_Toc242872838"/>
       <w:bookmarkStart w:id="46" w:name="_Toc242877790"/>
       <w:bookmarkStart w:id="47" w:name="_Toc242877970"/>
-      <w:bookmarkStart w:id="48" w:name="_Toc242962883"/>
+      <w:bookmarkStart w:id="48" w:name="_Toc242966581"/>
       <w:r>
         <w:t>2.1 Mục tiêu và phân công thực hiện</w:t>
       </w:r>
@@ -4760,7 +4760,7 @@
       <w:bookmarkStart w:id="52" w:name="_Toc242872839"/>
       <w:bookmarkStart w:id="53" w:name="_Toc242877791"/>
       <w:bookmarkStart w:id="54" w:name="_Toc242877971"/>
-      <w:bookmarkStart w:id="55" w:name="_Toc242962884"/>
+      <w:bookmarkStart w:id="55" w:name="_Toc242966582"/>
       <w:r>
         <w:t>2.2 Phạm vi và luồng dữ liệu đo</w:t>
       </w:r>
@@ -5230,7 +5230,7 @@
       <w:bookmarkStart w:id="59" w:name="_Toc242872840"/>
       <w:bookmarkStart w:id="60" w:name="_Toc242877792"/>
       <w:bookmarkStart w:id="61" w:name="_Toc242877972"/>
-      <w:bookmarkStart w:id="62" w:name="_Toc242962885"/>
+      <w:bookmarkStart w:id="62" w:name="_Toc242966583"/>
       <w:r>
         <w:t>2.3 Kết quả định lượng</w:t>
       </w:r>
@@ -5771,7 +5771,7 @@
       <w:bookmarkStart w:id="66" w:name="_Toc242872841"/>
       <w:bookmarkStart w:id="67" w:name="_Toc242877793"/>
       <w:bookmarkStart w:id="68" w:name="_Toc242877973"/>
-      <w:bookmarkStart w:id="69" w:name="_Toc242962886"/>
+      <w:bookmarkStart w:id="69" w:name="_Toc242966584"/>
       <w:r>
         <w:lastRenderedPageBreak/>
         <w:t>Chương 3 Thiết kế và triển khai trên AWS Learner Lab</w:t>
@@ -5794,7 +5794,7 @@
       <w:bookmarkStart w:id="73" w:name="_Toc242872842"/>
       <w:bookmarkStart w:id="74" w:name="_Toc242877794"/>
       <w:bookmarkStart w:id="75" w:name="_Toc242877974"/>
-      <w:bookmarkStart w:id="76" w:name="_Toc242962887"/>
+      <w:bookmarkStart w:id="76" w:name="_Toc242966585"/>
       <w:r>
         <w:t>3.1 Danh mục dịch vụ và cấu hình thực tế</w:t>
       </w:r>
@@ -6558,7 +6558,7 @@
       <w:bookmarkStart w:id="80" w:name="_Toc242872843"/>
       <w:bookmarkStart w:id="81" w:name="_Toc242877795"/>
       <w:bookmarkStart w:id="82" w:name="_Toc242877975"/>
-      <w:bookmarkStart w:id="83" w:name="_Toc242962888"/>
+      <w:bookmarkStart w:id="83" w:name="_Toc242966586"/>
       <w:r>
         <w:t>3.2 Dữ liệu và phân vùng S3</w:t>
       </w:r>
@@ -6647,7 +6647,7 @@
       <w:bookmarkStart w:id="87" w:name="_Toc242872844"/>
       <w:bookmarkStart w:id="88" w:name="_Toc242877796"/>
       <w:bookmarkStart w:id="89" w:name="_Toc242877976"/>
-      <w:bookmarkStart w:id="90" w:name="_Toc242962889"/>
+      <w:bookmarkStart w:id="90" w:name="_Toc242966587"/>
       <w:r>
         <w:t>3.3 An toàn cấu hình và vận hành</w:t>
       </w:r>
@@ -6678,7 +6678,7 @@
       <w:bookmarkStart w:id="94" w:name="_Toc242872845"/>
       <w:bookmarkStart w:id="95" w:name="_Toc242877797"/>
       <w:bookmarkStart w:id="96" w:name="_Toc242877977"/>
-      <w:bookmarkStart w:id="97" w:name="_Toc242962890"/>
+      <w:bookmarkStart w:id="97" w:name="_Toc242966588"/>
       <w:r>
         <w:lastRenderedPageBreak/>
         <w:t>3.4 Trình tự xử lý của Lambda</w:t>
@@ -6706,7 +6706,7 @@
         <w:ind w:firstLine="504"/>
       </w:pPr>
       <w:r>
-        <w:t>Phiên bản Tuần 1 nạp dữ liệu lịch sử với past_hours=48, tính số ngày cần truy vấn rồi lấy tối đa 48 mốc cuối trong mảng thời gian. Hàm dùng chỉ số gốc của mảng khi nguồn trả ít mốc hơn dự kiến để giữ thời gian cùng vị trí với giá trị cảm biến. Mỗi bản ghi được gắn record_id có phần ngẫu nhiên; khi thu thập lại cùng thời điểm, cần đối chiếu thành phố và timestamp để xác định phạm vi quan trắc.</w:t>
+        <w:t>Phiên bản Tuần 1 nạp dữ liệu lịch sử với past_hours=48, tính số ngày cần truy vấn rồi lấy tối đa 48 mốc cuối trong mảng thời gian. Hàm dùng chỉ số gốc của mảng khi nguồn trả ít mốc hơn dự kiến để giữ thời gian cùng vị trí với giá trị môi trường. Mỗi bản ghi được gắn record_id có phần ngẫu nhiên; khi thu thập lại cùng thời điểm, cần đối chiếu thành phố và timestamp để xác định phạm vi quan trắc.</w:t>
       </w:r>
     </w:p>
     <w:p>
@@ -6728,7 +6728,7 @@
       <w:bookmarkStart w:id="101" w:name="_Toc242872846"/>
       <w:bookmarkStart w:id="102" w:name="_Toc242877798"/>
       <w:bookmarkStart w:id="103" w:name="_Toc242877978"/>
-      <w:bookmarkStart w:id="104" w:name="_Toc242962891"/>
+      <w:bookmarkStart w:id="104" w:name="_Toc242966589"/>
       <w:r>
         <w:t>3.5 Truy vấn Athena và khả năng tái lập</w:t>
       </w:r>
@@ -7000,7 +7000,7 @@
       <w:bookmarkStart w:id="108" w:name="_Toc242872847"/>
       <w:bookmarkStart w:id="109" w:name="_Toc242877799"/>
       <w:bookmarkStart w:id="110" w:name="_Toc242877979"/>
-      <w:bookmarkStart w:id="111" w:name="_Toc242962892"/>
+      <w:bookmarkStart w:id="111" w:name="_Toc242966590"/>
       <w:r>
         <w:t>3.6 Lược đồ bản ghi và chất lượng dữ liệu</w:t>
       </w:r>
@@ -7705,7 +7705,7 @@
       <w:bookmarkStart w:id="115" w:name="_Toc242872848"/>
       <w:bookmarkStart w:id="116" w:name="_Toc242877800"/>
       <w:bookmarkStart w:id="117" w:name="_Toc242877980"/>
-      <w:bookmarkStart w:id="118" w:name="_Toc242962893"/>
+      <w:bookmarkStart w:id="118" w:name="_Toc242966591"/>
       <w:r>
         <w:lastRenderedPageBreak/>
         <w:t>3.7 Tần suất gọi Open-Meteo và yêu cầu khóa API</w:t>
@@ -7748,7 +7748,7 @@
       <w:bookmarkStart w:id="122" w:name="_Toc242872849"/>
       <w:bookmarkStart w:id="123" w:name="_Toc242877801"/>
       <w:bookmarkStart w:id="124" w:name="_Toc242877981"/>
-      <w:bookmarkStart w:id="125" w:name="_Toc242962894"/>
+      <w:bookmarkStart w:id="125" w:name="_Toc242966592"/>
       <w:r>
         <w:lastRenderedPageBreak/>
         <w:t>Chương 4 Kết quả kiểm tra và phân tích dữ liệu</w:t>
@@ -7771,7 +7771,7 @@
       <w:bookmarkStart w:id="129" w:name="_Toc242872850"/>
       <w:bookmarkStart w:id="130" w:name="_Toc242877802"/>
       <w:bookmarkStart w:id="131" w:name="_Toc242877982"/>
-      <w:bookmarkStart w:id="132" w:name="_Toc242962895"/>
+      <w:bookmarkStart w:id="132" w:name="_Toc242966593"/>
       <w:r>
         <w:t>4.1 Mốc dữ liệu và số đo vận hành AWS</w:t>
       </w:r>
@@ -8473,7 +8473,7 @@
       <w:bookmarkStart w:id="136" w:name="_Toc242872851"/>
       <w:bookmarkStart w:id="137" w:name="_Toc242877803"/>
       <w:bookmarkStart w:id="138" w:name="_Toc242877983"/>
-      <w:bookmarkStart w:id="139" w:name="_Toc242962896"/>
+      <w:bookmarkStart w:id="139" w:name="_Toc242966594"/>
       <w:r>
         <w:lastRenderedPageBreak/>
         <w:t>4.2 So sánh ba đô thị từ Athena</w:t>
@@ -9828,7 +9828,7 @@
       <w:bookmarkStart w:id="143" w:name="_Toc242872852"/>
       <w:bookmarkStart w:id="144" w:name="_Toc242877804"/>
       <w:bookmarkStart w:id="145" w:name="_Toc242877984"/>
-      <w:bookmarkStart w:id="146" w:name="_Toc242962897"/>
+      <w:bookmarkStart w:id="146" w:name="_Toc242966595"/>
       <w:r>
         <w:t>4.3 Biến thiên theo 24 giờ UTC</w:t>
       </w:r>
@@ -13118,7 +13118,7 @@
       <w:bookmarkStart w:id="150" w:name="_Toc242872853"/>
       <w:bookmarkStart w:id="151" w:name="_Toc242877805"/>
       <w:bookmarkStart w:id="152" w:name="_Toc242877985"/>
-      <w:bookmarkStart w:id="153" w:name="_Toc242962898"/>
+      <w:bookmarkStart w:id="153" w:name="_Toc242966596"/>
       <w:r>
         <w:lastRenderedPageBreak/>
         <w:t>4.4 Phân bố cấp chất lượng không khí</w:t>
@@ -13769,7 +13769,7 @@
       <w:bookmarkStart w:id="157" w:name="_Toc242872854"/>
       <w:bookmarkStart w:id="158" w:name="_Toc242877806"/>
       <w:bookmarkStart w:id="159" w:name="_Toc242877986"/>
-      <w:bookmarkStart w:id="160" w:name="_Toc242962899"/>
+      <w:bookmarkStart w:id="160" w:name="_Toc242966597"/>
       <w:r>
         <w:lastRenderedPageBreak/>
         <w:t>4.5 Tương quan PM2.5 với yếu tố khí tượng</w:t>
@@ -14386,7 +14386,7 @@
       <w:bookmarkStart w:id="164" w:name="_Toc242872855"/>
       <w:bookmarkStart w:id="165" w:name="_Toc242877807"/>
       <w:bookmarkStart w:id="166" w:name="_Toc242877987"/>
-      <w:bookmarkStart w:id="167" w:name="_Toc242962900"/>
+      <w:bookmarkStart w:id="167" w:name="_Toc242966598"/>
       <w:r>
         <w:lastRenderedPageBreak/>
         <w:t>4.6 Thời gian và dung lượng quét của năm truy vấn</w:t>
@@ -15302,7 +15302,7 @@
         <w:pStyle w:val="Heading2"/>
         <w:pageBreakBefore/>
       </w:pPr>
-      <w:bookmarkStart w:id="168" w:name="_Toc242962901"/>
+      <w:bookmarkStart w:id="168" w:name="_Toc242966599"/>
       <w:r>
         <w:lastRenderedPageBreak/>
         <w:t>4.7 Phân bố và độ phân tán của AQI và PM2.5</w:t>
@@ -15386,7 +15386,7 @@
       <w:bookmarkStart w:id="172" w:name="_Toc242872856"/>
       <w:bookmarkStart w:id="173" w:name="_Toc242877808"/>
       <w:bookmarkStart w:id="174" w:name="_Toc242877988"/>
-      <w:bookmarkStart w:id="175" w:name="_Toc242962902"/>
+      <w:bookmarkStart w:id="175" w:name="_Toc242966600"/>
       <w:r>
         <w:lastRenderedPageBreak/>
         <w:t>Chương 5 Tổng hợp kết quả và chi phí Tuần 1</w:t>
@@ -15409,7 +15409,7 @@
       <w:bookmarkStart w:id="179" w:name="_Toc242872857"/>
       <w:bookmarkStart w:id="180" w:name="_Toc242877809"/>
       <w:bookmarkStart w:id="181" w:name="_Toc242877989"/>
-      <w:bookmarkStart w:id="182" w:name="_Toc242962903"/>
+      <w:bookmarkStart w:id="182" w:name="_Toc242966601"/>
       <w:r>
         <w:t>5.1 Mức độ hoàn thành theo sản phẩm</w:t>
       </w:r>
@@ -15440,7 +15440,7 @@
       <w:bookmarkStart w:id="186" w:name="_Toc242872858"/>
       <w:bookmarkStart w:id="187" w:name="_Toc242877810"/>
       <w:bookmarkStart w:id="188" w:name="_Toc242877990"/>
-      <w:bookmarkStart w:id="189" w:name="_Toc242962904"/>
+      <w:bookmarkStart w:id="189" w:name="_Toc242966602"/>
       <w:r>
         <w:t>5.2 Quản lý chi phí</w:t>
       </w:r>
@@ -15975,7 +15975,7 @@
         <w:ind w:firstLine="504"/>
       </w:pPr>
       <w:r>
-        <w:t>Dung lượng lưu trữ và số lượt gọi ở mốc quan sát đều nhỏ. Cost Explorer chưa ghi nhận khoản trừ tại các mốc đã quan sát của Tuần 1, nhưng giá trị này không cho phép kết luận tổng chi phí thực tế bằng 0. Số dư Learner Lab không có trong phép đo Cost Explorer.</w:t>
+        <w:t>Dung lượng lưu trữ và số lượt gọi ở mốc quan sát đều nhỏ. Cost Explorer ghi nhận 0 USD tại các mốc quan sát của Tuần 1, nhưng giá trị này không cho phép kết luận tổng chi phí thực tế bằng 0. Số dư Learner Lab không có trong phép đo Cost Explorer.</w:t>
       </w:r>
     </w:p>
     <w:p>
@@ -15988,7 +15988,7 @@
       <w:bookmarkStart w:id="193" w:name="_Toc242872859"/>
       <w:bookmarkStart w:id="194" w:name="_Toc242877811"/>
       <w:bookmarkStart w:id="195" w:name="_Toc242877991"/>
-      <w:bookmarkStart w:id="196" w:name="_Toc242962905"/>
+      <w:bookmarkStart w:id="196" w:name="_Toc242966603"/>
       <w:r>
         <w:t>5.3 Kết luận</w:t>
       </w:r>

</xml_diff>

<commit_message>
docs(reports): add clickable GitHub links to weekly submissions
</commit_message>
<xml_diff>
--- a/tuan_1/docs/Bao_cao_tuan_1_Dien_toan_dam_may_24110054_24110051.docx
+++ b/tuan_1/docs/Bao_cao_tuan_1_Dien_toan_dam_may_24110054_24110051.docx
@@ -455,7 +455,18 @@
           <w:rPr>
             <w:u w:val="single"/>
           </w:rPr>
-          <w:t>https://github.com/JasonTM17/WeatherAWS_FinalTerm.git</w:t>
+          <w:t>https://github.com/JasonTM17/WeatherAWS_FinalTerm</w:t>
+        </w:r>
+      </w:hyperlink>
+      <w:r>
+        <w:t xml:space="preserve">. Báo cáo và dữ liệu: </w:t>
+      </w:r>
+      <w:hyperlink r:id="rId13">
+        <w:r>
+          <w:rPr>
+            <w:u w:val="single"/>
+          </w:rPr>
+          <w:t>Hồ sơ Tuần 1</w:t>
         </w:r>
       </w:hyperlink>
       <w:r>
@@ -534,7 +545,7 @@
         </w:rPr>
         <w:fldChar w:fldCharType="separate"/>
       </w:r>
-      <w:hyperlink w:anchor="_Toc242966575" w:history="1">
+      <w:hyperlink w:anchor="_Toc243031569" w:history="1">
         <w:r>
           <w:rPr>
             <w:rStyle w:val="Hyperlink"/>
@@ -561,7 +572,7 @@
             <w:noProof/>
             <w:webHidden/>
           </w:rPr>
-          <w:instrText xml:space="preserve"> PAGEREF _Toc242966575 \h </w:instrText>
+          <w:instrText xml:space="preserve"> PAGEREF _Toc243031569 \h </w:instrText>
         </w:r>
         <w:r>
           <w:rPr>
@@ -608,7 +619,7 @@
           <w14:ligatures w14:val="standardContextual"/>
         </w:rPr>
       </w:pPr>
-      <w:hyperlink w:anchor="_Toc242966576" w:history="1">
+      <w:hyperlink w:anchor="_Toc243031570" w:history="1">
         <w:r>
           <w:rPr>
             <w:rStyle w:val="Hyperlink"/>
@@ -635,7 +646,7 @@
             <w:noProof/>
             <w:webHidden/>
           </w:rPr>
-          <w:instrText xml:space="preserve"> PAGEREF _Toc242966576 \h </w:instrText>
+          <w:instrText xml:space="preserve"> PAGEREF _Toc243031570 \h </w:instrText>
         </w:r>
         <w:r>
           <w:rPr>
@@ -682,7 +693,7 @@
           <w14:ligatures w14:val="standardContextual"/>
         </w:rPr>
       </w:pPr>
-      <w:hyperlink w:anchor="_Toc242966577" w:history="1">
+      <w:hyperlink w:anchor="_Toc243031571" w:history="1">
         <w:r>
           <w:rPr>
             <w:rStyle w:val="Hyperlink"/>
@@ -709,7 +720,7 @@
             <w:noProof/>
             <w:webHidden/>
           </w:rPr>
-          <w:instrText xml:space="preserve"> PAGEREF _Toc242966577 \h </w:instrText>
+          <w:instrText xml:space="preserve"> PAGEREF _Toc243031571 \h </w:instrText>
         </w:r>
         <w:r>
           <w:rPr>
@@ -756,7 +767,7 @@
           <w14:ligatures w14:val="standardContextual"/>
         </w:rPr>
       </w:pPr>
-      <w:hyperlink w:anchor="_Toc242966578" w:history="1">
+      <w:hyperlink w:anchor="_Toc243031572" w:history="1">
         <w:r>
           <w:rPr>
             <w:rStyle w:val="Hyperlink"/>
@@ -783,7 +794,7 @@
             <w:noProof/>
             <w:webHidden/>
           </w:rPr>
-          <w:instrText xml:space="preserve"> PAGEREF _Toc242966578 \h </w:instrText>
+          <w:instrText xml:space="preserve"> PAGEREF _Toc243031572 \h </w:instrText>
         </w:r>
         <w:r>
           <w:rPr>
@@ -830,7 +841,7 @@
           <w14:ligatures w14:val="standardContextual"/>
         </w:rPr>
       </w:pPr>
-      <w:hyperlink w:anchor="_Toc242966579" w:history="1">
+      <w:hyperlink w:anchor="_Toc243031573" w:history="1">
         <w:r>
           <w:rPr>
             <w:rStyle w:val="Hyperlink"/>
@@ -857,7 +868,7 @@
             <w:noProof/>
             <w:webHidden/>
           </w:rPr>
-          <w:instrText xml:space="preserve"> PAGEREF _Toc242966579 \h </w:instrText>
+          <w:instrText xml:space="preserve"> PAGEREF _Toc243031573 \h </w:instrText>
         </w:r>
         <w:r>
           <w:rPr>
@@ -905,7 +916,7 @@
           <w14:ligatures w14:val="standardContextual"/>
         </w:rPr>
       </w:pPr>
-      <w:hyperlink w:anchor="_Toc242966580" w:history="1">
+      <w:hyperlink w:anchor="_Toc243031574" w:history="1">
         <w:r>
           <w:rPr>
             <w:rStyle w:val="Hyperlink"/>
@@ -932,7 +943,7 @@
             <w:noProof/>
             <w:webHidden/>
           </w:rPr>
-          <w:instrText xml:space="preserve"> PAGEREF _Toc242966580 \h </w:instrText>
+          <w:instrText xml:space="preserve"> PAGEREF _Toc243031574 \h </w:instrText>
         </w:r>
         <w:r>
           <w:rPr>
@@ -979,7 +990,7 @@
           <w14:ligatures w14:val="standardContextual"/>
         </w:rPr>
       </w:pPr>
-      <w:hyperlink w:anchor="_Toc242966581" w:history="1">
+      <w:hyperlink w:anchor="_Toc243031575" w:history="1">
         <w:r>
           <w:rPr>
             <w:rStyle w:val="Hyperlink"/>
@@ -1006,7 +1017,7 @@
             <w:noProof/>
             <w:webHidden/>
           </w:rPr>
-          <w:instrText xml:space="preserve"> PAGEREF _Toc242966581 \h </w:instrText>
+          <w:instrText xml:space="preserve"> PAGEREF _Toc243031575 \h </w:instrText>
         </w:r>
         <w:r>
           <w:rPr>
@@ -1053,7 +1064,7 @@
           <w14:ligatures w14:val="standardContextual"/>
         </w:rPr>
       </w:pPr>
-      <w:hyperlink w:anchor="_Toc242966582" w:history="1">
+      <w:hyperlink w:anchor="_Toc243031576" w:history="1">
         <w:r>
           <w:rPr>
             <w:rStyle w:val="Hyperlink"/>
@@ -1080,7 +1091,7 @@
             <w:noProof/>
             <w:webHidden/>
           </w:rPr>
-          <w:instrText xml:space="preserve"> PAGEREF _Toc242966582 \h </w:instrText>
+          <w:instrText xml:space="preserve"> PAGEREF _Toc243031576 \h </w:instrText>
         </w:r>
         <w:r>
           <w:rPr>
@@ -1127,7 +1138,7 @@
           <w14:ligatures w14:val="standardContextual"/>
         </w:rPr>
       </w:pPr>
-      <w:hyperlink w:anchor="_Toc242966583" w:history="1">
+      <w:hyperlink w:anchor="_Toc243031577" w:history="1">
         <w:r>
           <w:rPr>
             <w:rStyle w:val="Hyperlink"/>
@@ -1154,7 +1165,7 @@
             <w:noProof/>
             <w:webHidden/>
           </w:rPr>
-          <w:instrText xml:space="preserve"> PAGEREF _Toc242966583 \h </w:instrText>
+          <w:instrText xml:space="preserve"> PAGEREF _Toc243031577 \h </w:instrText>
         </w:r>
         <w:r>
           <w:rPr>
@@ -1202,7 +1213,7 @@
           <w14:ligatures w14:val="standardContextual"/>
         </w:rPr>
       </w:pPr>
-      <w:hyperlink w:anchor="_Toc242966584" w:history="1">
+      <w:hyperlink w:anchor="_Toc243031578" w:history="1">
         <w:r>
           <w:rPr>
             <w:rStyle w:val="Hyperlink"/>
@@ -1229,7 +1240,7 @@
             <w:noProof/>
             <w:webHidden/>
           </w:rPr>
-          <w:instrText xml:space="preserve"> PAGEREF _Toc242966584 \h </w:instrText>
+          <w:instrText xml:space="preserve"> PAGEREF _Toc243031578 \h </w:instrText>
         </w:r>
         <w:r>
           <w:rPr>
@@ -1276,7 +1287,7 @@
           <w14:ligatures w14:val="standardContextual"/>
         </w:rPr>
       </w:pPr>
-      <w:hyperlink w:anchor="_Toc242966585" w:history="1">
+      <w:hyperlink w:anchor="_Toc243031579" w:history="1">
         <w:r>
           <w:rPr>
             <w:rStyle w:val="Hyperlink"/>
@@ -1303,7 +1314,7 @@
             <w:noProof/>
             <w:webHidden/>
           </w:rPr>
-          <w:instrText xml:space="preserve"> PAGEREF _Toc242966585 \h </w:instrText>
+          <w:instrText xml:space="preserve"> PAGEREF _Toc243031579 \h </w:instrText>
         </w:r>
         <w:r>
           <w:rPr>
@@ -1350,7 +1361,7 @@
           <w14:ligatures w14:val="standardContextual"/>
         </w:rPr>
       </w:pPr>
-      <w:hyperlink w:anchor="_Toc242966586" w:history="1">
+      <w:hyperlink w:anchor="_Toc243031580" w:history="1">
         <w:r>
           <w:rPr>
             <w:rStyle w:val="Hyperlink"/>
@@ -1377,7 +1388,7 @@
             <w:noProof/>
             <w:webHidden/>
           </w:rPr>
-          <w:instrText xml:space="preserve"> PAGEREF _Toc242966586 \h </w:instrText>
+          <w:instrText xml:space="preserve"> PAGEREF _Toc243031580 \h </w:instrText>
         </w:r>
         <w:r>
           <w:rPr>
@@ -1424,7 +1435,7 @@
           <w14:ligatures w14:val="standardContextual"/>
         </w:rPr>
       </w:pPr>
-      <w:hyperlink w:anchor="_Toc242966587" w:history="1">
+      <w:hyperlink w:anchor="_Toc243031581" w:history="1">
         <w:r>
           <w:rPr>
             <w:rStyle w:val="Hyperlink"/>
@@ -1451,7 +1462,7 @@
             <w:noProof/>
             <w:webHidden/>
           </w:rPr>
-          <w:instrText xml:space="preserve"> PAGEREF _Toc242966587 \h </w:instrText>
+          <w:instrText xml:space="preserve"> PAGEREF _Toc243031581 \h </w:instrText>
         </w:r>
         <w:r>
           <w:rPr>
@@ -1498,7 +1509,7 @@
           <w14:ligatures w14:val="standardContextual"/>
         </w:rPr>
       </w:pPr>
-      <w:hyperlink w:anchor="_Toc242966588" w:history="1">
+      <w:hyperlink w:anchor="_Toc243031582" w:history="1">
         <w:r>
           <w:rPr>
             <w:rStyle w:val="Hyperlink"/>
@@ -1525,7 +1536,7 @@
             <w:noProof/>
             <w:webHidden/>
           </w:rPr>
-          <w:instrText xml:space="preserve"> PAGEREF _Toc242966588 \h </w:instrText>
+          <w:instrText xml:space="preserve"> PAGEREF _Toc243031582 \h </w:instrText>
         </w:r>
         <w:r>
           <w:rPr>
@@ -1572,7 +1583,7 @@
           <w14:ligatures w14:val="standardContextual"/>
         </w:rPr>
       </w:pPr>
-      <w:hyperlink w:anchor="_Toc242966589" w:history="1">
+      <w:hyperlink w:anchor="_Toc243031583" w:history="1">
         <w:r>
           <w:rPr>
             <w:rStyle w:val="Hyperlink"/>
@@ -1599,7 +1610,7 @@
             <w:noProof/>
             <w:webHidden/>
           </w:rPr>
-          <w:instrText xml:space="preserve"> PAGEREF _Toc242966589 \h </w:instrText>
+          <w:instrText xml:space="preserve"> PAGEREF _Toc243031583 \h </w:instrText>
         </w:r>
         <w:r>
           <w:rPr>
@@ -1646,7 +1657,7 @@
           <w14:ligatures w14:val="standardContextual"/>
         </w:rPr>
       </w:pPr>
-      <w:hyperlink w:anchor="_Toc242966590" w:history="1">
+      <w:hyperlink w:anchor="_Toc243031584" w:history="1">
         <w:r>
           <w:rPr>
             <w:rStyle w:val="Hyperlink"/>
@@ -1673,7 +1684,7 @@
             <w:noProof/>
             <w:webHidden/>
           </w:rPr>
-          <w:instrText xml:space="preserve"> PAGEREF _Toc242966590 \h </w:instrText>
+          <w:instrText xml:space="preserve"> PAGEREF _Toc243031584 \h </w:instrText>
         </w:r>
         <w:r>
           <w:rPr>
@@ -1720,7 +1731,7 @@
           <w14:ligatures w14:val="standardContextual"/>
         </w:rPr>
       </w:pPr>
-      <w:hyperlink w:anchor="_Toc242966591" w:history="1">
+      <w:hyperlink w:anchor="_Toc243031585" w:history="1">
         <w:r>
           <w:rPr>
             <w:rStyle w:val="Hyperlink"/>
@@ -1747,7 +1758,7 @@
             <w:noProof/>
             <w:webHidden/>
           </w:rPr>
-          <w:instrText xml:space="preserve"> PAGEREF _Toc242966591 \h </w:instrText>
+          <w:instrText xml:space="preserve"> PAGEREF _Toc243031585 \h </w:instrText>
         </w:r>
         <w:r>
           <w:rPr>
@@ -1795,7 +1806,7 @@
           <w14:ligatures w14:val="standardContextual"/>
         </w:rPr>
       </w:pPr>
-      <w:hyperlink w:anchor="_Toc242966592" w:history="1">
+      <w:hyperlink w:anchor="_Toc243031586" w:history="1">
         <w:r>
           <w:rPr>
             <w:rStyle w:val="Hyperlink"/>
@@ -1822,7 +1833,7 @@
             <w:noProof/>
             <w:webHidden/>
           </w:rPr>
-          <w:instrText xml:space="preserve"> PAGEREF _Toc242966592 \h </w:instrText>
+          <w:instrText xml:space="preserve"> PAGEREF _Toc243031586 \h </w:instrText>
         </w:r>
         <w:r>
           <w:rPr>
@@ -1869,7 +1880,7 @@
           <w14:ligatures w14:val="standardContextual"/>
         </w:rPr>
       </w:pPr>
-      <w:hyperlink w:anchor="_Toc242966593" w:history="1">
+      <w:hyperlink w:anchor="_Toc243031587" w:history="1">
         <w:r>
           <w:rPr>
             <w:rStyle w:val="Hyperlink"/>
@@ -1896,7 +1907,7 @@
             <w:noProof/>
             <w:webHidden/>
           </w:rPr>
-          <w:instrText xml:space="preserve"> PAGEREF _Toc242966593 \h </w:instrText>
+          <w:instrText xml:space="preserve"> PAGEREF _Toc243031587 \h </w:instrText>
         </w:r>
         <w:r>
           <w:rPr>
@@ -1943,7 +1954,7 @@
           <w14:ligatures w14:val="standardContextual"/>
         </w:rPr>
       </w:pPr>
-      <w:hyperlink w:anchor="_Toc242966594" w:history="1">
+      <w:hyperlink w:anchor="_Toc243031588" w:history="1">
         <w:r>
           <w:rPr>
             <w:rStyle w:val="Hyperlink"/>
@@ -1970,7 +1981,7 @@
             <w:noProof/>
             <w:webHidden/>
           </w:rPr>
-          <w:instrText xml:space="preserve"> PAGEREF _Toc242966594 \h </w:instrText>
+          <w:instrText xml:space="preserve"> PAGEREF _Toc243031588 \h </w:instrText>
         </w:r>
         <w:r>
           <w:rPr>
@@ -2017,7 +2028,7 @@
           <w14:ligatures w14:val="standardContextual"/>
         </w:rPr>
       </w:pPr>
-      <w:hyperlink w:anchor="_Toc242966595" w:history="1">
+      <w:hyperlink w:anchor="_Toc243031589" w:history="1">
         <w:r>
           <w:rPr>
             <w:rStyle w:val="Hyperlink"/>
@@ -2044,7 +2055,7 @@
             <w:noProof/>
             <w:webHidden/>
           </w:rPr>
-          <w:instrText xml:space="preserve"> PAGEREF _Toc242966595 \h </w:instrText>
+          <w:instrText xml:space="preserve"> PAGEREF _Toc243031589 \h </w:instrText>
         </w:r>
         <w:r>
           <w:rPr>
@@ -2091,7 +2102,7 @@
           <w14:ligatures w14:val="standardContextual"/>
         </w:rPr>
       </w:pPr>
-      <w:hyperlink w:anchor="_Toc242966596" w:history="1">
+      <w:hyperlink w:anchor="_Toc243031590" w:history="1">
         <w:r>
           <w:rPr>
             <w:rStyle w:val="Hyperlink"/>
@@ -2118,7 +2129,7 @@
             <w:noProof/>
             <w:webHidden/>
           </w:rPr>
-          <w:instrText xml:space="preserve"> PAGEREF _Toc242966596 \h </w:instrText>
+          <w:instrText xml:space="preserve"> PAGEREF _Toc243031590 \h </w:instrText>
         </w:r>
         <w:r>
           <w:rPr>
@@ -2165,7 +2176,7 @@
           <w14:ligatures w14:val="standardContextual"/>
         </w:rPr>
       </w:pPr>
-      <w:hyperlink w:anchor="_Toc242966597" w:history="1">
+      <w:hyperlink w:anchor="_Toc243031591" w:history="1">
         <w:r>
           <w:rPr>
             <w:rStyle w:val="Hyperlink"/>
@@ -2192,7 +2203,7 @@
             <w:noProof/>
             <w:webHidden/>
           </w:rPr>
-          <w:instrText xml:space="preserve"> PAGEREF _Toc242966597 \h </w:instrText>
+          <w:instrText xml:space="preserve"> PAGEREF _Toc243031591 \h </w:instrText>
         </w:r>
         <w:r>
           <w:rPr>
@@ -2239,7 +2250,7 @@
           <w14:ligatures w14:val="standardContextual"/>
         </w:rPr>
       </w:pPr>
-      <w:hyperlink w:anchor="_Toc242966598" w:history="1">
+      <w:hyperlink w:anchor="_Toc243031592" w:history="1">
         <w:r>
           <w:rPr>
             <w:rStyle w:val="Hyperlink"/>
@@ -2266,7 +2277,7 @@
             <w:noProof/>
             <w:webHidden/>
           </w:rPr>
-          <w:instrText xml:space="preserve"> PAGEREF _Toc242966598 \h </w:instrText>
+          <w:instrText xml:space="preserve"> PAGEREF _Toc243031592 \h </w:instrText>
         </w:r>
         <w:r>
           <w:rPr>
@@ -2313,7 +2324,7 @@
           <w14:ligatures w14:val="standardContextual"/>
         </w:rPr>
       </w:pPr>
-      <w:hyperlink w:anchor="_Toc242966599" w:history="1">
+      <w:hyperlink w:anchor="_Toc243031593" w:history="1">
         <w:r>
           <w:rPr>
             <w:rStyle w:val="Hyperlink"/>
@@ -2340,7 +2351,7 @@
             <w:noProof/>
             <w:webHidden/>
           </w:rPr>
-          <w:instrText xml:space="preserve"> PAGEREF _Toc242966599 \h </w:instrText>
+          <w:instrText xml:space="preserve"> PAGEREF _Toc243031593 \h </w:instrText>
         </w:r>
         <w:r>
           <w:rPr>
@@ -2388,7 +2399,7 @@
           <w14:ligatures w14:val="standardContextual"/>
         </w:rPr>
       </w:pPr>
-      <w:hyperlink w:anchor="_Toc242966600" w:history="1">
+      <w:hyperlink w:anchor="_Toc243031594" w:history="1">
         <w:r>
           <w:rPr>
             <w:rStyle w:val="Hyperlink"/>
@@ -2415,7 +2426,7 @@
             <w:noProof/>
             <w:webHidden/>
           </w:rPr>
-          <w:instrText xml:space="preserve"> PAGEREF _Toc242966600 \h </w:instrText>
+          <w:instrText xml:space="preserve"> PAGEREF _Toc243031594 \h </w:instrText>
         </w:r>
         <w:r>
           <w:rPr>
@@ -2462,7 +2473,7 @@
           <w14:ligatures w14:val="standardContextual"/>
         </w:rPr>
       </w:pPr>
-      <w:hyperlink w:anchor="_Toc242966601" w:history="1">
+      <w:hyperlink w:anchor="_Toc243031595" w:history="1">
         <w:r>
           <w:rPr>
             <w:rStyle w:val="Hyperlink"/>
@@ -2489,7 +2500,7 @@
             <w:noProof/>
             <w:webHidden/>
           </w:rPr>
-          <w:instrText xml:space="preserve"> PAGEREF _Toc242966601 \h </w:instrText>
+          <w:instrText xml:space="preserve"> PAGEREF _Toc243031595 \h </w:instrText>
         </w:r>
         <w:r>
           <w:rPr>
@@ -2536,7 +2547,7 @@
           <w14:ligatures w14:val="standardContextual"/>
         </w:rPr>
       </w:pPr>
-      <w:hyperlink w:anchor="_Toc242966602" w:history="1">
+      <w:hyperlink w:anchor="_Toc243031596" w:history="1">
         <w:r>
           <w:rPr>
             <w:rStyle w:val="Hyperlink"/>
@@ -2563,7 +2574,7 @@
             <w:noProof/>
             <w:webHidden/>
           </w:rPr>
-          <w:instrText xml:space="preserve"> PAGEREF _Toc242966602 \h </w:instrText>
+          <w:instrText xml:space="preserve"> PAGEREF _Toc243031596 \h </w:instrText>
         </w:r>
         <w:r>
           <w:rPr>
@@ -2610,7 +2621,7 @@
           <w14:ligatures w14:val="standardContextual"/>
         </w:rPr>
       </w:pPr>
-      <w:hyperlink w:anchor="_Toc242966603" w:history="1">
+      <w:hyperlink w:anchor="_Toc243031597" w:history="1">
         <w:r>
           <w:rPr>
             <w:rStyle w:val="Hyperlink"/>
@@ -2637,7 +2648,7 @@
             <w:noProof/>
             <w:webHidden/>
           </w:rPr>
-          <w:instrText xml:space="preserve"> PAGEREF _Toc242966603 \h </w:instrText>
+          <w:instrText xml:space="preserve"> PAGEREF _Toc243031597 \h </w:instrText>
         </w:r>
         <w:r>
           <w:rPr>
@@ -2671,7 +2682,7 @@
     <w:p>
       <w:pPr>
         <w:sectPr>
-          <w:footerReference w:type="default" r:id="rId13"/>
+          <w:footerReference w:type="default" r:id="rId14"/>
           <w:pgSz w:w="12240" w:h="15840"/>
           <w:pgMar w:top="1224" w:right="1080" w:bottom="1080" w:left="1224" w:header="432" w:footer="576" w:gutter="0"/>
           <w:pgNumType w:fmt="lowerRoman" w:start="1"/>
@@ -2699,7 +2710,7 @@
       <w:bookmarkStart w:id="3" w:name="_Toc242872832"/>
       <w:bookmarkStart w:id="4" w:name="_Toc242877784"/>
       <w:bookmarkStart w:id="5" w:name="_Toc242877964"/>
-      <w:bookmarkStart w:id="6" w:name="_Toc242966575"/>
+      <w:bookmarkStart w:id="6" w:name="_Toc243031569"/>
       <w:r>
         <w:lastRenderedPageBreak/>
         <w:t>Chương 1 Tổng quan đề tài và yêu cầu học phần</w:t>
@@ -2722,7 +2733,7 @@
       <w:bookmarkStart w:id="10" w:name="_Toc242872833"/>
       <w:bookmarkStart w:id="11" w:name="_Toc242877785"/>
       <w:bookmarkStart w:id="12" w:name="_Toc242877965"/>
-      <w:bookmarkStart w:id="13" w:name="_Toc242966576"/>
+      <w:bookmarkStart w:id="13" w:name="_Toc243031570"/>
       <w:r>
         <w:t>1.1 Bối cảnh, mục tiêu và phạm vi</w:t>
       </w:r>
@@ -2805,7 +2816,7 @@
       <w:bookmarkStart w:id="17" w:name="_Toc242872834"/>
       <w:bookmarkStart w:id="18" w:name="_Toc242877786"/>
       <w:bookmarkStart w:id="19" w:name="_Toc242877966"/>
-      <w:bookmarkStart w:id="20" w:name="_Toc242966577"/>
+      <w:bookmarkStart w:id="20" w:name="_Toc243031571"/>
       <w:r>
         <w:t>1.2 Yêu cầu chức năng và kết quả triển khai</w:t>
       </w:r>
@@ -3413,7 +3424,7 @@
       <w:bookmarkStart w:id="24" w:name="_Toc242872835"/>
       <w:bookmarkStart w:id="25" w:name="_Toc242877787"/>
       <w:bookmarkStart w:id="26" w:name="_Toc242877967"/>
-      <w:bookmarkStart w:id="27" w:name="_Toc242966578"/>
+      <w:bookmarkStart w:id="27" w:name="_Toc243031572"/>
       <w:r>
         <w:lastRenderedPageBreak/>
         <w:t>1.3 Kiến trúc tổng thể</w:t>
@@ -3452,7 +3463,7 @@
                     <pic:cNvPicPr/>
                   </pic:nvPicPr>
                   <pic:blipFill>
-                    <a:blip r:embed="rId14"/>
+                    <a:blip r:embed="rId15"/>
                     <a:stretch>
                       <a:fillRect/>
                     </a:stretch>
@@ -3503,7 +3514,7 @@
       <w:bookmarkStart w:id="31" w:name="_Toc242872836"/>
       <w:bookmarkStart w:id="32" w:name="_Toc242877788"/>
       <w:bookmarkStart w:id="33" w:name="_Toc242877968"/>
-      <w:bookmarkStart w:id="34" w:name="_Toc242966579"/>
+      <w:bookmarkStart w:id="34" w:name="_Toc243031573"/>
       <w:r>
         <w:lastRenderedPageBreak/>
         <w:t>1.4 Nguồn số liệu và mốc đo</w:t>
@@ -4392,7 +4403,7 @@
       <w:bookmarkStart w:id="38" w:name="_Toc242872837"/>
       <w:bookmarkStart w:id="39" w:name="_Toc242877789"/>
       <w:bookmarkStart w:id="40" w:name="_Toc242877969"/>
-      <w:bookmarkStart w:id="41" w:name="_Toc242966580"/>
+      <w:bookmarkStart w:id="41" w:name="_Toc243031574"/>
       <w:r>
         <w:lastRenderedPageBreak/>
         <w:t>Chương 2 Báo cáo tiến độ Tuần 1</w:t>
@@ -4424,7 +4435,7 @@
       <w:bookmarkStart w:id="45" w:name="_Toc242872838"/>
       <w:bookmarkStart w:id="46" w:name="_Toc242877790"/>
       <w:bookmarkStart w:id="47" w:name="_Toc242877970"/>
-      <w:bookmarkStart w:id="48" w:name="_Toc242966581"/>
+      <w:bookmarkStart w:id="48" w:name="_Toc243031575"/>
       <w:r>
         <w:t>2.1 Mục tiêu và phân công thực hiện</w:t>
       </w:r>
@@ -4760,7 +4771,7 @@
       <w:bookmarkStart w:id="52" w:name="_Toc242872839"/>
       <w:bookmarkStart w:id="53" w:name="_Toc242877791"/>
       <w:bookmarkStart w:id="54" w:name="_Toc242877971"/>
-      <w:bookmarkStart w:id="55" w:name="_Toc242966582"/>
+      <w:bookmarkStart w:id="55" w:name="_Toc243031576"/>
       <w:r>
         <w:t>2.2 Phạm vi và luồng dữ liệu đo</w:t>
       </w:r>
@@ -5230,7 +5241,7 @@
       <w:bookmarkStart w:id="59" w:name="_Toc242872840"/>
       <w:bookmarkStart w:id="60" w:name="_Toc242877792"/>
       <w:bookmarkStart w:id="61" w:name="_Toc242877972"/>
-      <w:bookmarkStart w:id="62" w:name="_Toc242966583"/>
+      <w:bookmarkStart w:id="62" w:name="_Toc243031577"/>
       <w:r>
         <w:t>2.3 Kết quả định lượng</w:t>
       </w:r>
@@ -5771,7 +5782,7 @@
       <w:bookmarkStart w:id="66" w:name="_Toc242872841"/>
       <w:bookmarkStart w:id="67" w:name="_Toc242877793"/>
       <w:bookmarkStart w:id="68" w:name="_Toc242877973"/>
-      <w:bookmarkStart w:id="69" w:name="_Toc242966584"/>
+      <w:bookmarkStart w:id="69" w:name="_Toc243031578"/>
       <w:r>
         <w:lastRenderedPageBreak/>
         <w:t>Chương 3 Thiết kế và triển khai trên AWS Learner Lab</w:t>
@@ -5794,7 +5805,7 @@
       <w:bookmarkStart w:id="73" w:name="_Toc242872842"/>
       <w:bookmarkStart w:id="74" w:name="_Toc242877794"/>
       <w:bookmarkStart w:id="75" w:name="_Toc242877974"/>
-      <w:bookmarkStart w:id="76" w:name="_Toc242966585"/>
+      <w:bookmarkStart w:id="76" w:name="_Toc243031579"/>
       <w:r>
         <w:t>3.1 Danh mục dịch vụ và cấu hình thực tế</w:t>
       </w:r>
@@ -6558,7 +6569,7 @@
       <w:bookmarkStart w:id="80" w:name="_Toc242872843"/>
       <w:bookmarkStart w:id="81" w:name="_Toc242877795"/>
       <w:bookmarkStart w:id="82" w:name="_Toc242877975"/>
-      <w:bookmarkStart w:id="83" w:name="_Toc242966586"/>
+      <w:bookmarkStart w:id="83" w:name="_Toc243031580"/>
       <w:r>
         <w:t>3.2 Dữ liệu và phân vùng S3</w:t>
       </w:r>
@@ -6647,7 +6658,7 @@
       <w:bookmarkStart w:id="87" w:name="_Toc242872844"/>
       <w:bookmarkStart w:id="88" w:name="_Toc242877796"/>
       <w:bookmarkStart w:id="89" w:name="_Toc242877976"/>
-      <w:bookmarkStart w:id="90" w:name="_Toc242966587"/>
+      <w:bookmarkStart w:id="90" w:name="_Toc243031581"/>
       <w:r>
         <w:t>3.3 An toàn cấu hình và vận hành</w:t>
       </w:r>
@@ -6678,7 +6689,7 @@
       <w:bookmarkStart w:id="94" w:name="_Toc242872845"/>
       <w:bookmarkStart w:id="95" w:name="_Toc242877797"/>
       <w:bookmarkStart w:id="96" w:name="_Toc242877977"/>
-      <w:bookmarkStart w:id="97" w:name="_Toc242966588"/>
+      <w:bookmarkStart w:id="97" w:name="_Toc243031582"/>
       <w:r>
         <w:lastRenderedPageBreak/>
         <w:t>3.4 Trình tự xử lý của Lambda</w:t>
@@ -6728,7 +6739,7 @@
       <w:bookmarkStart w:id="101" w:name="_Toc242872846"/>
       <w:bookmarkStart w:id="102" w:name="_Toc242877798"/>
       <w:bookmarkStart w:id="103" w:name="_Toc242877978"/>
-      <w:bookmarkStart w:id="104" w:name="_Toc242966589"/>
+      <w:bookmarkStart w:id="104" w:name="_Toc243031583"/>
       <w:r>
         <w:t>3.5 Truy vấn Athena và khả năng tái lập</w:t>
       </w:r>
@@ -7000,7 +7011,7 @@
       <w:bookmarkStart w:id="108" w:name="_Toc242872847"/>
       <w:bookmarkStart w:id="109" w:name="_Toc242877799"/>
       <w:bookmarkStart w:id="110" w:name="_Toc242877979"/>
-      <w:bookmarkStart w:id="111" w:name="_Toc242966590"/>
+      <w:bookmarkStart w:id="111" w:name="_Toc243031584"/>
       <w:r>
         <w:t>3.6 Lược đồ bản ghi và chất lượng dữ liệu</w:t>
       </w:r>
@@ -7705,7 +7716,7 @@
       <w:bookmarkStart w:id="115" w:name="_Toc242872848"/>
       <w:bookmarkStart w:id="116" w:name="_Toc242877800"/>
       <w:bookmarkStart w:id="117" w:name="_Toc242877980"/>
-      <w:bookmarkStart w:id="118" w:name="_Toc242966591"/>
+      <w:bookmarkStart w:id="118" w:name="_Toc243031585"/>
       <w:r>
         <w:lastRenderedPageBreak/>
         <w:t>3.7 Tần suất gọi Open-Meteo và yêu cầu khóa API</w:t>
@@ -7748,7 +7759,7 @@
       <w:bookmarkStart w:id="122" w:name="_Toc242872849"/>
       <w:bookmarkStart w:id="123" w:name="_Toc242877801"/>
       <w:bookmarkStart w:id="124" w:name="_Toc242877981"/>
-      <w:bookmarkStart w:id="125" w:name="_Toc242966592"/>
+      <w:bookmarkStart w:id="125" w:name="_Toc243031586"/>
       <w:r>
         <w:lastRenderedPageBreak/>
         <w:t>Chương 4 Kết quả kiểm tra và phân tích dữ liệu</w:t>
@@ -7771,7 +7782,7 @@
       <w:bookmarkStart w:id="129" w:name="_Toc242872850"/>
       <w:bookmarkStart w:id="130" w:name="_Toc242877802"/>
       <w:bookmarkStart w:id="131" w:name="_Toc242877982"/>
-      <w:bookmarkStart w:id="132" w:name="_Toc242966593"/>
+      <w:bookmarkStart w:id="132" w:name="_Toc243031587"/>
       <w:r>
         <w:t>4.1 Mốc dữ liệu và số đo vận hành AWS</w:t>
       </w:r>
@@ -8473,7 +8484,7 @@
       <w:bookmarkStart w:id="136" w:name="_Toc242872851"/>
       <w:bookmarkStart w:id="137" w:name="_Toc242877803"/>
       <w:bookmarkStart w:id="138" w:name="_Toc242877983"/>
-      <w:bookmarkStart w:id="139" w:name="_Toc242966594"/>
+      <w:bookmarkStart w:id="139" w:name="_Toc243031588"/>
       <w:r>
         <w:lastRenderedPageBreak/>
         <w:t>4.2 So sánh ba đô thị từ Athena</w:t>
@@ -9636,7 +9647,7 @@
                     <pic:cNvPicPr/>
                   </pic:nvPicPr>
                   <pic:blipFill>
-                    <a:blip r:embed="rId15"/>
+                    <a:blip r:embed="rId16"/>
                     <a:stretch>
                       <a:fillRect/>
                     </a:stretch>
@@ -9712,7 +9723,7 @@
                     <pic:cNvPicPr/>
                   </pic:nvPicPr>
                   <pic:blipFill>
-                    <a:blip r:embed="rId16"/>
+                    <a:blip r:embed="rId17"/>
                     <a:stretch>
                       <a:fillRect/>
                     </a:stretch>
@@ -9779,7 +9790,7 @@
                     <pic:cNvPicPr/>
                   </pic:nvPicPr>
                   <pic:blipFill>
-                    <a:blip r:embed="rId17"/>
+                    <a:blip r:embed="rId18"/>
                     <a:stretch>
                       <a:fillRect/>
                     </a:stretch>
@@ -9828,7 +9839,7 @@
       <w:bookmarkStart w:id="143" w:name="_Toc242872852"/>
       <w:bookmarkStart w:id="144" w:name="_Toc242877804"/>
       <w:bookmarkStart w:id="145" w:name="_Toc242877984"/>
-      <w:bookmarkStart w:id="146" w:name="_Toc242966595"/>
+      <w:bookmarkStart w:id="146" w:name="_Toc243031589"/>
       <w:r>
         <w:t>4.3 Biến thiên theo 24 giờ UTC</w:t>
       </w:r>
@@ -9866,7 +9877,7 @@
                     <pic:cNvPicPr/>
                   </pic:nvPicPr>
                   <pic:blipFill>
-                    <a:blip r:embed="rId18"/>
+                    <a:blip r:embed="rId19"/>
                     <a:stretch>
                       <a:fillRect/>
                     </a:stretch>
@@ -13118,7 +13129,7 @@
       <w:bookmarkStart w:id="150" w:name="_Toc242872853"/>
       <w:bookmarkStart w:id="151" w:name="_Toc242877805"/>
       <w:bookmarkStart w:id="152" w:name="_Toc242877985"/>
-      <w:bookmarkStart w:id="153" w:name="_Toc242966596"/>
+      <w:bookmarkStart w:id="153" w:name="_Toc243031590"/>
       <w:r>
         <w:lastRenderedPageBreak/>
         <w:t>4.4 Phân bố cấp chất lượng không khí</w:t>
@@ -13157,7 +13168,7 @@
                     <pic:cNvPicPr/>
                   </pic:nvPicPr>
                   <pic:blipFill>
-                    <a:blip r:embed="rId19"/>
+                    <a:blip r:embed="rId20"/>
                     <a:stretch>
                       <a:fillRect/>
                     </a:stretch>
@@ -13769,7 +13780,7 @@
       <w:bookmarkStart w:id="157" w:name="_Toc242872854"/>
       <w:bookmarkStart w:id="158" w:name="_Toc242877806"/>
       <w:bookmarkStart w:id="159" w:name="_Toc242877986"/>
-      <w:bookmarkStart w:id="160" w:name="_Toc242966597"/>
+      <w:bookmarkStart w:id="160" w:name="_Toc243031591"/>
       <w:r>
         <w:lastRenderedPageBreak/>
         <w:t>4.5 Tương quan PM2.5 với yếu tố khí tượng</w:t>
@@ -13808,7 +13819,7 @@
                     <pic:cNvPicPr/>
                   </pic:nvPicPr>
                   <pic:blipFill>
-                    <a:blip r:embed="rId20"/>
+                    <a:blip r:embed="rId21"/>
                     <a:stretch>
                       <a:fillRect/>
                     </a:stretch>
@@ -14336,7 +14347,7 @@
                     <pic:cNvPicPr/>
                   </pic:nvPicPr>
                   <pic:blipFill>
-                    <a:blip r:embed="rId21"/>
+                    <a:blip r:embed="rId22"/>
                     <a:stretch>
                       <a:fillRect/>
                     </a:stretch>
@@ -14386,7 +14397,7 @@
       <w:bookmarkStart w:id="164" w:name="_Toc242872855"/>
       <w:bookmarkStart w:id="165" w:name="_Toc242877807"/>
       <w:bookmarkStart w:id="166" w:name="_Toc242877987"/>
-      <w:bookmarkStart w:id="167" w:name="_Toc242966598"/>
+      <w:bookmarkStart w:id="167" w:name="_Toc243031592"/>
       <w:r>
         <w:lastRenderedPageBreak/>
         <w:t>4.6 Thời gian và dung lượng quét của năm truy vấn</w:t>
@@ -15258,7 +15269,7 @@
                     <pic:cNvPicPr/>
                   </pic:nvPicPr>
                   <pic:blipFill>
-                    <a:blip r:embed="rId22"/>
+                    <a:blip r:embed="rId23"/>
                     <a:stretch>
                       <a:fillRect/>
                     </a:stretch>
@@ -15302,7 +15313,7 @@
         <w:pStyle w:val="Heading2"/>
         <w:pageBreakBefore/>
       </w:pPr>
-      <w:bookmarkStart w:id="168" w:name="_Toc242966599"/>
+      <w:bookmarkStart w:id="168" w:name="_Toc243031593"/>
       <w:r>
         <w:lastRenderedPageBreak/>
         <w:t>4.7 Phân bố và độ phân tán của AQI và PM2.5</w:t>
@@ -15335,7 +15346,7 @@
                     <pic:cNvPicPr/>
                   </pic:nvPicPr>
                   <pic:blipFill>
-                    <a:blip r:embed="rId23"/>
+                    <a:blip r:embed="rId24"/>
                     <a:stretch>
                       <a:fillRect/>
                     </a:stretch>
@@ -15386,7 +15397,7 @@
       <w:bookmarkStart w:id="172" w:name="_Toc242872856"/>
       <w:bookmarkStart w:id="173" w:name="_Toc242877808"/>
       <w:bookmarkStart w:id="174" w:name="_Toc242877988"/>
-      <w:bookmarkStart w:id="175" w:name="_Toc242966600"/>
+      <w:bookmarkStart w:id="175" w:name="_Toc243031594"/>
       <w:r>
         <w:lastRenderedPageBreak/>
         <w:t>Chương 5 Tổng hợp kết quả và chi phí Tuần 1</w:t>
@@ -15409,7 +15420,7 @@
       <w:bookmarkStart w:id="179" w:name="_Toc242872857"/>
       <w:bookmarkStart w:id="180" w:name="_Toc242877809"/>
       <w:bookmarkStart w:id="181" w:name="_Toc242877989"/>
-      <w:bookmarkStart w:id="182" w:name="_Toc242966601"/>
+      <w:bookmarkStart w:id="182" w:name="_Toc243031595"/>
       <w:r>
         <w:t>5.1 Mức độ hoàn thành theo sản phẩm</w:t>
       </w:r>
@@ -15440,7 +15451,7 @@
       <w:bookmarkStart w:id="186" w:name="_Toc242872858"/>
       <w:bookmarkStart w:id="187" w:name="_Toc242877810"/>
       <w:bookmarkStart w:id="188" w:name="_Toc242877990"/>
-      <w:bookmarkStart w:id="189" w:name="_Toc242966602"/>
+      <w:bookmarkStart w:id="189" w:name="_Toc243031596"/>
       <w:r>
         <w:t>5.2 Quản lý chi phí</w:t>
       </w:r>
@@ -15988,7 +15999,7 @@
       <w:bookmarkStart w:id="193" w:name="_Toc242872859"/>
       <w:bookmarkStart w:id="194" w:name="_Toc242877811"/>
       <w:bookmarkStart w:id="195" w:name="_Toc242877991"/>
-      <w:bookmarkStart w:id="196" w:name="_Toc242966603"/>
+      <w:bookmarkStart w:id="196" w:name="_Toc243031597"/>
       <w:r>
         <w:t>5.3 Kết luận</w:t>
       </w:r>

</xml_diff>

<commit_message>
docs(reports): complete direct evidence links across weekly submissions
</commit_message>
<xml_diff>
--- a/tuan_1/docs/Bao_cao_tuan_1_Dien_toan_dam_may_24110054_24110051.docx
+++ b/tuan_1/docs/Bao_cao_tuan_1_Dien_toan_dam_may_24110054_24110051.docx
@@ -16020,10 +16020,478 @@
         <w:t>Trong Tuần 1, bộ kết quả Athena dùng trong báo cáo gồm 156 bản ghi gốc, năm truy vấn thành công và chín biểu đồ từ CSV. Chúng em đã xây dựng kiến trúc, cấu hình các dịch vụ nền tảng và phân tích số liệu của ba đô thị. Phân công của chúng em được trình bày tại Bảng 2.1; các kết quả được đánh giá trong phạm vi bộ dữ liệu đã lưu.</w:t>
       </w:r>
     </w:p>
+    <w:p>
+      <w:pPr>
+        <w:keepNext w:val="0"/>
+        <w:widowControl/>
+        <w:spacing w:before="0" w:after="0" w:line="252" w:lineRule="auto"/>
+        <w:ind w:left="0" w:right="0" w:firstLine="0"/>
+        <w:jc w:val="left"/>
+        <w:sectPr>
+          <w:pgSz w:w="12240" w:h="15840"/>
+          <w:pgMar w:top="1224" w:right="1080" w:bottom="1080" w:left="1224" w:header="432" w:footer="576" w:gutter="0"/>
+          <w:pgNumType w:start="1"/>
+          <w:cols w:space="720"/>
+          <w:docGrid w:linePitch="360"/>
+        </w:sectPr>
+      </w:pPr>
+    </w:p>
+    <w:p>
+      <w:pPr>
+        <w:keepNext/>
+        <w:widowControl/>
+        <w:spacing w:before="0" w:after="100" w:line="252" w:lineRule="auto"/>
+        <w:ind w:left="0" w:right="0" w:firstLine="0"/>
+        <w:jc w:val="left"/>
+      </w:pPr>
+      <w:r>
+        <w:rPr>
+          <w:rFonts w:ascii="Times New Roman" w:hAnsi="Times New Roman"/>
+          <w:b/>
+          <w:color w:val="000000"/>
+          <w:sz w:val="24"/>
+        </w:rPr>
+        <w:t>PHỤ LỤC A</w:t>
+      </w:r>
+    </w:p>
+    <w:p>
+      <w:pPr>
+        <w:keepNext/>
+        <w:widowControl/>
+        <w:spacing w:before="0" w:after="160" w:line="252" w:lineRule="auto"/>
+        <w:ind w:left="0" w:right="0" w:firstLine="0"/>
+        <w:jc w:val="left"/>
+      </w:pPr>
+      <w:r>
+        <w:rPr>
+          <w:rFonts w:ascii="Times New Roman" w:hAnsi="Times New Roman"/>
+          <w:b/>
+          <w:color w:val="000000"/>
+          <w:sz w:val="24"/>
+        </w:rPr>
+        <w:t>LIÊN KẾT MINH CHỨNG TRỰC TIẾP TRÊN GITHUB</w:t>
+      </w:r>
+    </w:p>
+    <w:p>
+      <w:pPr>
+        <w:keepNext/>
+        <w:widowControl/>
+        <w:spacing w:before="0" w:after="140" w:line="252" w:lineRule="auto"/>
+        <w:ind w:left="0" w:right="0" w:firstLine="0"/>
+        <w:jc w:val="left"/>
+      </w:pPr>
+      <w:r>
+        <w:rPr>
+          <w:rFonts w:ascii="Times New Roman" w:hAnsi="Times New Roman"/>
+          <w:b w:val="0"/>
+          <w:color w:val="000000"/>
+          <w:sz w:val="22"/>
+        </w:rPr>
+        <w:t>Danh mục bổ sung ngày 19/10/2026 để đối chiếu hồ sơ Tuần 1. Các địa chỉ được hiển thị đầy đủ và có liên kết mở trực tiếp.</w:t>
+      </w:r>
+    </w:p>
+    <w:p>
+      <w:pPr>
+        <w:keepNext/>
+        <w:widowControl/>
+        <w:spacing w:before="0" w:after="20" w:line="252" w:lineRule="auto"/>
+        <w:ind w:left="0" w:right="0" w:firstLine="0"/>
+        <w:jc w:val="left"/>
+      </w:pPr>
+      <w:r>
+        <w:rPr>
+          <w:rFonts w:ascii="Times New Roman" w:hAnsi="Times New Roman"/>
+          <w:b/>
+          <w:color w:val="000000"/>
+          <w:sz w:val="21"/>
+        </w:rPr>
+        <w:t>1. Báo cáo đầy đủ và hồ sơ Tuần 1</w:t>
+      </w:r>
+    </w:p>
+    <w:p>
+      <w:pPr>
+        <w:keepNext w:val="0"/>
+        <w:widowControl/>
+        <w:spacing w:before="0" w:after="100" w:line="252" w:lineRule="auto"/>
+        <w:ind w:left="0" w:right="0" w:firstLine="0"/>
+        <w:jc w:val="left"/>
+      </w:pPr>
+      <w:hyperlink r:id="rIdEvidenceWeek1_1">
+        <w:r>
+          <w:rPr>
+            <w:rFonts w:ascii="Times New Roman" w:hAnsi="Times New Roman" w:eastAsia="Times New Roman"/>
+            <w:color w:val="0563C1"/>
+            <w:sz w:val="19"/>
+            <w:u w:val="single"/>
+          </w:rPr>
+          <w:t>https://github.com/JasonTM17/WeatherAWS_FinalTerm/blob/main/tuan_1/docs/FINAL_REPORT.md</w:t>
+        </w:r>
+      </w:hyperlink>
+    </w:p>
+    <w:p>
+      <w:pPr>
+        <w:keepNext/>
+        <w:widowControl/>
+        <w:spacing w:before="0" w:after="20" w:line="252" w:lineRule="auto"/>
+        <w:ind w:left="0" w:right="0" w:firstLine="0"/>
+        <w:jc w:val="left"/>
+      </w:pPr>
+      <w:r>
+        <w:rPr>
+          <w:rFonts w:ascii="Times New Roman" w:hAnsi="Times New Roman"/>
+          <w:b/>
+          <w:color w:val="000000"/>
+          <w:sz w:val="21"/>
+        </w:rPr>
+        <w:t>2. CSV raw Tuần 1: 156 bản ghi, 23 trường</w:t>
+      </w:r>
+    </w:p>
+    <w:p>
+      <w:pPr>
+        <w:keepNext w:val="0"/>
+        <w:widowControl/>
+        <w:spacing w:before="0" w:after="100" w:line="252" w:lineRule="auto"/>
+        <w:ind w:left="0" w:right="0" w:firstLine="0"/>
+        <w:jc w:val="left"/>
+      </w:pPr>
+      <w:hyperlink r:id="rIdEvidenceWeek1_2">
+        <w:r>
+          <w:rPr>
+            <w:rFonts w:ascii="Times New Roman" w:hAnsi="Times New Roman" w:eastAsia="Times New Roman"/>
+            <w:color w:val="0563C1"/>
+            <w:sz w:val="19"/>
+            <w:u w:val="single"/>
+          </w:rPr>
+          <w:t>https://github.com/JasonTM17/WeatherAWS_FinalTerm/blob/main/tuan_1/docs/Bao_cao_tuan_1_CSV_24110054_24110051/raw_weather_aqi_records.csv</w:t>
+        </w:r>
+      </w:hyperlink>
+    </w:p>
+    <w:p>
+      <w:pPr>
+        <w:keepNext/>
+        <w:widowControl/>
+        <w:spacing w:before="0" w:after="20" w:line="252" w:lineRule="auto"/>
+        <w:ind w:left="0" w:right="0" w:firstLine="0"/>
+        <w:jc w:val="left"/>
+      </w:pPr>
+      <w:r>
+        <w:rPr>
+          <w:rFonts w:ascii="Times New Roman" w:hAnsi="Times New Roman"/>
+          <w:b/>
+          <w:color w:val="000000"/>
+          <w:sz w:val="21"/>
+        </w:rPr>
+        <w:t>3. Sáu CSV truy vấn và bảng đo Athena</w:t>
+      </w:r>
+    </w:p>
+    <w:p>
+      <w:pPr>
+        <w:keepNext w:val="0"/>
+        <w:widowControl/>
+        <w:spacing w:before="0" w:after="100" w:line="252" w:lineRule="auto"/>
+        <w:ind w:left="0" w:right="0" w:firstLine="0"/>
+        <w:jc w:val="left"/>
+      </w:pPr>
+      <w:hyperlink r:id="rIdEvidenceWeek1_3">
+        <w:r>
+          <w:rPr>
+            <w:rFonts w:ascii="Times New Roman" w:hAnsi="Times New Roman" w:eastAsia="Times New Roman"/>
+            <w:color w:val="0563C1"/>
+            <w:sz w:val="19"/>
+            <w:u w:val="single"/>
+          </w:rPr>
+          <w:t>https://github.com/JasonTM17/WeatherAWS_FinalTerm/tree/main/tuan_1/docs/Bao_cao_tuan_1_CSV_24110054_24110051</w:t>
+        </w:r>
+      </w:hyperlink>
+    </w:p>
+    <w:p>
+      <w:pPr>
+        <w:keepNext/>
+        <w:widowControl/>
+        <w:spacing w:before="0" w:after="20" w:line="252" w:lineRule="auto"/>
+        <w:ind w:left="0" w:right="0" w:firstLine="0"/>
+        <w:jc w:val="left"/>
+      </w:pPr>
+      <w:r>
+        <w:rPr>
+          <w:rFonts w:ascii="Times New Roman" w:hAnsi="Times New Roman"/>
+          <w:b/>
+          <w:color w:val="000000"/>
+          <w:sz w:val="21"/>
+        </w:rPr>
+        <w:t>4. Chín biểu đồ Tuần 1 và bảng nguồn</w:t>
+      </w:r>
+    </w:p>
+    <w:p>
+      <w:pPr>
+        <w:keepNext w:val="0"/>
+        <w:widowControl/>
+        <w:spacing w:before="0" w:after="100" w:line="252" w:lineRule="auto"/>
+        <w:ind w:left="0" w:right="0" w:firstLine="0"/>
+        <w:jc w:val="left"/>
+      </w:pPr>
+      <w:hyperlink r:id="rIdEvidenceWeek1_4">
+        <w:r>
+          <w:rPr>
+            <w:rFonts w:ascii="Times New Roman" w:hAnsi="Times New Roman" w:eastAsia="Times New Roman"/>
+            <w:color w:val="0563C1"/>
+            <w:sz w:val="19"/>
+            <w:u w:val="single"/>
+          </w:rPr>
+          <w:t>https://github.com/JasonTM17/WeatherAWS_FinalTerm/tree/main/tuan_2/results/charts</w:t>
+        </w:r>
+      </w:hyperlink>
+    </w:p>
+    <w:p>
+      <w:pPr>
+        <w:keepNext/>
+        <w:widowControl/>
+        <w:spacing w:before="0" w:after="20" w:line="252" w:lineRule="auto"/>
+        <w:ind w:left="0" w:right="0" w:firstLine="0"/>
+        <w:jc w:val="left"/>
+      </w:pPr>
+      <w:r>
+        <w:rPr>
+          <w:rFonts w:ascii="Times New Roman" w:hAnsi="Times New Roman"/>
+          <w:b/>
+          <w:color w:val="000000"/>
+          <w:sz w:val="21"/>
+        </w:rPr>
+        <w:t>5. Nhật ký và phân công Tuần 1: 18,5 giờ</w:t>
+      </w:r>
+    </w:p>
+    <w:p>
+      <w:pPr>
+        <w:keepNext w:val="0"/>
+        <w:widowControl/>
+        <w:spacing w:before="0" w:after="100" w:line="252" w:lineRule="auto"/>
+        <w:ind w:left="0" w:right="0" w:firstLine="0"/>
+        <w:jc w:val="left"/>
+      </w:pPr>
+      <w:hyperlink r:id="rIdEvidenceWeek1_5">
+        <w:r>
+          <w:rPr>
+            <w:rFonts w:ascii="Times New Roman" w:hAnsi="Times New Roman" w:eastAsia="Times New Roman"/>
+            <w:color w:val="0563C1"/>
+            <w:sz w:val="19"/>
+            <w:u w:val="single"/>
+          </w:rPr>
+          <w:t>https://github.com/JasonTM17/WeatherAWS_FinalTerm/blob/main/tuan_1/docs/WORKLOG.md</w:t>
+        </w:r>
+      </w:hyperlink>
+    </w:p>
+    <w:p>
+      <w:pPr>
+        <w:keepNext/>
+        <w:widowControl/>
+        <w:spacing w:before="0" w:after="20" w:line="252" w:lineRule="auto"/>
+        <w:ind w:left="0" w:right="0" w:firstLine="0"/>
+        <w:jc w:val="left"/>
+      </w:pPr>
+      <w:r>
+        <w:rPr>
+          <w:rFonts w:ascii="Times New Roman" w:hAnsi="Times New Roman"/>
+          <w:b/>
+          <w:color w:val="000000"/>
+          <w:sz w:val="21"/>
+        </w:rPr>
+        <w:t>6. Mã nguồn nền tảng S3 và cấu hình</w:t>
+      </w:r>
+    </w:p>
+    <w:p>
+      <w:pPr>
+        <w:keepNext w:val="0"/>
+        <w:widowControl/>
+        <w:spacing w:before="0" w:after="100" w:line="252" w:lineRule="auto"/>
+        <w:ind w:left="0" w:right="0" w:firstLine="0"/>
+        <w:jc w:val="left"/>
+      </w:pPr>
+      <w:hyperlink r:id="rIdEvidenceWeek1_6">
+        <w:r>
+          <w:rPr>
+            <w:rFonts w:ascii="Times New Roman" w:hAnsi="Times New Roman" w:eastAsia="Times New Roman"/>
+            <w:color w:val="0563C1"/>
+            <w:sz w:val="19"/>
+            <w:u w:val="single"/>
+          </w:rPr>
+          <w:t>https://github.com/JasonTM17/WeatherAWS_FinalTerm/tree/main/tuan_1/scripts</w:t>
+        </w:r>
+      </w:hyperlink>
+    </w:p>
+    <w:p>
+      <w:pPr>
+        <w:keepNext/>
+        <w:widowControl/>
+        <w:spacing w:before="0" w:after="20" w:line="252" w:lineRule="auto"/>
+        <w:ind w:left="0" w:right="0" w:firstLine="0"/>
+        <w:jc w:val="left"/>
+      </w:pPr>
+      <w:r>
+        <w:rPr>
+          <w:rFonts w:ascii="Times New Roman" w:hAnsi="Times New Roman"/>
+          <w:b/>
+          <w:color w:val="000000"/>
+          <w:sz w:val="21"/>
+        </w:rPr>
+        <w:t>7. Commit nền tảng Tuần 1 — 425b24a</w:t>
+      </w:r>
+    </w:p>
+    <w:p>
+      <w:pPr>
+        <w:keepNext w:val="0"/>
+        <w:widowControl/>
+        <w:spacing w:before="0" w:after="100" w:line="252" w:lineRule="auto"/>
+        <w:ind w:left="0" w:right="0" w:firstLine="0"/>
+        <w:jc w:val="left"/>
+      </w:pPr>
+      <w:hyperlink r:id="rIdEvidenceWeek1_7">
+        <w:r>
+          <w:rPr>
+            <w:rFonts w:ascii="Times New Roman" w:hAnsi="Times New Roman" w:eastAsia="Times New Roman"/>
+            <w:color w:val="0563C1"/>
+            <w:sz w:val="19"/>
+            <w:u w:val="single"/>
+          </w:rPr>
+          <w:t>https://github.com/JasonTM17/WeatherAWS_FinalTerm/commit/425b24a747965783c019b8fe2fd62a47611fb03a</w:t>
+        </w:r>
+      </w:hyperlink>
+    </w:p>
+    <w:p>
+      <w:pPr>
+        <w:keepNext/>
+        <w:widowControl/>
+        <w:spacing w:before="0" w:after="20" w:line="252" w:lineRule="auto"/>
+        <w:ind w:left="0" w:right="0" w:firstLine="0"/>
+        <w:jc w:val="left"/>
+      </w:pPr>
+      <w:r>
+        <w:rPr>
+          <w:rFonts w:ascii="Times New Roman" w:hAnsi="Times New Roman"/>
+          <w:b/>
+          <w:color w:val="000000"/>
+          <w:sz w:val="21"/>
+        </w:rPr>
+        <w:t>8. Commit bổ sung biểu đồ trong hồ sơ hai tuần — 351f5be</w:t>
+      </w:r>
+    </w:p>
+    <w:p>
+      <w:pPr>
+        <w:keepNext w:val="0"/>
+        <w:widowControl/>
+        <w:spacing w:before="0" w:after="100" w:line="252" w:lineRule="auto"/>
+        <w:ind w:left="0" w:right="0" w:firstLine="0"/>
+        <w:jc w:val="left"/>
+      </w:pPr>
+      <w:hyperlink r:id="rIdEvidenceWeek1_8">
+        <w:r>
+          <w:rPr>
+            <w:rFonts w:ascii="Times New Roman" w:hAnsi="Times New Roman" w:eastAsia="Times New Roman"/>
+            <w:color w:val="0563C1"/>
+            <w:sz w:val="19"/>
+            <w:u w:val="single"/>
+          </w:rPr>
+          <w:t>https://github.com/JasonTM17/WeatherAWS_FinalTerm/commit/351f5be44737843a123e7f8586ba849f3a4f9cc0</w:t>
+        </w:r>
+      </w:hyperlink>
+    </w:p>
+    <w:p>
+      <w:pPr>
+        <w:keepNext/>
+        <w:widowControl/>
+        <w:spacing w:before="0" w:after="20" w:line="252" w:lineRule="auto"/>
+        <w:ind w:left="0" w:right="0" w:firstLine="0"/>
+        <w:jc w:val="left"/>
+      </w:pPr>
+      <w:r>
+        <w:rPr>
+          <w:rFonts w:ascii="Times New Roman" w:hAnsi="Times New Roman"/>
+          <w:b/>
+          <w:color w:val="000000"/>
+          <w:sz w:val="21"/>
+        </w:rPr>
+        <w:t>9. Commit đối chiếu giờ công và minh chứng — 0d0df38</w:t>
+      </w:r>
+    </w:p>
+    <w:p>
+      <w:pPr>
+        <w:keepNext w:val="0"/>
+        <w:widowControl/>
+        <w:spacing w:before="0" w:after="100" w:line="252" w:lineRule="auto"/>
+        <w:ind w:left="0" w:right="0" w:firstLine="0"/>
+        <w:jc w:val="left"/>
+      </w:pPr>
+      <w:hyperlink r:id="rIdEvidenceWeek1_9">
+        <w:r>
+          <w:rPr>
+            <w:rFonts w:ascii="Times New Roman" w:hAnsi="Times New Roman" w:eastAsia="Times New Roman"/>
+            <w:color w:val="0563C1"/>
+            <w:sz w:val="19"/>
+            <w:u w:val="single"/>
+          </w:rPr>
+          <w:t>https://github.com/JasonTM17/WeatherAWS_FinalTerm/commit/0d0df38148d0b702cbfc1635c39c7338ca0871d3</w:t>
+        </w:r>
+      </w:hyperlink>
+    </w:p>
+    <w:p>
+      <w:pPr>
+        <w:keepNext/>
+        <w:widowControl/>
+        <w:spacing w:before="0" w:after="20" w:line="252" w:lineRule="auto"/>
+        <w:ind w:left="0" w:right="0" w:firstLine="0"/>
+        <w:jc w:val="left"/>
+      </w:pPr>
+      <w:r>
+        <w:rPr>
+          <w:rFonts w:ascii="Times New Roman" w:hAnsi="Times New Roman"/>
+          <w:b/>
+          <w:color w:val="000000"/>
+          <w:sz w:val="21"/>
+        </w:rPr>
+        <w:t>10. Danh mục minh chứng đầy đủ Tuần 1–3</w:t>
+      </w:r>
+    </w:p>
+    <w:p>
+      <w:pPr>
+        <w:keepNext w:val="0"/>
+        <w:widowControl/>
+        <w:spacing w:before="0" w:after="100" w:line="252" w:lineRule="auto"/>
+        <w:ind w:left="0" w:right="0" w:firstLine="0"/>
+        <w:jc w:val="left"/>
+      </w:pPr>
+      <w:hyperlink r:id="rIdEvidenceWeek1_10">
+        <w:r>
+          <w:rPr>
+            <w:rFonts w:ascii="Times New Roman" w:hAnsi="Times New Roman" w:eastAsia="Times New Roman"/>
+            <w:color w:val="0563C1"/>
+            <w:sz w:val="19"/>
+            <w:u w:val="single"/>
+          </w:rPr>
+          <w:t>https://github.com/JasonTM17/WeatherAWS_FinalTerm/blob/main/docs/EVIDENCE_INDEX.md</w:t>
+        </w:r>
+      </w:hyperlink>
+    </w:p>
+    <w:p>
+      <w:pPr>
+        <w:keepNext w:val="0"/>
+        <w:widowControl/>
+        <w:spacing w:before="0" w:after="0" w:line="252" w:lineRule="auto"/>
+        <w:ind w:left="0" w:right="0" w:firstLine="0"/>
+        <w:jc w:val="left"/>
+      </w:pPr>
+      <w:r>
+        <w:rPr>
+          <w:rFonts w:ascii="Times New Roman" w:hAnsi="Times New Roman"/>
+          <w:b w:val="0"/>
+          <w:color w:val="000000"/>
+          <w:sz w:val="20"/>
+        </w:rPr>
+        <w:t>Liên kết nhánh main mở nội dung hiện tại; liên kết commit ghi mốc thay đổi cụ thể. Số liệu và số giờ trong báo cáo được giữ theo tuần tương ứng.</w:t>
+      </w:r>
+    </w:p>
     <w:sectPr>
       <w:pgSz w:w="12240" w:h="15840"/>
-      <w:pgMar w:top="1224" w:right="1080" w:bottom="1080" w:left="1224" w:header="432" w:footer="576" w:gutter="0"/>
-      <w:pgNumType w:start="1"/>
+      <w:pgMar w:top="1080" w:right="1080" w:bottom="1080" w:left="1080" w:header="432" w:footer="576" w:gutter="0"/>
+      <w:pgNumType/>
       <w:cols w:space="720"/>
       <w:docGrid w:linePitch="360"/>
     </w:sectPr>

</xml_diff>